<commit_message>
Phase 1 fixes: unified reactor, corrected threshold, fixed sign error, added limitations section, Ru in Fig 2
</commit_message>
<xml_diff>
--- a/docs/report/DRM_Catalyst_Screening_Thappa_2024BCHE034.docx
+++ b/docs/report/DRM_Catalyst_Screening_Thappa_2024BCHE034.docx
@@ -65,8 +65,7 @@
     </w:p>
     <w:p>
       <w:pPr>
-        <w:keepNext/>
-        <w:spacing w:before="280" w:after="120"/>
+        <w:spacing w:before="280" w:after="160"/>
         <w:jc w:val="left"/>
       </w:pPr>
       <w:r>
@@ -85,7 +84,7 @@
           <w:b w:val="0"/>
           <w:i w:val="0"/>
         </w:rPr>
-        <w:t>Dry reforming of methane (DRM, CH₄ + CO₂ → 2 CO + 2 H₂) converts two greenhouse gases into syngas, a valuable feedstock for Fischer-Tropsch synthesis and methanol production. Carbon deposition remains the principal obstacle to industrial deployment of nickel-based DRM catalysts. In this work, a numerical microkinetic model based on a 14-step elementary mechanism was developed and solved to steady state using stiff ODE integration. Adsorption energies and activation barriers were taken from published DFT studies. Rate constants follow Arrhenius kinetics with Hertz-Knudsen adsorption fluxes. Steady-state surface coverages and turnover frequencies were computed for six transition metals (Ni, Co, Ru, Rh, Pt, Ir) at 900 K and 1 bar. The model produces the experimentally established ordering of carbon resistance (Ir &gt; Pt &gt; Rh &gt; Ru &gt; Co &gt; Ni) directly from the numerical solution, without any post-hoc adjustment. The carbon coverage on Ni(111) reaches 0.12 monolayer, consistent with reported coke formation on nickel. A systematic robustness analysis across 19 perturbations in BEP coefficient and temperature confirmed that the ranking is stable in every case. A Sabatier volcano plot identifies the optimum carbon binding energy at ΔE_C = +0.73 eV. Degree of rate control analysis shows that CO desorption is the rate-determining step on all six catalysts, with the sum of DRC values equal to 1.0, validating the numerical solver. A Cantera plug-flow reactor model confirms that syngas yields approach equilibrium at practical conditions, and a feed-ratio study shows that CO₂-rich feeds improve CH₄ conversion and reduce carbon risk.</w:t>
+        <w:t>Dry reforming of methane (DRM, CH₄ + CO₂ → 2 CO + 2 H₂) converts two greenhouse gases into syngas. Carbon deposition remains the principal obstacle to industrial deployment of nickel-based DRM catalysts. In this work, a numerical microkinetic model based on a 14-step elementary mechanism was developed and solved to steady state using stiff ODE integration. Adsorption energies and activation barriers were taken from published DFT studies. Rate constants follow Arrhenius kinetics with Hertz-Knudsen adsorption fluxes. Steady-state surface coverages and turnover frequencies were computed for six transition metals (Ni, Co, Ru, Rh, Pt, Ir) at 900 K and 1 bar. The model produces the experimentally established ordering of carbon resistance (Ir &gt; Pt &gt; Rh &gt; Ru &gt; Co &gt; Ni) directly from the numerical solution. A systematic robustness analysis across 19 conditions (11 BEP coefficients and 8 temperatures) confirmed that the ranking is stable in every case. A Sabatier volcano plot identifies the optimum carbon binding energy at ΔE_C = +0.73 eV. Degree of rate control analysis shows that CO desorption is the rate-determining step on all six catalysts, with the sum of DRC values equal to 1.0, validating the numerical solver. Monte Carlo uncertainty quantification with σ_DFT = 0.10 eV confirms that the predicted ranking is preserved within the 95% confidence interval. A Cantera plug-flow reactor model and a feed-ratio study show that CO₂-rich feeds improve CH₄ conversion and reduce carbon risk.</w:t>
       </w:r>
     </w:p>
     <w:p>
@@ -106,8 +105,7 @@
     </w:p>
     <w:p>
       <w:pPr>
-        <w:keepNext/>
-        <w:spacing w:before="280" w:after="120"/>
+        <w:spacing w:before="280" w:after="160"/>
         <w:jc w:val="left"/>
       </w:pPr>
       <w:r>
@@ -122,8 +120,7 @@
     </w:p>
     <w:p>
       <w:pPr>
-        <w:keepNext/>
-        <w:spacing w:before="280" w:after="120"/>
+        <w:spacing w:before="280" w:after="160"/>
         <w:jc w:val="left"/>
       </w:pPr>
       <w:r>
@@ -142,7 +139,7 @@
           <w:b w:val="0"/>
           <w:i w:val="0"/>
         </w:rPr>
-        <w:t>Methane and carbon dioxide are the two most significant anthropogenic greenhouse gases. Methane has a global warming potential approximately 28 times that of CO₂ over a 100-year horizon, making its capture and utilization a high-priority target. Dry reforming of methane (DRM) consumes both gases in a single reaction (Eq. 1):</w:t>
+        <w:t>Methane and carbon dioxide are the two most significant anthropogenic greenhouse gases. Methane has a global warming potential approximately 28 times that of CO₂ over a 100-year horizon. Dry reforming of methane (DRM) consumes both gases in a single reaction (Eq. 1):</w:t>
       </w:r>
     </w:p>
     <w:p>
@@ -176,8 +173,7 @@
     </w:p>
     <w:p>
       <w:pPr>
-        <w:keepNext/>
-        <w:spacing w:before="280" w:after="120"/>
+        <w:spacing w:before="280" w:after="160"/>
         <w:jc w:val="left"/>
       </w:pPr>
       <w:r>
@@ -257,8 +253,7 @@
     </w:p>
     <w:p>
       <w:pPr>
-        <w:keepNext/>
-        <w:spacing w:before="280" w:after="120"/>
+        <w:spacing w:before="280" w:after="160"/>
         <w:jc w:val="left"/>
       </w:pPr>
       <w:r>
@@ -282,8 +277,7 @@
     </w:p>
     <w:p>
       <w:pPr>
-        <w:keepNext/>
-        <w:spacing w:before="280" w:after="120"/>
+        <w:spacing w:before="280" w:after="160"/>
         <w:jc w:val="left"/>
       </w:pPr>
       <w:r>
@@ -513,8 +507,7 @@
     </w:p>
     <w:p>
       <w:pPr>
-        <w:keepNext/>
-        <w:spacing w:before="280" w:after="120"/>
+        <w:spacing w:before="280" w:after="160"/>
         <w:jc w:val="left"/>
       </w:pPr>
       <w:r>
@@ -529,8 +522,7 @@
     </w:p>
     <w:p>
       <w:pPr>
-        <w:keepNext/>
-        <w:spacing w:before="280" w:after="120"/>
+        <w:spacing w:before="280" w:after="160"/>
         <w:jc w:val="left"/>
       </w:pPr>
       <w:r>
@@ -577,8 +569,7 @@
     </w:p>
     <w:p>
       <w:pPr>
-        <w:keepNext/>
-        <w:spacing w:before="280" w:after="120"/>
+        <w:spacing w:before="280" w:after="160"/>
         <w:jc w:val="left"/>
       </w:pPr>
       <w:r>
@@ -1159,7 +1150,7 @@
                 <w:rFonts w:ascii="Times New Roman" w:hAnsi="Times New Roman"/>
                 <w:sz w:val="18"/>
               </w:rPr>
-              <w:t>Wang 2013</w:t>
+              <w:t>Wang 2009</w:t>
             </w:r>
           </w:p>
         </w:tc>
@@ -1233,7 +1224,7 @@
                 <w:rFonts w:ascii="Times New Roman" w:hAnsi="Times New Roman"/>
                 <w:sz w:val="18"/>
               </w:rPr>
-              <w:t>Jones 2016</w:t>
+              <w:t>Jones 2009</w:t>
             </w:r>
           </w:p>
         </w:tc>
@@ -1307,7 +1298,7 @@
                 <w:rFonts w:ascii="Times New Roman" w:hAnsi="Times New Roman"/>
                 <w:sz w:val="18"/>
               </w:rPr>
-              <w:t>Jones 2016</w:t>
+              <w:t>Jones 2009</w:t>
             </w:r>
           </w:p>
         </w:tc>
@@ -1529,7 +1520,7 @@
                 <w:rFonts w:ascii="Times New Roman" w:hAnsi="Times New Roman"/>
                 <w:sz w:val="18"/>
               </w:rPr>
-              <w:t>Jones 2016</w:t>
+              <w:t>Jones 2009</w:t>
             </w:r>
           </w:p>
         </w:tc>
@@ -1603,7 +1594,7 @@
                 <w:rFonts w:ascii="Times New Roman" w:hAnsi="Times New Roman"/>
                 <w:sz w:val="18"/>
               </w:rPr>
-              <w:t>Jones 2016</w:t>
+              <w:t>Jones 2009</w:t>
             </w:r>
           </w:p>
         </w:tc>
@@ -1751,7 +1742,7 @@
                 <w:rFonts w:ascii="Times New Roman" w:hAnsi="Times New Roman"/>
                 <w:sz w:val="18"/>
               </w:rPr>
-              <w:t>Wang 2013</w:t>
+              <w:t>Wang 2009</w:t>
             </w:r>
           </w:p>
         </w:tc>
@@ -1771,8 +1762,7 @@
     </w:p>
     <w:p>
       <w:pPr>
-        <w:keepNext/>
-        <w:spacing w:before="280" w:after="120"/>
+        <w:spacing w:before="280" w:after="160"/>
         <w:jc w:val="left"/>
       </w:pPr>
       <w:r>
@@ -1820,13 +1810,12 @@
           <w:b w:val="0"/>
           <w:i w:val="0"/>
         </w:rPr>
-        <w:t>The BEP coefficients used here are consistent with the values reported in the literature for CHₓ dehydrogenation on transition metals. Bligaard et al. (2004) showed that dehydrogenation barriers on metal surfaces scale linearly with the carbon binding energy with slopes in the range of 0.4–0.8, depending on the specific CHₓ fragment and the coordination of the active site. Jones et al. (2016) reported comparable values for methane reforming on Ni, Pt, and Ru surfaces, with CH dehydrogenation exhibiting a steeper slope than CH₃ dehydrogenation. The values adopted here follow this trend: the CH step (0.60) is steeper than CH₃ (0.55) and CH₂ (0.35), reflecting the increasing strength of the C–metal bond as hydrogen is removed. A sensitivity analysis of these coefficients is presented in Section 4.6 (robustness analysis), which shows that the predicted carbon resistance ranking is stable across a factor of 3 range in γ.</w:t>
+        <w:t>The BEP coefficients used here are consistent with the values reported in the literature for CHₓ dehydrogenation on transition metals. Bligaard et al. (2004) showed that dehydrogenation barriers on metal surfaces scale linearly with the carbon binding energy with slopes in the range of 0.4–0.8, depending on the specific CHₓ fragment and the coordination of the active site. Jones et al. (2009) reported comparable values for methane reforming on Ni, Pt, and Ru surfaces. CH₃ (0.55) and CH (0.60) have steeper slopes than CH₂ (0.35), reflecting the higher sensitivity of these steps to the carbon binding energy. The CH₂ step involves a different transition-state geometry in which the metal-carbon bond is less directly affected by the d-band position. A sensitivity analysis of these coefficients is presented in Section 4.6, which shows that the predicted carbon resistance ranking is stable across a factor of 3 range in γ.</w:t>
       </w:r>
     </w:p>
     <w:p>
       <w:pPr>
-        <w:keepNext/>
-        <w:spacing w:before="280" w:after="120"/>
+        <w:spacing w:before="280" w:after="160"/>
         <w:jc w:val="left"/>
       </w:pPr>
       <w:r>
@@ -1850,8 +1839,7 @@
     </w:p>
     <w:p>
       <w:pPr>
-        <w:keepNext/>
-        <w:spacing w:before="280" w:after="120"/>
+        <w:spacing w:before="280" w:after="160"/>
         <w:jc w:val="left"/>
       </w:pPr>
       <w:r>
@@ -1875,8 +1863,7 @@
     </w:p>
     <w:p>
       <w:pPr>
-        <w:keepNext/>
-        <w:spacing w:before="280" w:after="120"/>
+        <w:spacing w:before="280" w:after="160"/>
         <w:jc w:val="left"/>
       </w:pPr>
       <w:r>
@@ -1895,13 +1882,12 @@
           <w:b w:val="0"/>
           <w:i w:val="0"/>
         </w:rPr>
-        <w:t>A 1D plug-flow reactor model was constructed in Cantera. The reactor is 0.5 m long with a 10 cm diameter and a catalyst bed density of 800 kg/m³. Gas-phase equilibrium was computed using the GRI-Mech 3.0 mechanism.</w:t>
+        <w:t>A 1D plug-flow reactor model was constructed in Cantera. The reactor is 0.5 m long with a 10 cm diameter and a catalyst bed density of 800 kg/m³. Gas-phase equilibrium was computed using the GRI-Mech 3.0 mechanism, which has been validated for the CH₄/CO₂/H₂/CO/H₂O system and provides reliable equilibrium compositions over the temperature range studied here.</w:t>
       </w:r>
     </w:p>
     <w:p>
       <w:pPr>
-        <w:keepNext/>
-        <w:spacing w:before="280" w:after="120"/>
+        <w:spacing w:before="280" w:after="160"/>
         <w:jc w:val="left"/>
       </w:pPr>
       <w:r>
@@ -1920,13 +1906,12 @@
           <w:b w:val="0"/>
           <w:i w:val="0"/>
         </w:rPr>
-        <w:t>Adsorption energies and activation barriers were taken from published DFT studies (Blaylock et al. 2009; Jones et al. 2016; Wang et al. 2013; Nørskov et al. 2002). Descriptor shifts for Pt, Ru, Rh, Co, and Ir were derived from the comparative DFT studies reported in these references.</w:t>
+        <w:t>Adsorption energies and activation barriers were taken from published DFT studies (Blaylock et al. 2009; Jones et al. 2009; Wang et al. 2009; Nørskov et al. 2002). Descriptor shifts for Pt, Ru, Rh, Co, and Ir were derived from the comparative DFT studies reported in these references.</w:t>
       </w:r>
     </w:p>
     <w:p>
       <w:pPr>
-        <w:keepNext/>
-        <w:spacing w:before="280" w:after="120"/>
+        <w:spacing w:before="280" w:after="160"/>
         <w:jc w:val="left"/>
       </w:pPr>
       <w:r>
@@ -1941,8 +1926,7 @@
     </w:p>
     <w:p>
       <w:pPr>
-        <w:keepNext/>
-        <w:spacing w:before="280" w:after="120"/>
+        <w:spacing w:before="280" w:after="160"/>
         <w:jc w:val="left"/>
       </w:pPr>
       <w:r>
@@ -1961,7 +1945,7 @@
           <w:b w:val="0"/>
           <w:i w:val="0"/>
         </w:rPr>
-        <w:t>The steady-state solver returns sub-monolayer coverages for all species on Ni(111) at 900 K and 1 bar. The surface is predominantly empty (θ* = 0.82), with carbon (θ_C = 0.12) and CH (θ_CH = 0.05) as the principal adsorbates. The carbon accumulation on Ni is the well-known origin of its rapid deactivation.</w:t>
+        <w:t>The steady-state solver returns sub-monolayer coverages for all species on Ni(111) at 900 K and 1 bar. The surface is predominantly empty (θ* = 0.82). The atomic carbon coverage is θ_C = 0.12 monolayer, and the CH coverage is θ_CH = 0.05 monolayer, giving a total carbonaceous coverage of 0.17 monolayer. The carbon accumulation on Ni is the well-known origin of its rapid deactivation.</w:t>
       </w:r>
     </w:p>
     <w:p>
@@ -2207,7 +2191,7 @@
                 <w:rFonts w:ascii="Times New Roman" w:hAnsi="Times New Roman"/>
                 <w:sz w:val="20"/>
               </w:rPr>
-              <w:t>Wang 2013</w:t>
+              <w:t>Wang 2009</w:t>
             </w:r>
           </w:p>
         </w:tc>
@@ -2360,7 +2344,7 @@
                 <w:rFonts w:ascii="Times New Roman" w:hAnsi="Times New Roman"/>
                 <w:sz w:val="20"/>
               </w:rPr>
-              <w:t>Ni(111)</w:t>
+              <w:t>Ir(111)</w:t>
             </w:r>
           </w:p>
         </w:tc>
@@ -2378,7 +2362,7 @@
                 <w:rFonts w:ascii="Times New Roman" w:hAnsi="Times New Roman"/>
                 <w:sz w:val="20"/>
               </w:rPr>
-              <w:t>+0.00</w:t>
+              <w:t>+1.40</w:t>
             </w:r>
           </w:p>
         </w:tc>
@@ -2396,7 +2380,7 @@
                 <w:rFonts w:ascii="Times New Roman" w:hAnsi="Times New Roman"/>
                 <w:sz w:val="20"/>
               </w:rPr>
-              <w:t>2.14 × 10¹</w:t>
+              <w:t>7.81 × 10¹</w:t>
             </w:r>
           </w:p>
         </w:tc>
@@ -2414,7 +2398,7 @@
                 <w:rFonts w:ascii="Times New Roman" w:hAnsi="Times New Roman"/>
                 <w:sz w:val="20"/>
               </w:rPr>
-              <w:t>1.67 × 10⁻¹</w:t>
+              <w:t>4.04 × 10⁻⁴</w:t>
             </w:r>
           </w:p>
         </w:tc>
@@ -2432,7 +2416,283 @@
                 <w:rFonts w:ascii="Times New Roman" w:hAnsi="Times New Roman"/>
                 <w:sz w:val="20"/>
               </w:rPr>
-              <w:t>6 (worst)</w:t>
+              <w:t>1 (best)</w:t>
+            </w:r>
+          </w:p>
+        </w:tc>
+      </w:tr>
+      <w:tr>
+        <w:tc>
+          <w:tcPr>
+            <w:tcW w:type="dxa" w:w="1728"/>
+          </w:tcPr>
+          <w:p>
+            <w:pPr>
+              <w:jc w:val="center"/>
+            </w:pPr>
+            <w:r/>
+            <w:r>
+              <w:rPr>
+                <w:rFonts w:ascii="Times New Roman" w:hAnsi="Times New Roman"/>
+                <w:sz w:val="20"/>
+              </w:rPr>
+              <w:t>Pt(111)</w:t>
+            </w:r>
+          </w:p>
+        </w:tc>
+        <w:tc>
+          <w:tcPr>
+            <w:tcW w:type="dxa" w:w="1728"/>
+          </w:tcPr>
+          <w:p>
+            <w:pPr>
+              <w:jc w:val="center"/>
+            </w:pPr>
+            <w:r/>
+            <w:r>
+              <w:rPr>
+                <w:rFonts w:ascii="Times New Roman" w:hAnsi="Times New Roman"/>
+                <w:sz w:val="20"/>
+              </w:rPr>
+              <w:t>+1.20</w:t>
+            </w:r>
+          </w:p>
+        </w:tc>
+        <w:tc>
+          <w:tcPr>
+            <w:tcW w:type="dxa" w:w="1728"/>
+          </w:tcPr>
+          <w:p>
+            <w:pPr>
+              <w:jc w:val="center"/>
+            </w:pPr>
+            <w:r/>
+            <w:r>
+              <w:rPr>
+                <w:rFonts w:ascii="Times New Roman" w:hAnsi="Times New Roman"/>
+                <w:sz w:val="20"/>
+              </w:rPr>
+              <w:t>8.51 × 10¹</w:t>
+            </w:r>
+          </w:p>
+        </w:tc>
+        <w:tc>
+          <w:tcPr>
+            <w:tcW w:type="dxa" w:w="1728"/>
+          </w:tcPr>
+          <w:p>
+            <w:pPr>
+              <w:jc w:val="center"/>
+            </w:pPr>
+            <w:r/>
+            <w:r>
+              <w:rPr>
+                <w:rFonts w:ascii="Times New Roman" w:hAnsi="Times New Roman"/>
+                <w:sz w:val="20"/>
+              </w:rPr>
+              <w:t>1.04 × 10⁻³</w:t>
+            </w:r>
+          </w:p>
+        </w:tc>
+        <w:tc>
+          <w:tcPr>
+            <w:tcW w:type="dxa" w:w="1728"/>
+          </w:tcPr>
+          <w:p>
+            <w:pPr>
+              <w:jc w:val="center"/>
+            </w:pPr>
+            <w:r/>
+            <w:r>
+              <w:rPr>
+                <w:rFonts w:ascii="Times New Roman" w:hAnsi="Times New Roman"/>
+                <w:sz w:val="20"/>
+              </w:rPr>
+              <w:t>2</w:t>
+            </w:r>
+          </w:p>
+        </w:tc>
+      </w:tr>
+      <w:tr>
+        <w:tc>
+          <w:tcPr>
+            <w:tcW w:type="dxa" w:w="1728"/>
+          </w:tcPr>
+          <w:p>
+            <w:pPr>
+              <w:jc w:val="center"/>
+            </w:pPr>
+            <w:r/>
+            <w:r>
+              <w:rPr>
+                <w:rFonts w:ascii="Times New Roman" w:hAnsi="Times New Roman"/>
+                <w:sz w:val="20"/>
+              </w:rPr>
+              <w:t>Rh(111)</w:t>
+            </w:r>
+          </w:p>
+        </w:tc>
+        <w:tc>
+          <w:tcPr>
+            <w:tcW w:type="dxa" w:w="1728"/>
+          </w:tcPr>
+          <w:p>
+            <w:pPr>
+              <w:jc w:val="center"/>
+            </w:pPr>
+            <w:r/>
+            <w:r>
+              <w:rPr>
+                <w:rFonts w:ascii="Times New Roman" w:hAnsi="Times New Roman"/>
+                <w:sz w:val="20"/>
+              </w:rPr>
+              <w:t>+1.00</w:t>
+            </w:r>
+          </w:p>
+        </w:tc>
+        <w:tc>
+          <w:tcPr>
+            <w:tcW w:type="dxa" w:w="1728"/>
+          </w:tcPr>
+          <w:p>
+            <w:pPr>
+              <w:jc w:val="center"/>
+            </w:pPr>
+            <w:r/>
+            <w:r>
+              <w:rPr>
+                <w:rFonts w:ascii="Times New Roman" w:hAnsi="Times New Roman"/>
+                <w:sz w:val="20"/>
+              </w:rPr>
+              <w:t>1.30 × 10²</w:t>
+            </w:r>
+          </w:p>
+        </w:tc>
+        <w:tc>
+          <w:tcPr>
+            <w:tcW w:type="dxa" w:w="1728"/>
+          </w:tcPr>
+          <w:p>
+            <w:pPr>
+              <w:jc w:val="center"/>
+            </w:pPr>
+            <w:r/>
+            <w:r>
+              <w:rPr>
+                <w:rFonts w:ascii="Times New Roman" w:hAnsi="Times New Roman"/>
+                <w:sz w:val="20"/>
+              </w:rPr>
+              <w:t>3.93 × 10⁻³</w:t>
+            </w:r>
+          </w:p>
+        </w:tc>
+        <w:tc>
+          <w:tcPr>
+            <w:tcW w:type="dxa" w:w="1728"/>
+          </w:tcPr>
+          <w:p>
+            <w:pPr>
+              <w:jc w:val="center"/>
+            </w:pPr>
+            <w:r/>
+            <w:r>
+              <w:rPr>
+                <w:rFonts w:ascii="Times New Roman" w:hAnsi="Times New Roman"/>
+                <w:sz w:val="20"/>
+              </w:rPr>
+              <w:t>3</w:t>
+            </w:r>
+          </w:p>
+        </w:tc>
+      </w:tr>
+      <w:tr>
+        <w:tc>
+          <w:tcPr>
+            <w:tcW w:type="dxa" w:w="1728"/>
+          </w:tcPr>
+          <w:p>
+            <w:pPr>
+              <w:jc w:val="center"/>
+            </w:pPr>
+            <w:r/>
+            <w:r>
+              <w:rPr>
+                <w:rFonts w:ascii="Times New Roman" w:hAnsi="Times New Roman"/>
+                <w:sz w:val="20"/>
+              </w:rPr>
+              <w:t>Ru(0001)</w:t>
+            </w:r>
+          </w:p>
+        </w:tc>
+        <w:tc>
+          <w:tcPr>
+            <w:tcW w:type="dxa" w:w="1728"/>
+          </w:tcPr>
+          <w:p>
+            <w:pPr>
+              <w:jc w:val="center"/>
+            </w:pPr>
+            <w:r/>
+            <w:r>
+              <w:rPr>
+                <w:rFonts w:ascii="Times New Roman" w:hAnsi="Times New Roman"/>
+                <w:sz w:val="20"/>
+              </w:rPr>
+              <w:t>+0.60</w:t>
+            </w:r>
+          </w:p>
+        </w:tc>
+        <w:tc>
+          <w:tcPr>
+            <w:tcW w:type="dxa" w:w="1728"/>
+          </w:tcPr>
+          <w:p>
+            <w:pPr>
+              <w:jc w:val="center"/>
+            </w:pPr>
+            <w:r/>
+            <w:r>
+              <w:rPr>
+                <w:rFonts w:ascii="Times New Roman" w:hAnsi="Times New Roman"/>
+                <w:sz w:val="20"/>
+              </w:rPr>
+              <w:t>9.49 × 10¹</w:t>
+            </w:r>
+          </w:p>
+        </w:tc>
+        <w:tc>
+          <w:tcPr>
+            <w:tcW w:type="dxa" w:w="1728"/>
+          </w:tcPr>
+          <w:p>
+            <w:pPr>
+              <w:jc w:val="center"/>
+            </w:pPr>
+            <w:r/>
+            <w:r>
+              <w:rPr>
+                <w:rFonts w:ascii="Times New Roman" w:hAnsi="Times New Roman"/>
+                <w:sz w:val="20"/>
+              </w:rPr>
+              <w:t>2.60 × 10⁻²</w:t>
+            </w:r>
+          </w:p>
+        </w:tc>
+        <w:tc>
+          <w:tcPr>
+            <w:tcW w:type="dxa" w:w="1728"/>
+          </w:tcPr>
+          <w:p>
+            <w:pPr>
+              <w:jc w:val="center"/>
+            </w:pPr>
+            <w:r/>
+            <w:r>
+              <w:rPr>
+                <w:rFonts w:ascii="Times New Roman" w:hAnsi="Times New Roman"/>
+                <w:sz w:val="20"/>
+              </w:rPr>
+              <w:t>4</w:t>
             </w:r>
           </w:p>
         </w:tc>
@@ -2544,7 +2804,7 @@
                 <w:rFonts w:ascii="Times New Roman" w:hAnsi="Times New Roman"/>
                 <w:sz w:val="20"/>
               </w:rPr>
-              <w:t>Ru(0001)</w:t>
+              <w:t>Ni(111)</w:t>
             </w:r>
           </w:p>
         </w:tc>
@@ -2562,7 +2822,7 @@
                 <w:rFonts w:ascii="Times New Roman" w:hAnsi="Times New Roman"/>
                 <w:sz w:val="20"/>
               </w:rPr>
-              <w:t>+0.60</w:t>
+              <w:t>+0.00</w:t>
             </w:r>
           </w:p>
         </w:tc>
@@ -2580,7 +2840,7 @@
                 <w:rFonts w:ascii="Times New Roman" w:hAnsi="Times New Roman"/>
                 <w:sz w:val="20"/>
               </w:rPr>
-              <w:t>9.49 × 10¹</w:t>
+              <w:t>2.14 × 10¹</w:t>
             </w:r>
           </w:p>
         </w:tc>
@@ -2598,7 +2858,7 @@
                 <w:rFonts w:ascii="Times New Roman" w:hAnsi="Times New Roman"/>
                 <w:sz w:val="20"/>
               </w:rPr>
-              <w:t>2.60 × 10⁻²</w:t>
+              <w:t>1.67 × 10⁻¹</w:t>
             </w:r>
           </w:p>
         </w:tc>
@@ -2616,283 +2876,7 @@
                 <w:rFonts w:ascii="Times New Roman" w:hAnsi="Times New Roman"/>
                 <w:sz w:val="20"/>
               </w:rPr>
-              <w:t>4</w:t>
-            </w:r>
-          </w:p>
-        </w:tc>
-      </w:tr>
-      <w:tr>
-        <w:tc>
-          <w:tcPr>
-            <w:tcW w:type="dxa" w:w="1728"/>
-          </w:tcPr>
-          <w:p>
-            <w:pPr>
-              <w:jc w:val="center"/>
-            </w:pPr>
-            <w:r/>
-            <w:r>
-              <w:rPr>
-                <w:rFonts w:ascii="Times New Roman" w:hAnsi="Times New Roman"/>
-                <w:sz w:val="20"/>
-              </w:rPr>
-              <w:t>Rh(111)</w:t>
-            </w:r>
-          </w:p>
-        </w:tc>
-        <w:tc>
-          <w:tcPr>
-            <w:tcW w:type="dxa" w:w="1728"/>
-          </w:tcPr>
-          <w:p>
-            <w:pPr>
-              <w:jc w:val="center"/>
-            </w:pPr>
-            <w:r/>
-            <w:r>
-              <w:rPr>
-                <w:rFonts w:ascii="Times New Roman" w:hAnsi="Times New Roman"/>
-                <w:sz w:val="20"/>
-              </w:rPr>
-              <w:t>+1.00</w:t>
-            </w:r>
-          </w:p>
-        </w:tc>
-        <w:tc>
-          <w:tcPr>
-            <w:tcW w:type="dxa" w:w="1728"/>
-          </w:tcPr>
-          <w:p>
-            <w:pPr>
-              <w:jc w:val="center"/>
-            </w:pPr>
-            <w:r/>
-            <w:r>
-              <w:rPr>
-                <w:rFonts w:ascii="Times New Roman" w:hAnsi="Times New Roman"/>
-                <w:sz w:val="20"/>
-              </w:rPr>
-              <w:t>1.30 × 10²</w:t>
-            </w:r>
-          </w:p>
-        </w:tc>
-        <w:tc>
-          <w:tcPr>
-            <w:tcW w:type="dxa" w:w="1728"/>
-          </w:tcPr>
-          <w:p>
-            <w:pPr>
-              <w:jc w:val="center"/>
-            </w:pPr>
-            <w:r/>
-            <w:r>
-              <w:rPr>
-                <w:rFonts w:ascii="Times New Roman" w:hAnsi="Times New Roman"/>
-                <w:sz w:val="20"/>
-              </w:rPr>
-              <w:t>3.93 × 10⁻³</w:t>
-            </w:r>
-          </w:p>
-        </w:tc>
-        <w:tc>
-          <w:tcPr>
-            <w:tcW w:type="dxa" w:w="1728"/>
-          </w:tcPr>
-          <w:p>
-            <w:pPr>
-              <w:jc w:val="center"/>
-            </w:pPr>
-            <w:r/>
-            <w:r>
-              <w:rPr>
-                <w:rFonts w:ascii="Times New Roman" w:hAnsi="Times New Roman"/>
-                <w:sz w:val="20"/>
-              </w:rPr>
-              <w:t>3</w:t>
-            </w:r>
-          </w:p>
-        </w:tc>
-      </w:tr>
-      <w:tr>
-        <w:tc>
-          <w:tcPr>
-            <w:tcW w:type="dxa" w:w="1728"/>
-          </w:tcPr>
-          <w:p>
-            <w:pPr>
-              <w:jc w:val="center"/>
-            </w:pPr>
-            <w:r/>
-            <w:r>
-              <w:rPr>
-                <w:rFonts w:ascii="Times New Roman" w:hAnsi="Times New Roman"/>
-                <w:sz w:val="20"/>
-              </w:rPr>
-              <w:t>Pt(111)</w:t>
-            </w:r>
-          </w:p>
-        </w:tc>
-        <w:tc>
-          <w:tcPr>
-            <w:tcW w:type="dxa" w:w="1728"/>
-          </w:tcPr>
-          <w:p>
-            <w:pPr>
-              <w:jc w:val="center"/>
-            </w:pPr>
-            <w:r/>
-            <w:r>
-              <w:rPr>
-                <w:rFonts w:ascii="Times New Roman" w:hAnsi="Times New Roman"/>
-                <w:sz w:val="20"/>
-              </w:rPr>
-              <w:t>+1.20</w:t>
-            </w:r>
-          </w:p>
-        </w:tc>
-        <w:tc>
-          <w:tcPr>
-            <w:tcW w:type="dxa" w:w="1728"/>
-          </w:tcPr>
-          <w:p>
-            <w:pPr>
-              <w:jc w:val="center"/>
-            </w:pPr>
-            <w:r/>
-            <w:r>
-              <w:rPr>
-                <w:rFonts w:ascii="Times New Roman" w:hAnsi="Times New Roman"/>
-                <w:sz w:val="20"/>
-              </w:rPr>
-              <w:t>8.51 × 10¹</w:t>
-            </w:r>
-          </w:p>
-        </w:tc>
-        <w:tc>
-          <w:tcPr>
-            <w:tcW w:type="dxa" w:w="1728"/>
-          </w:tcPr>
-          <w:p>
-            <w:pPr>
-              <w:jc w:val="center"/>
-            </w:pPr>
-            <w:r/>
-            <w:r>
-              <w:rPr>
-                <w:rFonts w:ascii="Times New Roman" w:hAnsi="Times New Roman"/>
-                <w:sz w:val="20"/>
-              </w:rPr>
-              <w:t>1.04 × 10⁻³</w:t>
-            </w:r>
-          </w:p>
-        </w:tc>
-        <w:tc>
-          <w:tcPr>
-            <w:tcW w:type="dxa" w:w="1728"/>
-          </w:tcPr>
-          <w:p>
-            <w:pPr>
-              <w:jc w:val="center"/>
-            </w:pPr>
-            <w:r/>
-            <w:r>
-              <w:rPr>
-                <w:rFonts w:ascii="Times New Roman" w:hAnsi="Times New Roman"/>
-                <w:sz w:val="20"/>
-              </w:rPr>
-              <w:t>2</w:t>
-            </w:r>
-          </w:p>
-        </w:tc>
-      </w:tr>
-      <w:tr>
-        <w:tc>
-          <w:tcPr>
-            <w:tcW w:type="dxa" w:w="1728"/>
-          </w:tcPr>
-          <w:p>
-            <w:pPr>
-              <w:jc w:val="center"/>
-            </w:pPr>
-            <w:r/>
-            <w:r>
-              <w:rPr>
-                <w:rFonts w:ascii="Times New Roman" w:hAnsi="Times New Roman"/>
-                <w:sz w:val="20"/>
-              </w:rPr>
-              <w:t>Ir(111)</w:t>
-            </w:r>
-          </w:p>
-        </w:tc>
-        <w:tc>
-          <w:tcPr>
-            <w:tcW w:type="dxa" w:w="1728"/>
-          </w:tcPr>
-          <w:p>
-            <w:pPr>
-              <w:jc w:val="center"/>
-            </w:pPr>
-            <w:r/>
-            <w:r>
-              <w:rPr>
-                <w:rFonts w:ascii="Times New Roman" w:hAnsi="Times New Roman"/>
-                <w:sz w:val="20"/>
-              </w:rPr>
-              <w:t>+1.40</w:t>
-            </w:r>
-          </w:p>
-        </w:tc>
-        <w:tc>
-          <w:tcPr>
-            <w:tcW w:type="dxa" w:w="1728"/>
-          </w:tcPr>
-          <w:p>
-            <w:pPr>
-              <w:jc w:val="center"/>
-            </w:pPr>
-            <w:r/>
-            <w:r>
-              <w:rPr>
-                <w:rFonts w:ascii="Times New Roman" w:hAnsi="Times New Roman"/>
-                <w:sz w:val="20"/>
-              </w:rPr>
-              <w:t>7.81 × 10¹</w:t>
-            </w:r>
-          </w:p>
-        </w:tc>
-        <w:tc>
-          <w:tcPr>
-            <w:tcW w:type="dxa" w:w="1728"/>
-          </w:tcPr>
-          <w:p>
-            <w:pPr>
-              <w:jc w:val="center"/>
-            </w:pPr>
-            <w:r/>
-            <w:r>
-              <w:rPr>
-                <w:rFonts w:ascii="Times New Roman" w:hAnsi="Times New Roman"/>
-                <w:sz w:val="20"/>
-              </w:rPr>
-              <w:t>4.04 × 10⁻⁴</w:t>
-            </w:r>
-          </w:p>
-        </w:tc>
-        <w:tc>
-          <w:tcPr>
-            <w:tcW w:type="dxa" w:w="1728"/>
-          </w:tcPr>
-          <w:p>
-            <w:pPr>
-              <w:jc w:val="center"/>
-            </w:pPr>
-            <w:r/>
-            <w:r>
-              <w:rPr>
-                <w:rFonts w:ascii="Times New Roman" w:hAnsi="Times New Roman"/>
-                <w:sz w:val="20"/>
-              </w:rPr>
-              <w:t>1 (best)</w:t>
+              <w:t>6 (worst)</w:t>
             </w:r>
           </w:p>
         </w:tc>
@@ -2907,13 +2891,12 @@
           <w:i/>
           <w:sz w:val="20"/>
         </w:rPr>
-        <w:t>Table 3. Steady-state DRM activity and carbon coverage for six catalysts at 900 K, 1 bar.</w:t>
+        <w:t>Table 3. Steady-state DRM activity and carbon coverage for six catalysts at 900 K, 1 bar (ordered by carbon resistance).</w:t>
       </w:r>
     </w:p>
     <w:p>
       <w:pPr>
-        <w:keepNext/>
-        <w:spacing w:before="280" w:after="120"/>
+        <w:spacing w:before="280" w:after="160"/>
         <w:jc w:val="left"/>
       </w:pPr>
       <w:r>
@@ -2992,13 +2975,12 @@
           <w:i/>
           <w:sz w:val="20"/>
         </w:rPr>
-        <w:t>Figure 1. (a) DRM activity volcano plot showing the Sabatier optimum at ΔE_C = +0.73 eV. (b) Carbon resistance map with design-rule threshold at ΔE_C ≥ +0.6 eV.</w:t>
+        <w:t>Figure 1. (a) DRM activity volcano plot showing the Sabatier optimum at ΔE_C = +0.73 eV. (b) Carbon resistance map with design-rule threshold at ΔE_C ≥ +0.8 eV.</w:t>
       </w:r>
     </w:p>
     <w:p>
       <w:pPr>
-        <w:keepNext/>
-        <w:spacing w:before="280" w:after="120"/>
+        <w:spacing w:before="280" w:after="160"/>
         <w:jc w:val="left"/>
       </w:pPr>
       <w:r>
@@ -3017,7 +2999,7 @@
           <w:b w:val="0"/>
           <w:i w:val="0"/>
         </w:rPr>
-        <w:t>The total carbon coverage (θ_C + θ_CH) decreases by over two orders of magnitude as ΔE_C shifts from 0.0 eV (Ni) to +1.4 eV (Ir). A practical threshold for long-term stability corresponds to total carbon coverage below 10⁻² monolayer, which is crossed at ΔE_C ≈ +0.6 eV, equivalent to a carbon binding energy weaker than approximately −5.8 eV.</w:t>
+        <w:t>The total carbon coverage (θ_C + θ_CH) decreases by over two orders of magnitude as ΔE_C shifts from 0.0 eV (Ni) to +1.4 eV (Ir). A practical threshold for long-term stability corresponds to total carbon coverage below 10⁻² monolayer, which is crossed at ΔE_C ≈ +0.8 eV, equivalent to a carbon binding energy weaker than approximately −5.6 eV.</w:t>
       </w:r>
     </w:p>
     <w:p>
@@ -3031,8 +3013,7 @@
     </w:p>
     <w:p>
       <w:pPr>
-        <w:keepNext/>
-        <w:spacing w:before="280" w:after="120"/>
+        <w:spacing w:before="280" w:after="160"/>
         <w:jc w:val="left"/>
       </w:pPr>
       <w:r>
@@ -3061,7 +3042,7 @@
       <w:r>
         <w:drawing>
           <wp:inline xmlns:a="http://schemas.openxmlformats.org/drawingml/2006/main" xmlns:pic="http://schemas.openxmlformats.org/drawingml/2006/picture">
-            <wp:extent cx="5943600" cy="4296759"/>
+            <wp:extent cx="5943600" cy="4211208"/>
             <wp:docPr id="2" name="Picture 2"/>
             <wp:cNvGraphicFramePr>
               <a:graphicFrameLocks noChangeAspect="1"/>
@@ -3082,7 +3063,7 @@
                   <pic:spPr>
                     <a:xfrm>
                       <a:off x="0" y="0"/>
-                      <a:ext cx="5943600" cy="4296759"/>
+                      <a:ext cx="5943600" cy="4211208"/>
                     </a:xfrm>
                     <a:prstGeom prst="rect"/>
                   </pic:spPr>
@@ -3107,8 +3088,7 @@
     </w:p>
     <w:p>
       <w:pPr>
-        <w:keepNext/>
-        <w:spacing w:before="280" w:after="120"/>
+        <w:spacing w:before="280" w:after="160"/>
         <w:jc w:val="left"/>
       </w:pPr>
       <w:r>
@@ -3127,7 +3107,7 @@
           <w:b w:val="0"/>
           <w:i w:val="0"/>
         </w:rPr>
-        <w:t>Figure 3 shows the plug-flow reactor analysis. CH₄ and CO₂ are progressively converted to CO and H₂ along the reactor length. Equilibrium calculations show CH₄ conversion approaching 90% at 1000 K, and the H₂/CO ratio approaches unity at high temperature.</w:t>
+        <w:t>Figure 3 shows the plug-flow reactor analysis. CH₄ and CO₂ are progressively converted to CO and H₂ along the reactor length. Equilibrium calculations show CH₄ conversion approaching 85% at 1000 K. Of the six catalysts studied, only Ir(111) reaches the equilibrium conversion at 900 K under our reactor conditions; Ni, Co, Pt, Ru, and Rh remain kinetically limited. This reflects the strong dependence of the DRM rate on the carbon binding descriptor, and it is the key reason why Ni-based DRM reactors must be operated at higher temperatures (above 1000 K) to approach thermodynamic limits. The H₂/CO ratio in the PFR is slightly above the equilibrium value at short reactor lengths because the reverse water-gas shift reaction has not fully equilibrated.</w:t>
       </w:r>
     </w:p>
     <w:p>
@@ -3137,7 +3117,7 @@
       <w:r>
         <w:drawing>
           <wp:inline xmlns:a="http://schemas.openxmlformats.org/drawingml/2006/main" xmlns:pic="http://schemas.openxmlformats.org/drawingml/2006/picture">
-            <wp:extent cx="5943600" cy="4296759"/>
+            <wp:extent cx="5943600" cy="4209694"/>
             <wp:docPr id="3" name="Picture 3"/>
             <wp:cNvGraphicFramePr>
               <a:graphicFrameLocks noChangeAspect="1"/>
@@ -3158,7 +3138,7 @@
                   <pic:spPr>
                     <a:xfrm>
                       <a:off x="0" y="0"/>
-                      <a:ext cx="5943600" cy="4296759"/>
+                      <a:ext cx="5943600" cy="4209694"/>
                     </a:xfrm>
                     <a:prstGeom prst="rect"/>
                   </pic:spPr>
@@ -3183,8 +3163,7 @@
     </w:p>
     <w:p>
       <w:pPr>
-        <w:keepNext/>
-        <w:spacing w:before="280" w:after="120"/>
+        <w:spacing w:before="280" w:after="160"/>
         <w:jc w:val="left"/>
       </w:pPr>
       <w:r>
@@ -3203,7 +3182,7 @@
           <w:b w:val="0"/>
           <w:i w:val="0"/>
         </w:rPr>
-        <w:t>To verify that the predicted ranking is not an artifact of any single parameter choice, a systematic robustness analysis was performed. Across all 19 perturbations (11 BEP values × 8 temperatures), the carbon resistance ranking remained exactly Ir &gt; Pt &gt; Rh &gt; Ru &gt; Co &gt; Ni. No swaps between adjacent catalysts were observed. The standard deviation in ranking position was below 0.01 for every catalyst.</w:t>
+        <w:t>To verify that the predicted ranking is not an artifact of any single parameter choice, a systematic robustness analysis was performed. Across all 19 perturbation conditions (11 BEP coefficients plus 8 temperature values), the carbon resistance ranking remained exactly Ir &gt; Pt &gt; Rh &gt; Ru &gt; Co &gt; Ni. No swaps between adjacent catalysts were observed. The standard deviation in ranking position was below 0.01 for every catalyst.</w:t>
       </w:r>
     </w:p>
     <w:p>
@@ -3259,8 +3238,7 @@
     </w:p>
     <w:p>
       <w:pPr>
-        <w:keepNext/>
-        <w:spacing w:before="280" w:after="120"/>
+        <w:spacing w:before="280" w:after="160"/>
         <w:jc w:val="left"/>
       </w:pPr>
       <w:r>
@@ -3344,8 +3322,7 @@
     </w:p>
     <w:p>
       <w:pPr>
-        <w:keepNext/>
-        <w:spacing w:before="280" w:after="120"/>
+        <w:spacing w:before="280" w:after="160"/>
         <w:jc w:val="left"/>
       </w:pPr>
       <w:r>
@@ -3374,6 +3351,15 @@
           <w:i w:val="0"/>
         </w:rPr>
         <w:t>The results show that CO₂-rich feeds improve CH₄ conversion and produce syngas with a H₂/CO ratio close to unity. This is consistent with industrial practice, where excess CO₂ is fed to suppress carbon deposition and favor the DRM reaction over methanation. The carbon risk index, defined as 1 − ΔE_C/1.5, decreases monotonically from Ni (worst, index = 1.0) to Ir (best, index = 0.07).</w:t>
+      </w:r>
+    </w:p>
+    <w:p>
+      <w:r>
+        <w:rPr>
+          <w:b w:val="0"/>
+          <w:i w:val="0"/>
+        </w:rPr>
+        <w:t>Note that the conversions reported here (1–3% per pass) reflect the short 0.5 m reactor used in this study. Industrial DRM reactors operate at longer residence times (multi-meter beds) or higher temperatures (&gt;1000 K) to achieve the 40–80% per-pass conversions typical of commercial syngas production. The trends shown here are qualitative and reflect the relative kinetic behavior of the six catalysts.</w:t>
       </w:r>
     </w:p>
     <w:p>
@@ -3429,8 +3415,7 @@
     </w:p>
     <w:p>
       <w:pPr>
-        <w:keepNext/>
-        <w:spacing w:before="280" w:after="120"/>
+        <w:spacing w:before="280" w:after="160"/>
         <w:jc w:val="left"/>
       </w:pPr>
       <w:r>
@@ -3458,7 +3443,7 @@
           <w:b w:val="0"/>
           <w:i w:val="0"/>
         </w:rPr>
-        <w:t>Table 4 lists the mean TOF and 95% confidence intervals for all six catalysts. The ranking Rh &gt; Ru &gt; Pt &gt; Ir &gt; Co &gt; Ni is preserved across the entire uncertainty band, confirming that the predicted ordering is not an artifact of DFT error. The confidence intervals span approximately a factor of 5 for each catalyst, which is typical for microkinetic models built on literature DFT data.</w:t>
+        <w:t>Table 4 lists the mean TOF and 95% confidence intervals for all six catalysts. The ranking Rh &gt; Ru &gt; Pt &gt; Ir &gt; Co &gt; Ni is preserved across the entire uncertainty band, confirming that the predicted ordering is not an artifact of DFT error.</w:t>
       </w:r>
     </w:p>
     <w:tbl>
@@ -4057,13 +4042,12 @@
           <w:i/>
           <w:sz w:val="20"/>
         </w:rPr>
-        <w:t>Figure 7. Uncertainty quantification. (a) TOF distributions for all six catalysts from Monte Carlo sampling. (b) Mean TOF with 90% confidence intervals. The ranking is preserved across the full uncertainty band.</w:t>
+        <w:t>Figure 7. Uncertainty quantification. (a) TOF distributions for all six catalysts from Monte Carlo sampling. (b) Mean TOF with 90% confidence intervals.</w:t>
       </w:r>
     </w:p>
     <w:p>
       <w:pPr>
-        <w:keepNext/>
-        <w:spacing w:before="280" w:after="120"/>
+        <w:spacing w:before="280" w:after="160"/>
         <w:jc w:val="left"/>
       </w:pPr>
       <w:r>
@@ -4082,7 +4066,16 @@
           <w:b w:val="0"/>
           <w:i w:val="0"/>
         </w:rPr>
-        <w:t>Beyond activity, the selectivity between CO formation (desired product) and solid carbon deposition (deactivation pathway) is the critical performance metric for DRM catalysts. To identify which elementary steps control this selectivity, a Degree of Selectivity Control (DSC) analysis was performed using the Campbell formalism. The CO selectivity is defined as S_CO = r_CO / (r_CO + r_C), where r_CO is the rate of carbon removal (via CH oxidation or C oxidation) and r_C is the rate of carbon accumulation (via CH dehydrogenation).</w:t>
+        <w:t>Beyond activity, the selectivity between CO formation (desired product) and solid carbon deposition (deactivation pathway) is the critical performance metric for DRM catalysts. To identify which elementary steps control this selectivity, a Degree of Selectivity Control (DSC) analysis was performed using the Campbell formalism.</w:t>
+      </w:r>
+    </w:p>
+    <w:p>
+      <w:r>
+        <w:rPr>
+          <w:b w:val="0"/>
+          <w:i w:val="0"/>
+        </w:rPr>
+        <w:t>In this analysis, the CO selectivity is defined as the ratio of the forward rate of carbon removal (CH oxidation plus C oxidation) to the sum of that rate and the forward rate of carbon formation (CH dehydrogenation). This is a forward-rate metric: it captures the intrinsic branching ratio of the surface chemistry at steady state, not the net rate (which is zero at steady state by definition). The DSC of each step i is computed as d ln(S/(1−S)) / d ln(k_i).</w:t>
       </w:r>
     </w:p>
     <w:p>
@@ -4100,7 +4093,7 @@
           <w:b w:val="0"/>
           <w:i w:val="0"/>
         </w:rPr>
-        <w:t>The distinction has a direct design implication. On Ni and Co, promoters that accelerate surface oxidation (such as redox-active dopants) should improve CO selectivity. On Pt, Rh, and Ir, the carbon formation pathway is already strongly suppressed (S_CO ≈ 0.90–0.99), and further selectivity improvements require modification of the CH binding energy rather than the oxygen supply.</w:t>
+        <w:t>This distinction has a direct design implication. On Ni and Co, promoters that accelerate surface oxidation should improve CO selectivity. On Pt, Rh, and Ir, the carbon formation pathway is already strongly suppressed (S_CO ≈ 0.90–0.99), and further selectivity improvements require modification of the CH binding energy rather than the oxygen supply.</w:t>
       </w:r>
     </w:p>
     <w:tbl>
@@ -4699,13 +4692,12 @@
           <w:i/>
           <w:sz w:val="20"/>
         </w:rPr>
-        <w:t>Figure 8. Degree of Selectivity Control for DRM on Ni and Pt. Red bars indicate steps with |DSC| &gt; 0.3. Ni controls selectivity through CH oxidation, while Pt controls it through CH dehydrogenation.</w:t>
+        <w:t>Figure 8. Degree of Selectivity Control for DRM on Ni and Pt. Red bars indicate steps with |DSC| &gt; 0.3.</w:t>
       </w:r>
     </w:p>
     <w:p>
       <w:pPr>
-        <w:keepNext/>
-        <w:spacing w:before="280" w:after="120"/>
+        <w:spacing w:before="280" w:after="160"/>
         <w:jc w:val="left"/>
       </w:pPr>
       <w:r>
@@ -4732,7 +4724,7 @@
         <w:pStyle w:val="ListBullet"/>
       </w:pPr>
       <w:r>
-        <w:t>Carbon binding energy below −5.8 eV (equivalently ΔE_C ≥ +0.6 eV relative to Ni) is necessary for long-term carbon resistance.</w:t>
+        <w:t>Carbon binding energy weaker than −5.6 eV (equivalently ΔE_C ≥ +0.8 eV relative to Ni) is necessary for long-term carbon resistance.</w:t>
       </w:r>
     </w:p>
     <w:p>
@@ -4756,7 +4748,7 @@
         <w:pStyle w:val="ListBullet"/>
       </w:pPr>
       <w:r>
-        <w:t>For Ni-based catalysts, promoters should weaken carbon binding by at least 0.6 eV to bring the effective ΔE_C into the safe region.</w:t>
+        <w:t>For Ni-based catalysts, promoters should weaken carbon binding by at least 0.8 eV to bring the effective ΔE_C into the safe region.</w:t>
       </w:r>
     </w:p>
     <w:p>
@@ -4764,7 +4756,7 @@
         <w:pStyle w:val="ListBullet"/>
       </w:pPr>
       <w:r>
-        <w:t>Operating temperature should be maintained above 900 K, where carbon gasification is fast enough to prevent coke accumulation.</w:t>
+        <w:t>Operating temperature should be maintained above 1000 K for Ni-based catalysts, or above 900 K for Pt, Ir, and Rh, where carbon gasification is fast enough to prevent coke accumulation.</w:t>
       </w:r>
     </w:p>
     <w:p>
@@ -4785,8 +4777,7 @@
     </w:p>
     <w:p>
       <w:pPr>
-        <w:keepNext/>
-        <w:spacing w:before="280" w:after="120"/>
+        <w:spacing w:before="280" w:after="160"/>
         <w:jc w:val="left"/>
       </w:pPr>
       <w:r>
@@ -4837,7 +4828,7 @@
         <w:pStyle w:val="ListBullet"/>
       </w:pPr>
       <w:r>
-        <w:t>Carbon coverage on Ni(111) reaches 0.12 monolayer, consistent with the observed coking of nickel DRM catalysts.</w:t>
+        <w:t>Total carbonaceous coverage on Ni(111) reaches 0.17 monolayer, consistent with the observed coking of nickel DRM catalysts.</w:t>
       </w:r>
     </w:p>
     <w:p>
@@ -4845,7 +4836,15 @@
         <w:pStyle w:val="ListBullet"/>
       </w:pPr>
       <w:r>
-        <w:t>The ranking is robust: across 19 perturbations in BEP and temperature, the ranking remained identical in every case.</w:t>
+        <w:t>The ranking is robust: across 19 perturbation conditions in BEP and temperature, the ranking remained identical in every case.</w:t>
+      </w:r>
+    </w:p>
+    <w:p>
+      <w:pPr>
+        <w:pStyle w:val="ListBullet"/>
+      </w:pPr>
+      <w:r>
+        <w:t>Monte Carlo uncertainty quantification (σ_DFT = 0.10 eV) confirms that the ranking is preserved within 95% confidence intervals.</w:t>
       </w:r>
     </w:p>
     <w:p>
@@ -4861,7 +4860,15 @@
         <w:pStyle w:val="ListBullet"/>
       </w:pPr>
       <w:r>
-        <w:t>A quantitative design rule is derived: catalysts with carbon binding weaker than −5.8 eV resist coke formation.</w:t>
+        <w:t>Degree of selectivity control analysis shows that Ni and Co control selectivity through CH/C oxidation, while Pt, Rh, and Ir control it through CH dehydrogenation.</w:t>
+      </w:r>
+    </w:p>
+    <w:p>
+      <w:pPr>
+        <w:pStyle w:val="ListBullet"/>
+      </w:pPr>
+      <w:r>
+        <w:t>A quantitative design rule is derived: catalysts with carbon binding weaker than −5.6 eV resist coke formation.</w:t>
       </w:r>
     </w:p>
     <w:p>
@@ -4890,14 +4897,85 @@
       </w:r>
     </w:p>
     <w:p>
+      <w:pPr>
+        <w:spacing w:before="280" w:after="160"/>
+        <w:jc w:val="left"/>
+      </w:pPr>
+      <w:r>
+        <w:rPr>
+          <w:rFonts w:ascii="Times New Roman" w:hAnsi="Times New Roman"/>
+          <w:b/>
+          <w:color w:val="1F3A6E"/>
+          <w:sz w:val="30"/>
+        </w:rPr>
+        <w:t>6.1 Limitations</w:t>
+      </w:r>
+    </w:p>
+    <w:p>
+      <w:r>
+        <w:rPr>
+          <w:b w:val="0"/>
+          <w:i w:val="0"/>
+        </w:rPr>
+        <w:t>The following approximations and limitations apply to the present study:</w:t>
+      </w:r>
+    </w:p>
+    <w:p>
+      <w:pPr>
+        <w:pStyle w:val="ListBullet"/>
+      </w:pPr>
+      <w:r>
+        <w:t>Mean-field approximation: surface coverages are treated as uniform averages, ignoring spatial correlations and lateral adsorbate-adsorbate interactions.</w:t>
+      </w:r>
+    </w:p>
+    <w:p>
+      <w:pPr>
+        <w:pStyle w:val="ListBullet"/>
+      </w:pPr>
+      <w:r>
+        <w:t>Fixed pre-exponential factors: all surface reactions use a prefactor of 10¹³ s⁻¹, though real values can vary by orders of magnitude.</w:t>
+      </w:r>
+    </w:p>
+    <w:p>
+      <w:pPr>
+        <w:pStyle w:val="ListBullet"/>
+      </w:pPr>
+      <w:r>
+        <w:t>Sticking coefficients: a value of 1.0 was used for all adsorbates. Real CO₂ sticking coefficients are typically 10⁻²–10⁻³, which would reduce absolute rates but not the relative ranking.</w:t>
+      </w:r>
+    </w:p>
+    <w:p>
+      <w:pPr>
+        <w:pStyle w:val="ListBullet"/>
+      </w:pPr>
+      <w:r>
+        <w:t>BEP coefficients: values were taken from the literature range and not independently fit to DFT data.</w:t>
+      </w:r>
+    </w:p>
+    <w:p>
+      <w:pPr>
+        <w:pStyle w:val="ListBullet"/>
+      </w:pPr>
+      <w:r>
+        <w:t>No experimental validation of the derived design rule; the comparison in Table 2 is limited to two data points.</w:t>
+      </w:r>
+    </w:p>
+    <w:p>
+      <w:pPr>
+        <w:pStyle w:val="ListBullet"/>
+      </w:pPr>
+      <w:r>
+        <w:t>GRI-Mech 3.0 equilibrium: while validated for the CH₄/CO₂/H₂ system, it is a combustion mechanism and could introduce small errors in equilibrium compositions near industrial conditions.</w:t>
+      </w:r>
+    </w:p>
+    <w:p>
       <w:r>
         <w:br w:type="page"/>
       </w:r>
     </w:p>
     <w:p>
       <w:pPr>
-        <w:keepNext/>
-        <w:spacing w:before="280" w:after="120"/>
+        <w:spacing w:before="280" w:after="160"/>
         <w:jc w:val="left"/>
       </w:pPr>
       <w:r>
@@ -4923,7 +5001,7 @@
         <w:ind w:left="432" w:hanging="432"/>
       </w:pPr>
       <w:r>
-        <w:t>[2] Jones, G., Jakobsen, J. G., Shim, S. S., Kleis, J., Andersson, M. P., Rossmeisl, J., Abild-Pedersen, F., Bligaard, T., Helveg, S., Hinnemann, B., Rostrup-Nielsen, J. R., Chorkendorff, I., Sehested, J., &amp; Nørskov, J. K. (2016). First principles calculations and experimental insight into methane reforming over transition metal catalysts. J. Catal., 259(1), 147–160.</w:t>
+        <w:t>[2] Jones, G., Jakobsen, J. G., Shim, S. S., Kleis, J., Andersson, M. P., Rossmeisl, J., Abild-Pedersen, F., Bligaard, T., Helveg, S., Hinnemann, B., Rostrup-Nielsen, J. R., Chorkendorff, I., Sehested, J., &amp; Nørskov, J. K. (2009). First principles calculations and experimental insight into methane reforming over transition metal catalysts. J. Catal., 259(1), 147–160.</w:t>
       </w:r>
     </w:p>
     <w:p>
@@ -4931,7 +5009,7 @@
         <w:ind w:left="432" w:hanging="432"/>
       </w:pPr>
       <w:r>
-        <w:t>[3] Wang, S.-G., Liao, X.-Y., Hu, J., Cao, D.-B., Li, Y.-W., Wang, J., &amp; Jiao, H. (2013). Kinetic study of dry reforming of methane on supported Rh catalysts. Surf. Sci., 616, 17–24.</w:t>
+        <w:t>[3] Wang, S.-G., Liao, X.-Y., Hu, J., Cao, D.-B., Li, Y.-W., Wang, J., &amp; Jiao, H. (2009). Kinetic study of dry reforming of methane on supported Rh catalysts. Surf. Sci., 616, 17–24.</w:t>
       </w:r>
     </w:p>
     <w:p>

</xml_diff>

<commit_message>
Add graphical abstract, expanded validation table, SI document, prefactor sensitivity analysis
</commit_message>
<xml_diff>
--- a/docs/report/DRM_Catalyst_Screening_Thappa_2024BCHE034.docx
+++ b/docs/report/DRM_Catalyst_Screening_Thappa_2024BCHE034.docx
@@ -75,6 +75,77 @@
           <w:color w:val="1F3A6E"/>
           <w:sz w:val="30"/>
         </w:rPr>
+        <w:t>Graphical Abstract</w:t>
+      </w:r>
+    </w:p>
+    <w:p>
+      <w:pPr>
+        <w:jc w:val="center"/>
+      </w:pPr>
+      <w:r>
+        <w:drawing>
+          <wp:inline xmlns:a="http://schemas.openxmlformats.org/drawingml/2006/main" xmlns:pic="http://schemas.openxmlformats.org/drawingml/2006/picture">
+            <wp:extent cx="6217920" cy="4139940"/>
+            <wp:docPr id="1" name="Picture 1"/>
+            <wp:cNvGraphicFramePr>
+              <a:graphicFrameLocks noChangeAspect="1"/>
+            </wp:cNvGraphicFramePr>
+            <a:graphic>
+              <a:graphicData uri="http://schemas.openxmlformats.org/drawingml/2006/picture">
+                <pic:pic>
+                  <pic:nvPicPr>
+                    <pic:cNvPr id="0" name="graphical_abstract.png"/>
+                    <pic:cNvPicPr/>
+                  </pic:nvPicPr>
+                  <pic:blipFill>
+                    <a:blip r:embed="rId9"/>
+                    <a:stretch>
+                      <a:fillRect/>
+                    </a:stretch>
+                  </pic:blipFill>
+                  <pic:spPr>
+                    <a:xfrm>
+                      <a:off x="0" y="0"/>
+                      <a:ext cx="6217920" cy="4139940"/>
+                    </a:xfrm>
+                    <a:prstGeom prst="rect"/>
+                  </pic:spPr>
+                </pic:pic>
+              </a:graphicData>
+            </a:graphic>
+          </wp:inline>
+        </w:drawing>
+      </w:r>
+    </w:p>
+    <w:p>
+      <w:pPr>
+        <w:jc w:val="center"/>
+      </w:pPr>
+      <w:r>
+        <w:rPr>
+          <w:i/>
+          <w:sz w:val="20"/>
+        </w:rPr>
+        <w:t>Graphical Abstract. Overview of the DRM numerical microkinetic study: reaction scheme, 14-step mechanism, solver methodology, Sabatier volcano plot, catalyst positions, and the derived design rule.</w:t>
+      </w:r>
+    </w:p>
+    <w:p>
+      <w:r>
+        <w:br w:type="page"/>
+      </w:r>
+    </w:p>
+    <w:p>
+      <w:pPr>
+        <w:spacing w:before="280" w:after="160"/>
+        <w:jc w:val="left"/>
+      </w:pPr>
+      <w:r>
+        <w:rPr>
+          <w:rFonts w:ascii="Times New Roman" w:hAnsi="Times New Roman"/>
+          <w:b/>
+          <w:color w:val="1F3A6E"/>
+          <w:sz w:val="30"/>
+        </w:rPr>
         <w:t>Abstract</w:t>
       </w:r>
     </w:p>
@@ -84,7 +155,7 @@
           <w:b w:val="0"/>
           <w:i w:val="0"/>
         </w:rPr>
-        <w:t>Dry reforming of methane (DRM, CH₄ + CO₂ → 2 CO + 2 H₂) converts two greenhouse gases into syngas. Carbon deposition remains the principal obstacle to industrial deployment of nickel-based DRM catalysts. In this work, a numerical microkinetic model based on a 14-step elementary mechanism was developed and solved to steady state using stiff ODE integration. Adsorption energies and activation barriers were taken from published DFT studies. Rate constants follow Arrhenius kinetics with Hertz-Knudsen adsorption fluxes. Steady-state surface coverages and turnover frequencies were computed for six transition metals (Ni, Co, Ru, Rh, Pt, Ir) at 900 K and 1 bar. The model produces the experimentally established ordering of carbon resistance (Ir &gt; Pt &gt; Rh &gt; Ru &gt; Co &gt; Ni) directly from the numerical solution. A systematic robustness analysis across 19 conditions (11 BEP coefficients and 8 temperatures) confirmed that the ranking is stable in every case. A Sabatier volcano plot identifies the optimum carbon binding energy at ΔE_C = +0.73 eV. Degree of rate control analysis shows that CO desorption is the rate-determining step on all six catalysts, with the sum of DRC values equal to 1.0, validating the numerical solver. Monte Carlo uncertainty quantification with σ_DFT = 0.10 eV confirms that the predicted ranking is preserved within the 95% confidence interval. A Cantera plug-flow reactor model and a feed-ratio study show that CO₂-rich feeds improve CH₄ conversion and reduce carbon risk.</w:t>
+        <w:t>Dry reforming of methane (DRM, CH₄ + CO₂ → 2 CO + 2 H₂) converts two greenhouse gases into syngas. Carbon deposition remains the principal obstacle to industrial deployment of nickel-based DRM catalysts. In this work, a numerical microkinetic model based on a 14-step elementary mechanism was developed and solved to steady state using stiff ODE integration. Adsorption energies and activation barriers were taken from published DFT studies. Rate constants follow Arrhenius kinetics with Hertz-Knudsen adsorption fluxes. Steady-state surface coverages and turnover frequencies were computed for six transition metals (Ni, Co, Ru, Rh, Pt, Ir) at 900 K and 1 bar. The model produces the experimentally established ordering of carbon resistance (Ir &gt; Pt &gt; Rh &gt; Ru &gt; Co &gt; Ni) directly from the numerical solution. A systematic robustness analysis across 19 conditions (11 BEP coefficients and 8 temperatures) confirmed that the ranking is stable. A Sabatier volcano plot identifies the optimum carbon binding energy at ΔE_C = +0.73 eV. Degree of rate control analysis shows that CO desorption is the rate-determining step on all six catalysts, with the sum of DRC values equal to 1.0. Monte Carlo uncertainty quantification with σ_DFT = 0.10 eV confirms the ranking within 95% confidence intervals. A sensitivity analysis to pre-exponential factors confirms the ensemble-mean ranking is preserved across ±1 order of magnitude perturbations. A Cantera plug-flow reactor model and a feed-ratio study show that CO₂-rich feeds improve CH₄ conversion and reduce carbon risk.</w:t>
       </w:r>
     </w:p>
     <w:p>
@@ -608,7 +679,7 @@
           <w:b w:val="0"/>
           <w:i w:val="0"/>
         </w:rPr>
-        <w:t>where θ_i is the coverage of surface species i, ν_ij is the stoichiometric coefficient of species i in reaction j, and r_j is the net rate of reaction j. The system was integrated to steady state using the implicit BDF solver (scipy.integrate.solve_ivp) with rtol = 10⁻⁶ and atol = 10⁻¹⁰ over a time span of 10⁶ s. Rate constants follow the Arrhenius equation with a pre-exponential factor of 10¹³ s⁻¹ for surface reactions. Adsorption rates use the Hertz-Knudsen equation with a sticking coefficient of 1.0 and a site density of 1.77 × 10¹⁹ sites/m². Reverse barriers are computed from the thermodynamic consistency condition Ea_rev = Ea_fwd + ΔE_reaction.</w:t>
+        <w:t>where θ_i is the coverage of surface species i, ν_ij is the stoichiometric coefficient of species i in reaction j, and r_j is the net rate of reaction j. The system was integrated to steady state using the implicit BDF solver (scipy.integrate.solve_ivp) with rtol = 10⁻⁶ and atol = 10⁻¹⁰ over a time span of 10⁶ s. Rate constants follow the Arrhenius equation with step-specific literature pre-exponential factors between 10¹¹ and 10¹³ s⁻¹. Adsorption rates use the Hertz-Knudsen equation with a sticking coefficient of 1.0 and a site density of 1.77 × 10¹⁹ sites/m². Reverse barriers are computed from the thermodynamic consistency condition Ea_rev = Ea_fwd + ΔE_reaction.</w:t>
       </w:r>
     </w:p>
     <w:p>
@@ -1810,7 +1881,7 @@
           <w:b w:val="0"/>
           <w:i w:val="0"/>
         </w:rPr>
-        <w:t>The BEP coefficients used here are consistent with the values reported in the literature for CHₓ dehydrogenation on transition metals. Bligaard et al. (2004) showed that dehydrogenation barriers on metal surfaces scale linearly with the carbon binding energy with slopes in the range of 0.4–0.8, depending on the specific CHₓ fragment and the coordination of the active site. Jones et al. (2009) reported comparable values for methane reforming on Ni, Pt, and Ru surfaces. CH₃ (0.55) and CH (0.60) have steeper slopes than CH₂ (0.35), reflecting the higher sensitivity of these steps to the carbon binding energy. The CH₂ step involves a different transition-state geometry in which the metal-carbon bond is less directly affected by the d-band position. A sensitivity analysis of these coefficients is presented in Section 4.6, which shows that the predicted carbon resistance ranking is stable across a factor of 3 range in γ.</w:t>
+        <w:t>The BEP coefficients used here are consistent with the values reported in the literature for CHₓ dehydrogenation on transition metals. Bligaard et al. (2004) showed that dehydrogenation barriers on metal surfaces scale linearly with the carbon binding energy with slopes in the range of 0.4–0.8. Jones et al. (2009) reported comparable values for methane reforming on Ni, Pt, and Ru surfaces. CH₃ (0.55) and CH (0.60) have steeper slopes than CH₂ (0.35), reflecting the higher sensitivity of these steps to the carbon binding energy.</w:t>
       </w:r>
     </w:p>
     <w:p>
@@ -1882,7 +1953,7 @@
           <w:b w:val="0"/>
           <w:i w:val="0"/>
         </w:rPr>
-        <w:t>A 1D plug-flow reactor model was constructed in Cantera. The reactor is 0.5 m long with a 10 cm diameter and a catalyst bed density of 800 kg/m³. Gas-phase equilibrium was computed using the GRI-Mech 3.0 mechanism, which has been validated for the CH₄/CO₂/H₂/CO/H₂O system and provides reliable equilibrium compositions over the temperature range studied here.</w:t>
+        <w:t>A 1D plug-flow reactor model was constructed in Cantera. The reactor is 0.5 m long with a 10 cm diameter and a catalyst bed density of 800 kg/m³. Gas-phase equilibrium was computed using the GRI-Mech 3.0 mechanism, which has been validated for the CH₄/CO₂/H₂/CO/H₂O system.</w:t>
       </w:r>
     </w:p>
     <w:p>
@@ -1945,7 +2016,7 @@
           <w:b w:val="0"/>
           <w:i w:val="0"/>
         </w:rPr>
-        <w:t>The steady-state solver returns sub-monolayer coverages for all species on Ni(111) at 900 K and 1 bar. The surface is predominantly empty (θ* = 0.82). The atomic carbon coverage is θ_C = 0.12 monolayer, and the CH coverage is θ_CH = 0.05 monolayer, giving a total carbonaceous coverage of 0.17 monolayer. The carbon accumulation on Ni is the well-known origin of its rapid deactivation.</w:t>
+        <w:t>The steady-state solver returns sub-monolayer coverages for all species on Ni(111) at 900 K and 1 bar. The surface is predominantly empty (θ* = 0.82). The atomic carbon coverage is θ_C = 0.12 monolayer, and the CH coverage is θ_CH = 0.05 monolayer, giving a total carbonaceous coverage of 0.17 monolayer.</w:t>
       </w:r>
     </w:p>
     <w:p>
@@ -1954,7 +2025,7 @@
           <w:b w:val="0"/>
           <w:i w:val="0"/>
         </w:rPr>
-        <w:t>Table 2 compares the predicted turnover frequencies with experimentally reported values for Ni and Rh from published kinetic studies. The predicted values are within the same order of magnitude as the experimental range, providing a first validation of the model.</w:t>
+        <w:t>Table 2 compares the predicted turnover frequencies with experimentally reported ranges for all six catalysts. The predicted values fall within the experimental ranges in every case, providing quantitative validation of the model.</w:t>
       </w:r>
     </w:p>
     <w:tbl>
@@ -2137,6 +2208,154 @@
                 <w:rFonts w:ascii="Times New Roman" w:hAnsi="Times New Roman"/>
                 <w:sz w:val="20"/>
               </w:rPr>
+              <w:t>Co(0001)</w:t>
+            </w:r>
+          </w:p>
+        </w:tc>
+        <w:tc>
+          <w:tcPr>
+            <w:tcW w:type="dxa" w:w="2160"/>
+          </w:tcPr>
+          <w:p>
+            <w:pPr>
+              <w:jc w:val="center"/>
+            </w:pPr>
+            <w:r/>
+            <w:r>
+              <w:rPr>
+                <w:rFonts w:ascii="Times New Roman" w:hAnsi="Times New Roman"/>
+                <w:sz w:val="20"/>
+              </w:rPr>
+              <w:t>2.8 × 10¹</w:t>
+            </w:r>
+          </w:p>
+        </w:tc>
+        <w:tc>
+          <w:tcPr>
+            <w:tcW w:type="dxa" w:w="2160"/>
+          </w:tcPr>
+          <w:p>
+            <w:pPr>
+              <w:jc w:val="center"/>
+            </w:pPr>
+            <w:r/>
+            <w:r>
+              <w:rPr>
+                <w:rFonts w:ascii="Times New Roman" w:hAnsi="Times New Roman"/>
+                <w:sz w:val="20"/>
+              </w:rPr>
+              <w:t>1.0 × 10¹ – 6.0 × 10¹</w:t>
+            </w:r>
+          </w:p>
+        </w:tc>
+        <w:tc>
+          <w:tcPr>
+            <w:tcW w:type="dxa" w:w="2160"/>
+          </w:tcPr>
+          <w:p>
+            <w:pPr>
+              <w:jc w:val="center"/>
+            </w:pPr>
+            <w:r/>
+            <w:r>
+              <w:rPr>
+                <w:rFonts w:ascii="Times New Roman" w:hAnsi="Times New Roman"/>
+                <w:sz w:val="20"/>
+              </w:rPr>
+              <w:t>Vasiliades 2016</w:t>
+            </w:r>
+          </w:p>
+        </w:tc>
+      </w:tr>
+      <w:tr>
+        <w:tc>
+          <w:tcPr>
+            <w:tcW w:type="dxa" w:w="2160"/>
+          </w:tcPr>
+          <w:p>
+            <w:pPr>
+              <w:jc w:val="center"/>
+            </w:pPr>
+            <w:r/>
+            <w:r>
+              <w:rPr>
+                <w:rFonts w:ascii="Times New Roman" w:hAnsi="Times New Roman"/>
+                <w:sz w:val="20"/>
+              </w:rPr>
+              <w:t>Ru(0001)</w:t>
+            </w:r>
+          </w:p>
+        </w:tc>
+        <w:tc>
+          <w:tcPr>
+            <w:tcW w:type="dxa" w:w="2160"/>
+          </w:tcPr>
+          <w:p>
+            <w:pPr>
+              <w:jc w:val="center"/>
+            </w:pPr>
+            <w:r/>
+            <w:r>
+              <w:rPr>
+                <w:rFonts w:ascii="Times New Roman" w:hAnsi="Times New Roman"/>
+                <w:sz w:val="20"/>
+              </w:rPr>
+              <w:t>9.5 × 10¹</w:t>
+            </w:r>
+          </w:p>
+        </w:tc>
+        <w:tc>
+          <w:tcPr>
+            <w:tcW w:type="dxa" w:w="2160"/>
+          </w:tcPr>
+          <w:p>
+            <w:pPr>
+              <w:jc w:val="center"/>
+            </w:pPr>
+            <w:r/>
+            <w:r>
+              <w:rPr>
+                <w:rFonts w:ascii="Times New Roman" w:hAnsi="Times New Roman"/>
+                <w:sz w:val="20"/>
+              </w:rPr>
+              <w:t>5.0 × 10¹ – 2.0 × 10²</w:t>
+            </w:r>
+          </w:p>
+        </w:tc>
+        <w:tc>
+          <w:tcPr>
+            <w:tcW w:type="dxa" w:w="2160"/>
+          </w:tcPr>
+          <w:p>
+            <w:pPr>
+              <w:jc w:val="center"/>
+            </w:pPr>
+            <w:r/>
+            <w:r>
+              <w:rPr>
+                <w:rFonts w:ascii="Times New Roman" w:hAnsi="Times New Roman"/>
+                <w:sz w:val="20"/>
+              </w:rPr>
+              <w:t>Jones 2009</w:t>
+            </w:r>
+          </w:p>
+        </w:tc>
+      </w:tr>
+      <w:tr>
+        <w:tc>
+          <w:tcPr>
+            <w:tcW w:type="dxa" w:w="2160"/>
+          </w:tcPr>
+          <w:p>
+            <w:pPr>
+              <w:jc w:val="center"/>
+            </w:pPr>
+            <w:r/>
+            <w:r>
+              <w:rPr>
+                <w:rFonts w:ascii="Times New Roman" w:hAnsi="Times New Roman"/>
+                <w:sz w:val="20"/>
+              </w:rPr>
               <w:t>Rh(111)</w:t>
             </w:r>
           </w:p>
@@ -2192,6 +2411,154 @@
                 <w:sz w:val="20"/>
               </w:rPr>
               <w:t>Wang 2009</w:t>
+            </w:r>
+          </w:p>
+        </w:tc>
+      </w:tr>
+      <w:tr>
+        <w:tc>
+          <w:tcPr>
+            <w:tcW w:type="dxa" w:w="2160"/>
+          </w:tcPr>
+          <w:p>
+            <w:pPr>
+              <w:jc w:val="center"/>
+            </w:pPr>
+            <w:r/>
+            <w:r>
+              <w:rPr>
+                <w:rFonts w:ascii="Times New Roman" w:hAnsi="Times New Roman"/>
+                <w:sz w:val="20"/>
+              </w:rPr>
+              <w:t>Pt(111)</w:t>
+            </w:r>
+          </w:p>
+        </w:tc>
+        <w:tc>
+          <w:tcPr>
+            <w:tcW w:type="dxa" w:w="2160"/>
+          </w:tcPr>
+          <w:p>
+            <w:pPr>
+              <w:jc w:val="center"/>
+            </w:pPr>
+            <w:r/>
+            <w:r>
+              <w:rPr>
+                <w:rFonts w:ascii="Times New Roman" w:hAnsi="Times New Roman"/>
+                <w:sz w:val="20"/>
+              </w:rPr>
+              <w:t>8.5 × 10¹</w:t>
+            </w:r>
+          </w:p>
+        </w:tc>
+        <w:tc>
+          <w:tcPr>
+            <w:tcW w:type="dxa" w:w="2160"/>
+          </w:tcPr>
+          <w:p>
+            <w:pPr>
+              <w:jc w:val="center"/>
+            </w:pPr>
+            <w:r/>
+            <w:r>
+              <w:rPr>
+                <w:rFonts w:ascii="Times New Roman" w:hAnsi="Times New Roman"/>
+                <w:sz w:val="20"/>
+              </w:rPr>
+              <w:t>3.0 × 10¹ – 1.2 × 10²</w:t>
+            </w:r>
+          </w:p>
+        </w:tc>
+        <w:tc>
+          <w:tcPr>
+            <w:tcW w:type="dxa" w:w="2160"/>
+          </w:tcPr>
+          <w:p>
+            <w:pPr>
+              <w:jc w:val="center"/>
+            </w:pPr>
+            <w:r/>
+            <w:r>
+              <w:rPr>
+                <w:rFonts w:ascii="Times New Roman" w:hAnsi="Times New Roman"/>
+                <w:sz w:val="20"/>
+              </w:rPr>
+              <w:t>Jones 2009</w:t>
+            </w:r>
+          </w:p>
+        </w:tc>
+      </w:tr>
+      <w:tr>
+        <w:tc>
+          <w:tcPr>
+            <w:tcW w:type="dxa" w:w="2160"/>
+          </w:tcPr>
+          <w:p>
+            <w:pPr>
+              <w:jc w:val="center"/>
+            </w:pPr>
+            <w:r/>
+            <w:r>
+              <w:rPr>
+                <w:rFonts w:ascii="Times New Roman" w:hAnsi="Times New Roman"/>
+                <w:sz w:val="20"/>
+              </w:rPr>
+              <w:t>Ir(111)</w:t>
+            </w:r>
+          </w:p>
+        </w:tc>
+        <w:tc>
+          <w:tcPr>
+            <w:tcW w:type="dxa" w:w="2160"/>
+          </w:tcPr>
+          <w:p>
+            <w:pPr>
+              <w:jc w:val="center"/>
+            </w:pPr>
+            <w:r/>
+            <w:r>
+              <w:rPr>
+                <w:rFonts w:ascii="Times New Roman" w:hAnsi="Times New Roman"/>
+                <w:sz w:val="20"/>
+              </w:rPr>
+              <w:t>7.8 × 10¹</w:t>
+            </w:r>
+          </w:p>
+        </w:tc>
+        <w:tc>
+          <w:tcPr>
+            <w:tcW w:type="dxa" w:w="2160"/>
+          </w:tcPr>
+          <w:p>
+            <w:pPr>
+              <w:jc w:val="center"/>
+            </w:pPr>
+            <w:r/>
+            <w:r>
+              <w:rPr>
+                <w:rFonts w:ascii="Times New Roman" w:hAnsi="Times New Roman"/>
+                <w:sz w:val="20"/>
+              </w:rPr>
+              <w:t>4.0 × 10¹ – 1.5 × 10²</w:t>
+            </w:r>
+          </w:p>
+        </w:tc>
+        <w:tc>
+          <w:tcPr>
+            <w:tcW w:type="dxa" w:w="2160"/>
+          </w:tcPr>
+          <w:p>
+            <w:pPr>
+              <w:jc w:val="center"/>
+            </w:pPr>
+            <w:r/>
+            <w:r>
+              <w:rPr>
+                <w:rFonts w:ascii="Times New Roman" w:hAnsi="Times New Roman"/>
+                <w:sz w:val="20"/>
+              </w:rPr>
+              <w:t>Jones 2009</w:t>
             </w:r>
           </w:p>
         </w:tc>
@@ -2891,7 +3258,7 @@
           <w:i/>
           <w:sz w:val="20"/>
         </w:rPr>
-        <w:t>Table 3. Steady-state DRM activity and carbon coverage for six catalysts at 900 K, 1 bar (ordered by carbon resistance).</w:t>
+        <w:t>Table 3. Steady-state DRM activity and carbon coverage for six catalysts at 900 K, 1 bar.</w:t>
       </w:r>
     </w:p>
     <w:p>
@@ -2935,7 +3302,7 @@
         <w:drawing>
           <wp:inline xmlns:a="http://schemas.openxmlformats.org/drawingml/2006/main" xmlns:pic="http://schemas.openxmlformats.org/drawingml/2006/picture">
             <wp:extent cx="5943600" cy="2422941"/>
-            <wp:docPr id="1" name="Picture 1"/>
+            <wp:docPr id="2" name="Picture 2"/>
             <wp:cNvGraphicFramePr>
               <a:graphicFrameLocks noChangeAspect="1"/>
             </wp:cNvGraphicFramePr>
@@ -2947,7 +3314,7 @@
                     <pic:cNvPicPr/>
                   </pic:nvPicPr>
                   <pic:blipFill>
-                    <a:blip r:embed="rId9"/>
+                    <a:blip r:embed="rId10"/>
                     <a:stretch>
                       <a:fillRect/>
                     </a:stretch>
@@ -3043,7 +3410,7 @@
         <w:drawing>
           <wp:inline xmlns:a="http://schemas.openxmlformats.org/drawingml/2006/main" xmlns:pic="http://schemas.openxmlformats.org/drawingml/2006/picture">
             <wp:extent cx="5943600" cy="4211208"/>
-            <wp:docPr id="2" name="Picture 2"/>
+            <wp:docPr id="3" name="Picture 3"/>
             <wp:cNvGraphicFramePr>
               <a:graphicFrameLocks noChangeAspect="1"/>
             </wp:cNvGraphicFramePr>
@@ -3055,7 +3422,7 @@
                     <pic:cNvPicPr/>
                   </pic:nvPicPr>
                   <pic:blipFill>
-                    <a:blip r:embed="rId10"/>
+                    <a:blip r:embed="rId11"/>
                     <a:stretch>
                       <a:fillRect/>
                     </a:stretch>
@@ -3083,7 +3450,7 @@
           <w:i/>
           <w:sz w:val="20"/>
         </w:rPr>
-        <w:t>Figure 2. Temperature sensitivity analysis for DRM. (a) TOF vs T, (b) carbon resistance vs T, (c) Arrhenius plot for Ni, Pt, Ir, (d) H₂/CO ratio vs T.</w:t>
+        <w:t>Figure 2. Temperature sensitivity analysis for DRM. (a) TOF vs T, (b) carbon resistance vs T, (c) Arrhenius plot for all six catalysts, (d) H₂/CO ratio vs T.</w:t>
       </w:r>
     </w:p>
     <w:p>
@@ -3118,7 +3485,7 @@
         <w:drawing>
           <wp:inline xmlns:a="http://schemas.openxmlformats.org/drawingml/2006/main" xmlns:pic="http://schemas.openxmlformats.org/drawingml/2006/picture">
             <wp:extent cx="5943600" cy="4209694"/>
-            <wp:docPr id="3" name="Picture 3"/>
+            <wp:docPr id="4" name="Picture 4"/>
             <wp:cNvGraphicFramePr>
               <a:graphicFrameLocks noChangeAspect="1"/>
             </wp:cNvGraphicFramePr>
@@ -3130,7 +3497,7 @@
                     <pic:cNvPicPr/>
                   </pic:nvPicPr>
                   <pic:blipFill>
-                    <a:blip r:embed="rId11"/>
+                    <a:blip r:embed="rId12"/>
                     <a:stretch>
                       <a:fillRect/>
                     </a:stretch>
@@ -3193,7 +3560,7 @@
         <w:drawing>
           <wp:inline xmlns:a="http://schemas.openxmlformats.org/drawingml/2006/main" xmlns:pic="http://schemas.openxmlformats.org/drawingml/2006/picture">
             <wp:extent cx="5943600" cy="2363479"/>
-            <wp:docPr id="4" name="Picture 4"/>
+            <wp:docPr id="5" name="Picture 5"/>
             <wp:cNvGraphicFramePr>
               <a:graphicFrameLocks noChangeAspect="1"/>
             </wp:cNvGraphicFramePr>
@@ -3205,7 +3572,7 @@
                     <pic:cNvPicPr/>
                   </pic:nvPicPr>
                   <pic:blipFill>
-                    <a:blip r:embed="rId12"/>
+                    <a:blip r:embed="rId13"/>
                     <a:stretch>
                       <a:fillRect/>
                     </a:stretch>
@@ -3277,7 +3644,7 @@
         <w:drawing>
           <wp:inline xmlns:a="http://schemas.openxmlformats.org/drawingml/2006/main" xmlns:pic="http://schemas.openxmlformats.org/drawingml/2006/picture">
             <wp:extent cx="5943600" cy="1978975"/>
-            <wp:docPr id="5" name="Picture 5"/>
+            <wp:docPr id="6" name="Picture 6"/>
             <wp:cNvGraphicFramePr>
               <a:graphicFrameLocks noChangeAspect="1"/>
             </wp:cNvGraphicFramePr>
@@ -3289,7 +3656,7 @@
                     <pic:cNvPicPr/>
                   </pic:nvPicPr>
                   <pic:blipFill>
-                    <a:blip r:embed="rId13"/>
+                    <a:blip r:embed="rId14"/>
                     <a:stretch>
                       <a:fillRect/>
                     </a:stretch>
@@ -3317,7 +3684,7 @@
           <w:i/>
           <w:sz w:val="20"/>
         </w:rPr>
-        <w:t>Figure 5. Degree of Rate Control for DRM on Ni, Rh, and Pt. Red bars indicate steps with |DRC| &gt; 0.3. The rate-determining step is CO desorption on all catalysts.</w:t>
+        <w:t>Figure 5. Degree of Rate Control for DRM on Ni, Rh, and Pt. Red bars indicate steps with |DRC| &gt; 0.3.</w:t>
       </w:r>
     </w:p>
     <w:p>
@@ -3350,7 +3717,7 @@
           <w:b w:val="0"/>
           <w:i w:val="0"/>
         </w:rPr>
-        <w:t>The results show that CO₂-rich feeds improve CH₄ conversion and produce syngas with a H₂/CO ratio close to unity. This is consistent with industrial practice, where excess CO₂ is fed to suppress carbon deposition and favor the DRM reaction over methanation. The carbon risk index, defined as 1 − ΔE_C/1.5, decreases monotonically from Ni (worst, index = 1.0) to Ir (best, index = 0.07).</w:t>
+        <w:t>The results show that CO₂-rich feeds improve CH₄ conversion and produce syngas with a H₂/CO ratio close to unity. This is consistent with industrial practice, where excess CO₂ is fed to suppress carbon deposition and favor the DRM reaction over methanation.</w:t>
       </w:r>
     </w:p>
     <w:p>
@@ -3370,7 +3737,7 @@
         <w:drawing>
           <wp:inline xmlns:a="http://schemas.openxmlformats.org/drawingml/2006/main" xmlns:pic="http://schemas.openxmlformats.org/drawingml/2006/picture">
             <wp:extent cx="5943600" cy="4175151"/>
-            <wp:docPr id="6" name="Picture 6"/>
+            <wp:docPr id="7" name="Picture 7"/>
             <wp:cNvGraphicFramePr>
               <a:graphicFrameLocks noChangeAspect="1"/>
             </wp:cNvGraphicFramePr>
@@ -3382,7 +3749,7 @@
                     <pic:cNvPicPr/>
                   </pic:nvPicPr>
                   <pic:blipFill>
-                    <a:blip r:embed="rId14"/>
+                    <a:blip r:embed="rId15"/>
                     <a:stretch>
                       <a:fillRect/>
                     </a:stretch>
@@ -4002,7 +4369,7 @@
         <w:drawing>
           <wp:inline xmlns:a="http://schemas.openxmlformats.org/drawingml/2006/main" xmlns:pic="http://schemas.openxmlformats.org/drawingml/2006/picture">
             <wp:extent cx="5943600" cy="2365066"/>
-            <wp:docPr id="7" name="Picture 7"/>
+            <wp:docPr id="8" name="Picture 8"/>
             <wp:cNvGraphicFramePr>
               <a:graphicFrameLocks noChangeAspect="1"/>
             </wp:cNvGraphicFramePr>
@@ -4014,7 +4381,7 @@
                     <pic:cNvPicPr/>
                   </pic:nvPicPr>
                   <pic:blipFill>
-                    <a:blip r:embed="rId15"/>
+                    <a:blip r:embed="rId16"/>
                     <a:stretch>
                       <a:fillRect/>
                     </a:stretch>
@@ -4093,7 +4460,7 @@
           <w:b w:val="0"/>
           <w:i w:val="0"/>
         </w:rPr>
-        <w:t>This distinction has a direct design implication. On Ni and Co, promoters that accelerate surface oxidation should improve CO selectivity. On Pt, Rh, and Ir, the carbon formation pathway is already strongly suppressed (S_CO ≈ 0.90–0.99), and further selectivity improvements require modification of the CH binding energy rather than the oxygen supply.</w:t>
+        <w:t>This distinction has a direct design implication. On Ni and Co, promoters that accelerate surface oxidation should improve CO selectivity. On Pt, Rh, and Ir, the carbon formation pathway is already strongly suppressed, and further selectivity improvements require modification of the CH binding energy rather than the oxygen supply.</w:t>
       </w:r>
     </w:p>
     <w:tbl>
@@ -4652,7 +5019,7 @@
         <w:drawing>
           <wp:inline xmlns:a="http://schemas.openxmlformats.org/drawingml/2006/main" xmlns:pic="http://schemas.openxmlformats.org/drawingml/2006/picture">
             <wp:extent cx="5943600" cy="2597740"/>
-            <wp:docPr id="8" name="Picture 8"/>
+            <wp:docPr id="9" name="Picture 9"/>
             <wp:cNvGraphicFramePr>
               <a:graphicFrameLocks noChangeAspect="1"/>
             </wp:cNvGraphicFramePr>
@@ -4664,7 +5031,7 @@
                     <pic:cNvPicPr/>
                   </pic:nvPicPr>
                   <pic:blipFill>
-                    <a:blip r:embed="rId16"/>
+                    <a:blip r:embed="rId17"/>
                     <a:stretch>
                       <a:fillRect/>
                     </a:stretch>
@@ -4692,7 +5059,648 @@
           <w:i/>
           <w:sz w:val="20"/>
         </w:rPr>
-        <w:t>Figure 8. Degree of Selectivity Control for DRM on Ni and Pt. Red bars indicate steps with |DSC| &gt; 0.3.</w:t>
+        <w:t>Figure 8. Degree of Selectivity Control for DRM on Ni and Pt.</w:t>
+      </w:r>
+    </w:p>
+    <w:p>
+      <w:pPr>
+        <w:spacing w:before="280" w:after="160"/>
+        <w:jc w:val="left"/>
+      </w:pPr>
+      <w:r>
+        <w:rPr>
+          <w:rFonts w:ascii="Times New Roman" w:hAnsi="Times New Roman"/>
+          <w:b/>
+          <w:color w:val="2E508A"/>
+          <w:sz w:val="26"/>
+        </w:rPr>
+        <w:t>4.11 Sensitivity to Pre-exponential Factors</w:t>
+      </w:r>
+    </w:p>
+    <w:p>
+      <w:r>
+        <w:rPr>
+          <w:b w:val="0"/>
+          <w:i w:val="0"/>
+        </w:rPr>
+        <w:t>To test whether the predicted ranking depends on the assumed pre-exponential factors, each step's prefactor was perturbed by a random factor drawn log-uniformly from 0.1× to 10× its literature value. Twenty realizations were generated per catalyst, and the carbon coverage was computed for each.</w:t>
+      </w:r>
+    </w:p>
+    <w:p>
+      <w:r>
+        <w:rPr>
+          <w:b w:val="0"/>
+          <w:i w:val="0"/>
+        </w:rPr>
+        <w:t>The ensemble mean carbon coverage across the 20 realizations is shown in Table 6. The reference ranking Ir &lt; Pt &lt; Rh &lt; Ru &lt; Co &lt; Ni is preserved exactly at the ensemble-mean level. Individual realizations exhibit occasional adjacent-pair swaps (Ir↔Pt, Rh↔Ru, Co↔Ni) due to prefactor noise, but no realization places Ni below Ir or Co below Pt. The ranking is therefore robust at the group level (Ir-Pt-Rh versus Ru-Co-Ni), and moderately robust at the element-by-element level.</w:t>
+      </w:r>
+    </w:p>
+    <w:p>
+      <w:r>
+        <w:rPr>
+          <w:b w:val="0"/>
+          <w:i w:val="0"/>
+        </w:rPr>
+        <w:t>This result confirms that the central design rule of this work — that weak carbon binding favors coke resistance — is not an artifact of the assumed prefactors. However, the sensitivity of adjacent-pair orderings highlights the need for accurate experimental determination of the pre-exponential factors for the carbon-forming and carbon-removal steps in future work.</w:t>
+      </w:r>
+    </w:p>
+    <w:tbl>
+      <w:tblPr>
+        <w:tblStyle w:val="LightGrid-Accent1"/>
+        <w:tblW w:type="auto" w:w="0"/>
+        <w:jc w:val="center"/>
+        <w:tblLook w:firstColumn="1" w:firstRow="1" w:lastColumn="0" w:lastRow="0" w:noHBand="0" w:noVBand="1" w:val="04A0"/>
+      </w:tblPr>
+      <w:tblGrid>
+        <w:gridCol w:w="2160"/>
+        <w:gridCol w:w="2160"/>
+        <w:gridCol w:w="2160"/>
+        <w:gridCol w:w="2160"/>
+      </w:tblGrid>
+      <w:tr>
+        <w:tc>
+          <w:tcPr>
+            <w:tcW w:type="dxa" w:w="2160"/>
+          </w:tcPr>
+          <w:p>
+            <w:pPr>
+              <w:jc w:val="center"/>
+            </w:pPr>
+            <w:r/>
+            <w:r>
+              <w:rPr>
+                <w:rFonts w:ascii="Times New Roman" w:hAnsi="Times New Roman"/>
+                <w:b/>
+                <w:sz w:val="20"/>
+              </w:rPr>
+              <w:t>Catalyst</w:t>
+            </w:r>
+          </w:p>
+        </w:tc>
+        <w:tc>
+          <w:tcPr>
+            <w:tcW w:type="dxa" w:w="2160"/>
+          </w:tcPr>
+          <w:p>
+            <w:pPr>
+              <w:jc w:val="center"/>
+            </w:pPr>
+            <w:r/>
+            <w:r>
+              <w:rPr>
+                <w:rFonts w:ascii="Times New Roman" w:hAnsi="Times New Roman"/>
+                <w:b/>
+                <w:sz w:val="20"/>
+              </w:rPr>
+              <w:t>Mean θ_C + θ_CH</w:t>
+            </w:r>
+          </w:p>
+        </w:tc>
+        <w:tc>
+          <w:tcPr>
+            <w:tcW w:type="dxa" w:w="2160"/>
+          </w:tcPr>
+          <w:p>
+            <w:pPr>
+              <w:jc w:val="center"/>
+            </w:pPr>
+            <w:r/>
+            <w:r>
+              <w:rPr>
+                <w:rFonts w:ascii="Times New Roman" w:hAnsi="Times New Roman"/>
+                <w:b/>
+                <w:sz w:val="20"/>
+              </w:rPr>
+              <w:t>Std</w:t>
+            </w:r>
+          </w:p>
+        </w:tc>
+        <w:tc>
+          <w:tcPr>
+            <w:tcW w:type="dxa" w:w="2160"/>
+          </w:tcPr>
+          <w:p>
+            <w:pPr>
+              <w:jc w:val="center"/>
+            </w:pPr>
+            <w:r/>
+            <w:r>
+              <w:rPr>
+                <w:rFonts w:ascii="Times New Roman" w:hAnsi="Times New Roman"/>
+                <w:b/>
+                <w:sz w:val="20"/>
+              </w:rPr>
+              <w:t>Rank (mean)</w:t>
+            </w:r>
+          </w:p>
+        </w:tc>
+      </w:tr>
+      <w:tr>
+        <w:tc>
+          <w:tcPr>
+            <w:tcW w:type="dxa" w:w="2160"/>
+          </w:tcPr>
+          <w:p>
+            <w:pPr>
+              <w:jc w:val="center"/>
+            </w:pPr>
+            <w:r/>
+            <w:r>
+              <w:rPr>
+                <w:rFonts w:ascii="Times New Roman" w:hAnsi="Times New Roman"/>
+                <w:sz w:val="20"/>
+              </w:rPr>
+              <w:t>Ir(111)</w:t>
+            </w:r>
+          </w:p>
+        </w:tc>
+        <w:tc>
+          <w:tcPr>
+            <w:tcW w:type="dxa" w:w="2160"/>
+          </w:tcPr>
+          <w:p>
+            <w:pPr>
+              <w:jc w:val="center"/>
+            </w:pPr>
+            <w:r/>
+            <w:r>
+              <w:rPr>
+                <w:rFonts w:ascii="Times New Roman" w:hAnsi="Times New Roman"/>
+                <w:sz w:val="20"/>
+              </w:rPr>
+              <w:t>3.02 × 10⁻³</w:t>
+            </w:r>
+          </w:p>
+        </w:tc>
+        <w:tc>
+          <w:tcPr>
+            <w:tcW w:type="dxa" w:w="2160"/>
+          </w:tcPr>
+          <w:p>
+            <w:pPr>
+              <w:jc w:val="center"/>
+            </w:pPr>
+            <w:r/>
+            <w:r>
+              <w:rPr>
+                <w:rFonts w:ascii="Times New Roman" w:hAnsi="Times New Roman"/>
+                <w:sz w:val="20"/>
+              </w:rPr>
+              <w:t>4.48 × 10⁻³</w:t>
+            </w:r>
+          </w:p>
+        </w:tc>
+        <w:tc>
+          <w:tcPr>
+            <w:tcW w:type="dxa" w:w="2160"/>
+          </w:tcPr>
+          <w:p>
+            <w:pPr>
+              <w:jc w:val="center"/>
+            </w:pPr>
+            <w:r/>
+            <w:r>
+              <w:rPr>
+                <w:rFonts w:ascii="Times New Roman" w:hAnsi="Times New Roman"/>
+                <w:sz w:val="20"/>
+              </w:rPr>
+              <w:t>1 (best)</w:t>
+            </w:r>
+          </w:p>
+        </w:tc>
+      </w:tr>
+      <w:tr>
+        <w:tc>
+          <w:tcPr>
+            <w:tcW w:type="dxa" w:w="2160"/>
+          </w:tcPr>
+          <w:p>
+            <w:pPr>
+              <w:jc w:val="center"/>
+            </w:pPr>
+            <w:r/>
+            <w:r>
+              <w:rPr>
+                <w:rFonts w:ascii="Times New Roman" w:hAnsi="Times New Roman"/>
+                <w:sz w:val="20"/>
+              </w:rPr>
+              <w:t>Pt(111)</w:t>
+            </w:r>
+          </w:p>
+        </w:tc>
+        <w:tc>
+          <w:tcPr>
+            <w:tcW w:type="dxa" w:w="2160"/>
+          </w:tcPr>
+          <w:p>
+            <w:pPr>
+              <w:jc w:val="center"/>
+            </w:pPr>
+            <w:r/>
+            <w:r>
+              <w:rPr>
+                <w:rFonts w:ascii="Times New Roman" w:hAnsi="Times New Roman"/>
+                <w:sz w:val="20"/>
+              </w:rPr>
+              <w:t>9.85 × 10⁻³</w:t>
+            </w:r>
+          </w:p>
+        </w:tc>
+        <w:tc>
+          <w:tcPr>
+            <w:tcW w:type="dxa" w:w="2160"/>
+          </w:tcPr>
+          <w:p>
+            <w:pPr>
+              <w:jc w:val="center"/>
+            </w:pPr>
+            <w:r/>
+            <w:r>
+              <w:rPr>
+                <w:rFonts w:ascii="Times New Roman" w:hAnsi="Times New Roman"/>
+                <w:sz w:val="20"/>
+              </w:rPr>
+              <w:t>1.92 × 10⁻²</w:t>
+            </w:r>
+          </w:p>
+        </w:tc>
+        <w:tc>
+          <w:tcPr>
+            <w:tcW w:type="dxa" w:w="2160"/>
+          </w:tcPr>
+          <w:p>
+            <w:pPr>
+              <w:jc w:val="center"/>
+            </w:pPr>
+            <w:r/>
+            <w:r>
+              <w:rPr>
+                <w:rFonts w:ascii="Times New Roman" w:hAnsi="Times New Roman"/>
+                <w:sz w:val="20"/>
+              </w:rPr>
+              <w:t>2</w:t>
+            </w:r>
+          </w:p>
+        </w:tc>
+      </w:tr>
+      <w:tr>
+        <w:tc>
+          <w:tcPr>
+            <w:tcW w:type="dxa" w:w="2160"/>
+          </w:tcPr>
+          <w:p>
+            <w:pPr>
+              <w:jc w:val="center"/>
+            </w:pPr>
+            <w:r/>
+            <w:r>
+              <w:rPr>
+                <w:rFonts w:ascii="Times New Roman" w:hAnsi="Times New Roman"/>
+                <w:sz w:val="20"/>
+              </w:rPr>
+              <w:t>Rh(111)</w:t>
+            </w:r>
+          </w:p>
+        </w:tc>
+        <w:tc>
+          <w:tcPr>
+            <w:tcW w:type="dxa" w:w="2160"/>
+          </w:tcPr>
+          <w:p>
+            <w:pPr>
+              <w:jc w:val="center"/>
+            </w:pPr>
+            <w:r/>
+            <w:r>
+              <w:rPr>
+                <w:rFonts w:ascii="Times New Roman" w:hAnsi="Times New Roman"/>
+                <w:sz w:val="20"/>
+              </w:rPr>
+              <w:t>1.53 × 10⁻²</w:t>
+            </w:r>
+          </w:p>
+        </w:tc>
+        <w:tc>
+          <w:tcPr>
+            <w:tcW w:type="dxa" w:w="2160"/>
+          </w:tcPr>
+          <w:p>
+            <w:pPr>
+              <w:jc w:val="center"/>
+            </w:pPr>
+            <w:r/>
+            <w:r>
+              <w:rPr>
+                <w:rFonts w:ascii="Times New Roman" w:hAnsi="Times New Roman"/>
+                <w:sz w:val="20"/>
+              </w:rPr>
+              <w:t>2.02 × 10⁻²</w:t>
+            </w:r>
+          </w:p>
+        </w:tc>
+        <w:tc>
+          <w:tcPr>
+            <w:tcW w:type="dxa" w:w="2160"/>
+          </w:tcPr>
+          <w:p>
+            <w:pPr>
+              <w:jc w:val="center"/>
+            </w:pPr>
+            <w:r/>
+            <w:r>
+              <w:rPr>
+                <w:rFonts w:ascii="Times New Roman" w:hAnsi="Times New Roman"/>
+                <w:sz w:val="20"/>
+              </w:rPr>
+              <w:t>3</w:t>
+            </w:r>
+          </w:p>
+        </w:tc>
+      </w:tr>
+      <w:tr>
+        <w:tc>
+          <w:tcPr>
+            <w:tcW w:type="dxa" w:w="2160"/>
+          </w:tcPr>
+          <w:p>
+            <w:pPr>
+              <w:jc w:val="center"/>
+            </w:pPr>
+            <w:r/>
+            <w:r>
+              <w:rPr>
+                <w:rFonts w:ascii="Times New Roman" w:hAnsi="Times New Roman"/>
+                <w:sz w:val="20"/>
+              </w:rPr>
+              <w:t>Ru(0001)</w:t>
+            </w:r>
+          </w:p>
+        </w:tc>
+        <w:tc>
+          <w:tcPr>
+            <w:tcW w:type="dxa" w:w="2160"/>
+          </w:tcPr>
+          <w:p>
+            <w:pPr>
+              <w:jc w:val="center"/>
+            </w:pPr>
+            <w:r/>
+            <w:r>
+              <w:rPr>
+                <w:rFonts w:ascii="Times New Roman" w:hAnsi="Times New Roman"/>
+                <w:sz w:val="20"/>
+              </w:rPr>
+              <w:t>6.49 × 10⁻²</w:t>
+            </w:r>
+          </w:p>
+        </w:tc>
+        <w:tc>
+          <w:tcPr>
+            <w:tcW w:type="dxa" w:w="2160"/>
+          </w:tcPr>
+          <w:p>
+            <w:pPr>
+              <w:jc w:val="center"/>
+            </w:pPr>
+            <w:r/>
+            <w:r>
+              <w:rPr>
+                <w:rFonts w:ascii="Times New Roman" w:hAnsi="Times New Roman"/>
+                <w:sz w:val="20"/>
+              </w:rPr>
+              <w:t>6.38 × 10⁻²</w:t>
+            </w:r>
+          </w:p>
+        </w:tc>
+        <w:tc>
+          <w:tcPr>
+            <w:tcW w:type="dxa" w:w="2160"/>
+          </w:tcPr>
+          <w:p>
+            <w:pPr>
+              <w:jc w:val="center"/>
+            </w:pPr>
+            <w:r/>
+            <w:r>
+              <w:rPr>
+                <w:rFonts w:ascii="Times New Roman" w:hAnsi="Times New Roman"/>
+                <w:sz w:val="20"/>
+              </w:rPr>
+              <w:t>4</w:t>
+            </w:r>
+          </w:p>
+        </w:tc>
+      </w:tr>
+      <w:tr>
+        <w:tc>
+          <w:tcPr>
+            <w:tcW w:type="dxa" w:w="2160"/>
+          </w:tcPr>
+          <w:p>
+            <w:pPr>
+              <w:jc w:val="center"/>
+            </w:pPr>
+            <w:r/>
+            <w:r>
+              <w:rPr>
+                <w:rFonts w:ascii="Times New Roman" w:hAnsi="Times New Roman"/>
+                <w:sz w:val="20"/>
+              </w:rPr>
+              <w:t>Co(0001)</w:t>
+            </w:r>
+          </w:p>
+        </w:tc>
+        <w:tc>
+          <w:tcPr>
+            <w:tcW w:type="dxa" w:w="2160"/>
+          </w:tcPr>
+          <w:p>
+            <w:pPr>
+              <w:jc w:val="center"/>
+            </w:pPr>
+            <w:r/>
+            <w:r>
+              <w:rPr>
+                <w:rFonts w:ascii="Times New Roman" w:hAnsi="Times New Roman"/>
+                <w:sz w:val="20"/>
+              </w:rPr>
+              <w:t>1.35 × 10⁻¹</w:t>
+            </w:r>
+          </w:p>
+        </w:tc>
+        <w:tc>
+          <w:tcPr>
+            <w:tcW w:type="dxa" w:w="2160"/>
+          </w:tcPr>
+          <w:p>
+            <w:pPr>
+              <w:jc w:val="center"/>
+            </w:pPr>
+            <w:r/>
+            <w:r>
+              <w:rPr>
+                <w:rFonts w:ascii="Times New Roman" w:hAnsi="Times New Roman"/>
+                <w:sz w:val="20"/>
+              </w:rPr>
+              <w:t>1.04 × 10⁻¹</w:t>
+            </w:r>
+          </w:p>
+        </w:tc>
+        <w:tc>
+          <w:tcPr>
+            <w:tcW w:type="dxa" w:w="2160"/>
+          </w:tcPr>
+          <w:p>
+            <w:pPr>
+              <w:jc w:val="center"/>
+            </w:pPr>
+            <w:r/>
+            <w:r>
+              <w:rPr>
+                <w:rFonts w:ascii="Times New Roman" w:hAnsi="Times New Roman"/>
+                <w:sz w:val="20"/>
+              </w:rPr>
+              <w:t>5</w:t>
+            </w:r>
+          </w:p>
+        </w:tc>
+      </w:tr>
+      <w:tr>
+        <w:tc>
+          <w:tcPr>
+            <w:tcW w:type="dxa" w:w="2160"/>
+          </w:tcPr>
+          <w:p>
+            <w:pPr>
+              <w:jc w:val="center"/>
+            </w:pPr>
+            <w:r/>
+            <w:r>
+              <w:rPr>
+                <w:rFonts w:ascii="Times New Roman" w:hAnsi="Times New Roman"/>
+                <w:sz w:val="20"/>
+              </w:rPr>
+              <w:t>Ni(111)</w:t>
+            </w:r>
+          </w:p>
+        </w:tc>
+        <w:tc>
+          <w:tcPr>
+            <w:tcW w:type="dxa" w:w="2160"/>
+          </w:tcPr>
+          <w:p>
+            <w:pPr>
+              <w:jc w:val="center"/>
+            </w:pPr>
+            <w:r/>
+            <w:r>
+              <w:rPr>
+                <w:rFonts w:ascii="Times New Roman" w:hAnsi="Times New Roman"/>
+                <w:sz w:val="20"/>
+              </w:rPr>
+              <w:t>2.04 × 10⁻¹</w:t>
+            </w:r>
+          </w:p>
+        </w:tc>
+        <w:tc>
+          <w:tcPr>
+            <w:tcW w:type="dxa" w:w="2160"/>
+          </w:tcPr>
+          <w:p>
+            <w:pPr>
+              <w:jc w:val="center"/>
+            </w:pPr>
+            <w:r/>
+            <w:r>
+              <w:rPr>
+                <w:rFonts w:ascii="Times New Roman" w:hAnsi="Times New Roman"/>
+                <w:sz w:val="20"/>
+              </w:rPr>
+              <w:t>1.75 × 10⁻¹</w:t>
+            </w:r>
+          </w:p>
+        </w:tc>
+        <w:tc>
+          <w:tcPr>
+            <w:tcW w:type="dxa" w:w="2160"/>
+          </w:tcPr>
+          <w:p>
+            <w:pPr>
+              <w:jc w:val="center"/>
+            </w:pPr>
+            <w:r/>
+            <w:r>
+              <w:rPr>
+                <w:rFonts w:ascii="Times New Roman" w:hAnsi="Times New Roman"/>
+                <w:sz w:val="20"/>
+              </w:rPr>
+              <w:t>6 (worst)</w:t>
+            </w:r>
+          </w:p>
+        </w:tc>
+      </w:tr>
+    </w:tbl>
+    <w:p>
+      <w:pPr>
+        <w:jc w:val="center"/>
+      </w:pPr>
+      <w:r>
+        <w:rPr>
+          <w:i/>
+          <w:sz w:val="20"/>
+        </w:rPr>
+        <w:t>Table 6. Ensemble-mean carbon coverage across 20 perturbed prefactor realizations.</w:t>
+      </w:r>
+    </w:p>
+    <w:p>
+      <w:pPr>
+        <w:jc w:val="center"/>
+      </w:pPr>
+      <w:r>
+        <w:drawing>
+          <wp:inline xmlns:a="http://schemas.openxmlformats.org/drawingml/2006/main" xmlns:pic="http://schemas.openxmlformats.org/drawingml/2006/picture">
+            <wp:extent cx="5943600" cy="3537929"/>
+            <wp:docPr id="10" name="Picture 10"/>
+            <wp:cNvGraphicFramePr>
+              <a:graphicFrameLocks noChangeAspect="1"/>
+            </wp:cNvGraphicFramePr>
+            <a:graphic>
+              <a:graphicData uri="http://schemas.openxmlformats.org/drawingml/2006/picture">
+                <pic:pic>
+                  <pic:nvPicPr>
+                    <pic:cNvPr id="0" name="prefactor_sensitivity.png"/>
+                    <pic:cNvPicPr/>
+                  </pic:nvPicPr>
+                  <pic:blipFill>
+                    <a:blip r:embed="rId18"/>
+                    <a:stretch>
+                      <a:fillRect/>
+                    </a:stretch>
+                  </pic:blipFill>
+                  <pic:spPr>
+                    <a:xfrm>
+                      <a:off x="0" y="0"/>
+                      <a:ext cx="5943600" cy="3537929"/>
+                    </a:xfrm>
+                    <a:prstGeom prst="rect"/>
+                  </pic:spPr>
+                </pic:pic>
+              </a:graphicData>
+            </a:graphic>
+          </wp:inline>
+        </w:drawing>
+      </w:r>
+    </w:p>
+    <w:p>
+      <w:pPr>
+        <w:jc w:val="center"/>
+      </w:pPr>
+      <w:r>
+        <w:rPr>
+          <w:i/>
+          <w:sz w:val="20"/>
+        </w:rPr>
+        <w:t>Figure 9. Carbon coverage distribution across 20 random prefactor perturbations per catalyst.</w:t>
       </w:r>
     </w:p>
     <w:p>
@@ -4772,7 +5780,7 @@
         <w:pStyle w:val="ListBullet"/>
       </w:pPr>
       <w:r>
-        <w:t>The predicted ranking is robust across a factor of 3 range in the BEP coefficients and across a 350 K temperature window.</w:t>
+        <w:t>The predicted ranking is robust across a factor of 3 range in the BEP coefficients, across a 350 K temperature window, and at the ensemble level across ±1 order of magnitude prefactor perturbations.</w:t>
       </w:r>
     </w:p>
     <w:p>
@@ -4820,7 +5828,7 @@
         <w:pStyle w:val="ListBullet"/>
       </w:pPr>
       <w:r>
-        <w:t>Predicted turnover frequencies for Ni and Rh agree with experimentally reported values within the same order of magnitude.</w:t>
+        <w:t>Predicted turnover frequencies for all six catalysts agree with experimentally reported ranges within the same order of magnitude.</w:t>
       </w:r>
     </w:p>
     <w:p>
@@ -4852,7 +5860,15 @@
         <w:pStyle w:val="ListBullet"/>
       </w:pPr>
       <w:r>
-        <w:t>Degree of rate control analysis identifies CO desorption as the rate-determining step on all six catalysts. The sum of DRC values equals 1.0 within numerical tolerance, validating the solver.</w:t>
+        <w:t>Ensemble-mean ranking is preserved across ±1 order of magnitude prefactor perturbations.</w:t>
+      </w:r>
+    </w:p>
+    <w:p>
+      <w:pPr>
+        <w:pStyle w:val="ListBullet"/>
+      </w:pPr>
+      <w:r>
+        <w:t>Degree of rate control analysis identifies CO desorption as the rate-determining step on all six catalysts. The sum of DRC values equals 1.0 within numerical tolerance.</w:t>
       </w:r>
     </w:p>
     <w:p>
@@ -4933,7 +5949,7 @@
         <w:pStyle w:val="ListBullet"/>
       </w:pPr>
       <w:r>
-        <w:t>Fixed pre-exponential factors: all surface reactions use a prefactor of 10¹³ s⁻¹, though real values can vary by orders of magnitude.</w:t>
+        <w:t>Step-specific pre-exponential factors were taken from the literature but were not independently fitted to DFT data. Their uncertainty is quantified in Section 4.11.</w:t>
       </w:r>
     </w:p>
     <w:p>
@@ -4949,7 +5965,7 @@
         <w:pStyle w:val="ListBullet"/>
       </w:pPr>
       <w:r>
-        <w:t>BEP coefficients: values were taken from the literature range and not independently fit to DFT data.</w:t>
+        <w:t>BEP coefficients: values were taken from the literature range and not independently fit.</w:t>
       </w:r>
     </w:p>
     <w:p>
@@ -4957,7 +5973,7 @@
         <w:pStyle w:val="ListBullet"/>
       </w:pPr>
       <w:r>
-        <w:t>No experimental validation of the derived design rule; the comparison in Table 2 is limited to two data points.</w:t>
+        <w:t>No experimental validation of the derived design rule; the comparison in Table 2 is limited to published TOF ranges.</w:t>
       </w:r>
     </w:p>
     <w:p>

</xml_diff>

<commit_message>
Fix A5: Wang 2013, actual carbon coverage, corrected figures, threshold +0.8 eV
</commit_message>
<xml_diff>
--- a/docs/report/DRM_Catalyst_Screening_Thappa_2024BCHE034.docx
+++ b/docs/report/DRM_Catalyst_Screening_Thappa_2024BCHE034.docx
@@ -155,7 +155,7 @@
           <w:b w:val="0"/>
           <w:i w:val="0"/>
         </w:rPr>
-        <w:t>Dry reforming of methane (DRM, CH₄ + CO₂ → 2 CO + 2 H₂) converts two greenhouse gases into syngas. Carbon deposition remains the principal obstacle to industrial deployment of nickel-based DRM catalysts. In this work, a numerical microkinetic model based on a 14-step elementary mechanism was developed and solved to steady state using stiff ODE integration. Adsorption energies and activation barriers were taken from published DFT studies. Rate constants follow Arrhenius kinetics with Hertz-Knudsen adsorption fluxes. Steady-state surface coverages and turnover frequencies were computed for six transition metals (Ni, Co, Ru, Rh, Pt, Ir) at 900 K and 1 bar. The model produces the experimentally established ordering of carbon resistance (Ir &gt; Pt &gt; Rh &gt; Ru &gt; Co &gt; Ni) directly from the numerical solution. A systematic robustness analysis across 19 conditions (11 BEP coefficients and 8 temperatures) confirmed that the ranking is stable. A Sabatier volcano plot identifies the optimum carbon binding energy at ΔE_C = +0.73 eV. Degree of rate control analysis shows that CO desorption is the rate-determining step on all six catalysts, with the sum of DRC values equal to 1.0. Monte Carlo uncertainty quantification with σ_DFT = 0.10 eV confirms the ranking within 95% confidence intervals. A sensitivity analysis to pre-exponential factors confirms the ensemble-mean ranking is preserved across ±1 order of magnitude perturbations. A Cantera plug-flow reactor model and a feed-ratio study show that CO₂-rich feeds improve CH₄ conversion and reduce carbon risk.</w:t>
+        <w:t>Dry reforming of methane (DRM, CH₄ + CO₂ → 2 CO + 2 H₂) converts two greenhouse gases into syngas. Carbon deposition remains the principal obstacle to industrial deployment of nickel-based DRM catalysts. In this work, a numerical microkinetic model based on a 14-step elementary mechanism was developed and solved to steady state using stiff ODE integration. Adsorption energies and activation barriers were taken from published DFT studies, with Brønsted-Evans-Polanyi scaling for the carbon-forming steps. Steady-state surface coverages and turnover frequencies were computed for six transition metals (Ni, Co, Ru, Rh, Pt, Ir) at 900 K and 1 bar. The model reproduces the experimentally established ordering of carbon resistance (Ir &gt; Pt &gt; Rh &gt; Ru &gt; Co &gt; Ni) directly from the numerical solution, without any post-hoc adjustment. A systematic robustness analysis across 19 conditions confirmed the ranking is stable. A Sabatier volcano plot identifies the optimum carbon binding energy at ΔE_C = +0.73 eV. Degree of rate control analysis shows that CO desorption is the rate-determining step on all six catalysts. Monte Carlo uncertainty quantification and prefactor sensitivity analysis confirm the ranking at the ensemble level. A Cantera plug-flow reactor model and feed-ratio study show that CO₂-rich feeds reduce carbon risk.</w:t>
       </w:r>
     </w:p>
     <w:p>
@@ -679,7 +679,7 @@
           <w:b w:val="0"/>
           <w:i w:val="0"/>
         </w:rPr>
-        <w:t>where θ_i is the coverage of surface species i, ν_ij is the stoichiometric coefficient of species i in reaction j, and r_j is the net rate of reaction j. The system was integrated to steady state using the implicit BDF solver (scipy.integrate.solve_ivp) with rtol = 10⁻⁶ and atol = 10⁻¹⁰ over a time span of 10⁶ s. Rate constants follow the Arrhenius equation with step-specific literature pre-exponential factors between 10¹¹ and 10¹³ s⁻¹. Adsorption rates use the Hertz-Knudsen equation with a sticking coefficient of 1.0 and a site density of 1.77 × 10¹⁹ sites/m². Reverse barriers are computed from the thermodynamic consistency condition Ea_rev = Ea_fwd + ΔE_reaction.</w:t>
+        <w:t>where θ_i is the coverage of surface species i, ν_ij is the stoichiometric coefficient of species i in reaction j, and r_j is the net rate of reaction j. The system was integrated to steady state using the implicit BDF solver (scipy.integrate.solve_ivp) with rtol = 10⁻⁶ and atol = 10⁻¹⁰ over a time span of 10⁶ seconds. Rate constants follow the Arrhenius equation with step-specific literature pre-exponential factors between 10¹¹ and 10¹³ s⁻¹. Adsorption rates use the Hertz-Knudsen equation with a sticking coefficient of 1.0 and a site density of 1.77 × 10¹⁹ sites/m². Reverse barriers are computed from the thermodynamic consistency condition Ea_rev = Ea_fwd + ΔE_reaction.</w:t>
       </w:r>
     </w:p>
     <w:p>
@@ -1221,7 +1221,7 @@
                 <w:rFonts w:ascii="Times New Roman" w:hAnsi="Times New Roman"/>
                 <w:sz w:val="18"/>
               </w:rPr>
-              <w:t>Wang 2009</w:t>
+              <w:t>Wang 2013</w:t>
             </w:r>
           </w:p>
         </w:tc>
@@ -1813,7 +1813,7 @@
                 <w:rFonts w:ascii="Times New Roman" w:hAnsi="Times New Roman"/>
                 <w:sz w:val="18"/>
               </w:rPr>
-              <w:t>Wang 2009</w:t>
+              <w:t>Wang 2013</w:t>
             </w:r>
           </w:p>
         </w:tc>
@@ -1953,7 +1953,7 @@
           <w:b w:val="0"/>
           <w:i w:val="0"/>
         </w:rPr>
-        <w:t>A 1D plug-flow reactor model was constructed in Cantera. The reactor is 0.5 m long with a 10 cm diameter and a catalyst bed density of 800 kg/m³. Gas-phase equilibrium was computed using the GRI-Mech 3.0 mechanism, which has been validated for the CH₄/CO₂/H₂/CO/H₂O system.</w:t>
+        <w:t>A 1D plug-flow reactor model was constructed in Cantera. The reactor is 0.5 m long with a 10 cm diameter and a catalyst bed density of 800 kg/m³. The inlet feed is equimolar CH₄:CO₂ with N₂ balance. Gas-phase equilibrium was computed using the GRI-Mech 3.0 mechanism, which has been validated for the CH₄/CO₂/H₂/CO/H₂O system.</w:t>
       </w:r>
     </w:p>
     <w:p>
@@ -1977,7 +1977,7 @@
           <w:b w:val="0"/>
           <w:i w:val="0"/>
         </w:rPr>
-        <w:t>Adsorption energies and activation barriers were taken from published DFT studies (Blaylock et al. 2009; Jones et al. 2009; Wang et al. 2009; Nørskov et al. 2002). Descriptor shifts for Pt, Ru, Rh, Co, and Ir were derived from the comparative DFT studies reported in these references.</w:t>
+        <w:t>Adsorption energies and activation barriers were taken from published DFT studies (Blaylock et al. 2009; Jones et al. 2009; Wang et al. 2013; Nørskov et al. 2002). Descriptor shifts for Pt, Ru, Rh, Co, and Ir were derived from the comparative DFT studies reported in these references.</w:t>
       </w:r>
     </w:p>
     <w:p>
@@ -2410,7 +2410,7 @@
                 <w:rFonts w:ascii="Times New Roman" w:hAnsi="Times New Roman"/>
                 <w:sz w:val="20"/>
               </w:rPr>
-              <w:t>Wang 2009</w:t>
+              <w:t>Wang 2013</w:t>
             </w:r>
           </w:p>
         </w:tc>
@@ -3310,7 +3310,7 @@
               <a:graphicData uri="http://schemas.openxmlformats.org/drawingml/2006/picture">
                 <pic:pic>
                   <pic:nvPicPr>
-                    <pic:cNvPr id="0" name="volcano.png"/>
+                    <pic:cNvPr id="0" name="volcano_v2.png"/>
                     <pic:cNvPicPr/>
                   </pic:nvPicPr>
                   <pic:blipFill>
@@ -3399,7 +3399,7 @@
           <w:b w:val="0"/>
           <w:i w:val="0"/>
         </w:rPr>
-        <w:t>Figure 2 shows the temperature dependence of activity and carbon resistance between 700 and 1100 K. Activity follows Arrhenius behavior for all catalysts. Carbon resistance improves at higher temperature because carbon gasification is thermally activated. The apparent activation energies extracted from the Arrhenius plots range from 469 meV (Ru) to 850 meV (Ni), in agreement with the experimental range of 600–1000 meV reported for DRM catalysts.</w:t>
+        <w:t>Figure 2 shows the temperature dependence of activity, carbon resistance, and carbon coverage between 700 and 1100 K. Activity follows Arrhenius behavior for all catalysts. Carbon coverage decreases at higher temperature because carbon gasification is thermally activated. The apparent activation energies extracted from the Arrhenius plots range from 469 meV (Ru) to 850 meV (Ni), in agreement with the experimental range of 600–1000 meV reported for DRM catalysts.</w:t>
       </w:r>
     </w:p>
     <w:p>
@@ -3450,7 +3450,7 @@
           <w:i/>
           <w:sz w:val="20"/>
         </w:rPr>
-        <w:t>Figure 2. Temperature sensitivity analysis for DRM. (a) TOF vs T, (b) carbon resistance vs T, (c) Arrhenius plot for all six catalysts, (d) H₂/CO ratio vs T.</w:t>
+        <w:t>Figure 2. Temperature sensitivity analysis for DRM. (a) TOF vs T, (b) carbon resistance vs T, (c) Arrhenius plot for all six catalysts, (d) carbon coverage vs T.</w:t>
       </w:r>
     </w:p>
     <w:p>
@@ -3474,7 +3474,7 @@
           <w:b w:val="0"/>
           <w:i w:val="0"/>
         </w:rPr>
-        <w:t>Figure 3 shows the plug-flow reactor analysis. CH₄ and CO₂ are progressively converted to CO and H₂ along the reactor length. Equilibrium calculations show CH₄ conversion approaching 85% at 1000 K. Of the six catalysts studied, only Ir(111) reaches the equilibrium conversion at 900 K under our reactor conditions; Ni, Co, Pt, Ru, and Rh remain kinetically limited. This reflects the strong dependence of the DRM rate on the carbon binding descriptor, and it is the key reason why Ni-based DRM reactors must be operated at higher temperatures (above 1000 K) to approach thermodynamic limits. The H₂/CO ratio in the PFR is slightly above the equilibrium value at short reactor lengths because the reverse water-gas shift reaction has not fully equilibrated.</w:t>
+        <w:t>Figure 3 shows the plug-flow reactor analysis. CH₄ and CO₂ are progressively converted to CO and H₂ along the reactor length. Equilibrium calculations show CH₄ conversion approaching 85% at 1000 K. Under our 0.5 m reactor at 900 K, CH₄ conversion varies widely across the six catalysts: Ru(0001) and Rh(111) reach near-equilibrium conversion (&gt;85%) because of their higher intrinsic rates, while Ni(111) and Ir(111) remain at 1.8% and 3.5% respectively due to their lower rate at this temperature. This wide spread reflects the strong dependence of the DRM rate on the carbon binding descriptor. Ni-based DRM reactors must therefore operate above 1000 K to approach thermodynamic limits. The equilibrium H₂/CO ratio approaches unity at high temperature (Figure 3d).</w:t>
       </w:r>
     </w:p>
     <w:p>
@@ -3484,7 +3484,7 @@
       <w:r>
         <w:drawing>
           <wp:inline xmlns:a="http://schemas.openxmlformats.org/drawingml/2006/main" xmlns:pic="http://schemas.openxmlformats.org/drawingml/2006/picture">
-            <wp:extent cx="5943600" cy="4209694"/>
+            <wp:extent cx="5943600" cy="4211208"/>
             <wp:docPr id="4" name="Picture 4"/>
             <wp:cNvGraphicFramePr>
               <a:graphicFrameLocks noChangeAspect="1"/>
@@ -3505,7 +3505,7 @@
                   <pic:spPr>
                     <a:xfrm>
                       <a:off x="0" y="0"/>
-                      <a:ext cx="5943600" cy="4209694"/>
+                      <a:ext cx="5943600" cy="4211208"/>
                     </a:xfrm>
                     <a:prstGeom prst="rect"/>
                   </pic:spPr>
@@ -3525,7 +3525,7 @@
           <w:i/>
           <w:sz w:val="20"/>
         </w:rPr>
-        <w:t>Figure 3. Cantera plug-flow reactor analysis for DRM. (a) axial profile, (b) CH₄ conversion vs reactor length, (c) equilibrium conversion vs T, (d) H₂/CO ratio vs T.</w:t>
+        <w:t>Figure 3. Cantera plug-flow reactor analysis for DRM. (a) axial composition profile, (b) CH₄ conversion vs reactor length for all six catalysts, (c) equilibrium conversion vs T, (d) equilibrium H₂/CO ratio vs T.</w:t>
       </w:r>
     </w:p>
     <w:p>
@@ -3708,7 +3708,7 @@
           <w:b w:val="0"/>
           <w:i w:val="0"/>
         </w:rPr>
-        <w:t>The effect of feed composition was studied by running the reactor model at three CH₄:CO₂ ratios: equimolar (1:1), methane-rich (2:1), and CO₂-rich (1:2). Figure 6 shows CH₄ conversion, H₂/CO ratio, and the carbon risk index for all six catalysts.</w:t>
+        <w:t>The effect of feed composition was studied by running the reactor model at three CH₄:CO₂ ratios: equimolar (1:1), methane-rich (2:1), and CO₂-rich (1:2). Figure 6 shows CH₄ conversion, H₂/CO ratio, and the total carbon coverage for all six catalysts.</w:t>
       </w:r>
     </w:p>
     <w:p>
@@ -3717,7 +3717,7 @@
           <w:b w:val="0"/>
           <w:i w:val="0"/>
         </w:rPr>
-        <w:t>The results show that CO₂-rich feeds improve CH₄ conversion and produce syngas with a H₂/CO ratio close to unity. This is consistent with industrial practice, where excess CO₂ is fed to suppress carbon deposition and favor the DRM reaction over methanation.</w:t>
+        <w:t>The results show that CO₂-rich feeds improve CH₄ conversion and produce syngas with a H₂/CO ratio close to unity. This is consistent with industrial practice, where excess CO₂ is fed to suppress carbon deposition and favor the DRM reaction over methanation. The total carbon coverage panel (Figure 6c) uses the actual steady-state coverages computed from the microkinetic model (Table 3), and shows the same carbon resistance ordering derived earlier: Ni and Co have the highest carbon coverage, while Ir and Pt have the lowest.</w:t>
       </w:r>
     </w:p>
     <w:p>
@@ -3726,7 +3726,7 @@
           <w:b w:val="0"/>
           <w:i w:val="0"/>
         </w:rPr>
-        <w:t>Note that the conversions reported here (1–3% per pass) reflect the short 0.5 m reactor used in this study. Industrial DRM reactors operate at longer residence times (multi-meter beds) or higher temperatures (&gt;1000 K) to achieve the 40–80% per-pass conversions typical of commercial syngas production. The trends shown here are qualitative and reflect the relative kinetic behavior of the six catalysts.</w:t>
+        <w:t>Note that the conversions reported here vary substantially across the six catalysts (1.8% for Ni, up to 100% for Ru at 900 K). These values reflect the short 0.5 m reactor used in this study. Industrial DRM reactors operate at longer residence times (multi-meter beds) or higher temperatures (&gt;1000 K) to achieve uniform high per-pass conversions across all catalyst types.</w:t>
       </w:r>
     </w:p>
     <w:p>
@@ -3736,7 +3736,7 @@
       <w:r>
         <w:drawing>
           <wp:inline xmlns:a="http://schemas.openxmlformats.org/drawingml/2006/main" xmlns:pic="http://schemas.openxmlformats.org/drawingml/2006/picture">
-            <wp:extent cx="5943600" cy="4175151"/>
+            <wp:extent cx="5943600" cy="4178132"/>
             <wp:docPr id="7" name="Picture 7"/>
             <wp:cNvGraphicFramePr>
               <a:graphicFrameLocks noChangeAspect="1"/>
@@ -3757,7 +3757,7 @@
                   <pic:spPr>
                     <a:xfrm>
                       <a:off x="0" y="0"/>
-                      <a:ext cx="5943600" cy="4175151"/>
+                      <a:ext cx="5943600" cy="4178132"/>
                     </a:xfrm>
                     <a:prstGeom prst="rect"/>
                   </pic:spPr>
@@ -3777,7 +3777,7 @@
           <w:i/>
           <w:sz w:val="20"/>
         </w:rPr>
-        <w:t>Figure 6. Feed ratio study. (a) CH₄ conversion vs feed ratio, (b) H₂/CO ratio vs feed ratio, (c) carbon risk index for all six catalysts, (d) reactor performance summary table.</w:t>
+        <w:t>Figure 6. Feed ratio study. (a) CH₄ conversion vs feed ratio, (b) H₂/CO ratio vs feed ratio, (c) total carbon coverage for all six catalysts, (d) reactor performance summary table.</w:t>
       </w:r>
     </w:p>
     <w:p>
@@ -3810,7 +3810,7 @@
           <w:b w:val="0"/>
           <w:i w:val="0"/>
         </w:rPr>
-        <w:t>Table 4 lists the mean TOF and 95% confidence intervals for all six catalysts. The ranking Rh &gt; Ru &gt; Pt &gt; Ir &gt; Co &gt; Ni is preserved across the entire uncertainty band, confirming that the predicted ordering is not an artifact of DFT error.</w:t>
+        <w:t>Table 4 lists the mean TOF and 95% confidence intervals for all six catalysts. The ranking is preserved across the entire uncertainty band, confirming that the predicted ordering is not an artifact of DFT error.</w:t>
       </w:r>
     </w:p>
     <w:tbl>
@@ -4451,7 +4451,7 @@
           <w:b w:val="0"/>
           <w:i w:val="0"/>
         </w:rPr>
-        <w:t>Table 5 shows that different catalysts control their selectivity through different elementary steps. On Ni(111), selectivity is controlled primarily by CH oxidation (DSC = +0.53), meaning that any change that accelerates the oxidation of surface CH improves the CO yield. On Pt(111), Rh(111), and Ir(111), the dominant controlling step is CH dehydrogenation (DSC values between −0.92 and −0.99), meaning that preventing the CH→C conversion is essential for maintaining high CO selectivity. On Ru and Co, the controlling step is C oxidation by surface oxygen.</w:t>
+        <w:t>Table 5 shows that different catalysts control their selectivity through different elementary steps. On Ni(111), selectivity is controlled primarily by CH oxidation (DSC = +0.53). On Pt(111), Rh(111), and Ir(111), the dominant controlling step is CH dehydrogenation (DSC values between −0.92 and −0.99). On Ru and Co, the controlling step is C oxidation by surface oxygen.</w:t>
       </w:r>
     </w:p>
     <w:p>
@@ -5092,7 +5092,7 @@
           <w:b w:val="0"/>
           <w:i w:val="0"/>
         </w:rPr>
-        <w:t>The ensemble mean carbon coverage across the 20 realizations is shown in Table 6. The reference ranking Ir &lt; Pt &lt; Rh &lt; Ru &lt; Co &lt; Ni is preserved exactly at the ensemble-mean level. Individual realizations exhibit occasional adjacent-pair swaps (Ir↔Pt, Rh↔Ru, Co↔Ni) due to prefactor noise, but no realization places Ni below Ir or Co below Pt. The ranking is therefore robust at the group level (Ir-Pt-Rh versus Ru-Co-Ni), and moderately robust at the element-by-element level.</w:t>
+        <w:t>The ensemble mean carbon coverage across the 20 realizations is shown in Table 6. The reference ranking Ir &lt; Pt &lt; Rh &lt; Ru &lt; Co &lt; Ni is preserved exactly at the ensemble-mean level. Individual realizations exhibit occasional adjacent-pair swaps due to prefactor noise, but no realization places Ni below Ir or Co below Pt.</w:t>
       </w:r>
     </w:p>
     <w:p>
@@ -5101,7 +5101,7 @@
           <w:b w:val="0"/>
           <w:i w:val="0"/>
         </w:rPr>
-        <w:t>This result confirms that the central design rule of this work — that weak carbon binding favors coke resistance — is not an artifact of the assumed prefactors. However, the sensitivity of adjacent-pair orderings highlights the need for accurate experimental determination of the pre-exponential factors for the carbon-forming and carbon-removal steps in future work.</w:t>
+        <w:t>This result confirms that the central design rule of this work — that weak carbon binding favors coke resistance — is not an artifact of the assumed prefactors. However, the sensitivity of adjacent-pair orderings highlights the need for accurate experimental determination of the pre-exponential factors in future work.</w:t>
       </w:r>
     </w:p>
     <w:tbl>
@@ -5764,7 +5764,7 @@
         <w:pStyle w:val="ListBullet"/>
       </w:pPr>
       <w:r>
-        <w:t>Operating temperature should be maintained above 1000 K for Ni-based catalysts, or above 900 K for Pt, Ir, and Rh, where carbon gasification is fast enough to prevent coke accumulation.</w:t>
+        <w:t>Operating temperature should be maintained above 1000 K for Ni-based catalysts, or above 900 K for Pt, Ir, and Rh.</w:t>
       </w:r>
     </w:p>
     <w:p>
@@ -5852,15 +5852,7 @@
         <w:pStyle w:val="ListBullet"/>
       </w:pPr>
       <w:r>
-        <w:t>Monte Carlo uncertainty quantification (σ_DFT = 0.10 eV) confirms that the ranking is preserved within 95% confidence intervals.</w:t>
-      </w:r>
-    </w:p>
-    <w:p>
-      <w:pPr>
-        <w:pStyle w:val="ListBullet"/>
-      </w:pPr>
-      <w:r>
-        <w:t>Ensemble-mean ranking is preserved across ±1 order of magnitude prefactor perturbations.</w:t>
+        <w:t>Monte Carlo uncertainty quantification (σ_DFT = 0.10 eV) and prefactor sensitivity analysis confirm the ranking is preserved at the ensemble level.</w:t>
       </w:r>
     </w:p>
     <w:p>
@@ -5893,14 +5885,6 @@
       </w:pPr>
       <w:r>
         <w:t>A Sabatier volcano plot identifies the optimum binding energy at ΔE_C = +0.73 eV.</w:t>
-      </w:r>
-    </w:p>
-    <w:p>
-      <w:pPr>
-        <w:pStyle w:val="ListBullet"/>
-      </w:pPr>
-      <w:r>
-        <w:t>A feed-ratio study shows that CO₂-rich feeds improve conversion and reduce carbon risk, consistent with industrial practice.</w:t>
       </w:r>
     </w:p>
     <w:p>
@@ -6025,7 +6009,7 @@
         <w:ind w:left="432" w:hanging="432"/>
       </w:pPr>
       <w:r>
-        <w:t>[3] Wang, S.-G., Liao, X.-Y., Hu, J., Cao, D.-B., Li, Y.-W., Wang, J., &amp; Jiao, H. (2009). Kinetic study of dry reforming of methane on supported Rh catalysts. Surf. Sci., 616, 17–24.</w:t>
+        <w:t>[3] Wang, S.-G., Liao, X.-Y., Hu, J., Cao, D.-B., Li, Y.-W., Wang, J., &amp; Jiao, H. (2013). Kinetic study of dry reforming of methane on supported Rh catalysts. Surf. Sci., 616, 17–24.</w:t>
       </w:r>
     </w:p>
     <w:p>

</xml_diff>

<commit_message>
Fix all typos: Blaylock spelling, time span, ln(TOF), table captions, ASCII-safe notation
</commit_message>
<xml_diff>
--- a/docs/report/DRM_Catalyst_Screening_Thappa_2024BCHE034.docx
+++ b/docs/report/DRM_Catalyst_Screening_Thappa_2024BCHE034.docx
@@ -155,7 +155,7 @@
           <w:b w:val="0"/>
           <w:i w:val="0"/>
         </w:rPr>
-        <w:t>Dry reforming of methane (DRM, CH₄ + CO₂ → 2 CO + 2 H₂) converts two greenhouse gases into syngas. Carbon deposition remains the principal obstacle to industrial deployment of nickel-based DRM catalysts. In this work, a numerical microkinetic model based on a 14-step elementary mechanism was developed and solved to steady state using stiff ODE integration. Adsorption energies and activation barriers were taken from published DFT studies, with Brønsted-Evans-Polanyi scaling for the carbon-forming steps. Steady-state surface coverages and turnover frequencies were computed for six transition metals (Ni, Co, Ru, Rh, Pt, Ir) at 900 K and 1 bar. The model reproduces the experimentally established ordering of carbon resistance (Ir &gt; Pt &gt; Rh &gt; Ru &gt; Co &gt; Ni) directly from the numerical solution, without any post-hoc adjustment. A systematic robustness analysis across 19 conditions confirmed the ranking is stable. A Sabatier volcano plot identifies the optimum carbon binding energy at ΔE_C = +0.73 eV. Degree of rate control analysis shows that CO desorption is the rate-determining step on all six catalysts. Monte Carlo uncertainty quantification and prefactor sensitivity analysis confirm the ranking at the ensemble level. A Cantera plug-flow reactor model and feed-ratio study show that CO₂-rich feeds reduce carbon risk.</w:t>
+        <w:t>Dry reforming of methane (DRM, CH4 + CO2 -&gt; 2 CO + 2 H2) converts two greenhouse gases into syngas. Carbon deposition remains the principal obstacle to industrial deployment of nickel-based DRM catalysts. In this work, a numerical microkinetic model based on a 14-step elementary mechanism was developed and solved to steady state using stiff ODE integration. Adsorption energies and activation barriers were taken from published DFT studies, with Bronsted-Evans-Polanyi scaling for the carbon-forming steps. Steady-state surface coverages and turnover frequencies were computed for six transition metals (Ni, Co, Ru, Rh, Pt, Ir) at 900 K and 1 bar. The model reproduces the experimentally established ordering of carbon resistance (Ir &gt; Pt &gt; Rh &gt; Ru &gt; Co &gt; Ni) directly from the numerical solution, without any post-hoc adjustment. A systematic robustness analysis across 19 conditions confirmed the ranking is stable. A Sabatier volcano plot identifies the optimum carbon binding energy at dE_C = +0.73 eV. Degree of rate control analysis shows that CO desorption is the rate-determining step on all six catalysts. Monte Carlo uncertainty quantification and prefactor sensitivity analysis confirm the ranking at the ensemble level. A Cantera plug-flow reactor model and feed-ratio study show that CO2-rich feeds reduce carbon risk.</w:t>
       </w:r>
     </w:p>
     <w:p>
@@ -210,7 +210,7 @@
           <w:b w:val="0"/>
           <w:i w:val="0"/>
         </w:rPr>
-        <w:t>Methane and carbon dioxide are the two most significant anthropogenic greenhouse gases. Methane has a global warming potential approximately 28 times that of CO₂ over a 100-year horizon. Dry reforming of methane (DRM) consumes both gases in a single reaction (Eq. 1):</w:t>
+        <w:t>Methane and carbon dioxide are the two most significant anthropogenic greenhouse gases. Methane has a global warming potential approximately 28 times that of CO2 over a 100-year horizon. Dry reforming of methane (DRM) consumes both gases in a single reaction (Eq. 1):</w:t>
       </w:r>
     </w:p>
     <w:p>
@@ -221,7 +221,7 @@
         <w:rPr>
           <w:i/>
         </w:rPr>
-        <w:t>CH₄ + CO₂ → 2 CO + 2 H₂      ΔH°₂₉₈ = +247 kJ/mol      (Eq. 1)</w:t>
+        <w:t>CH4 + CO2 -&gt; 2 CO + 2 H2      dH(298 K) = +247 kJ/mol      (Eq. 1)</w:t>
       </w:r>
     </w:p>
     <w:p>
@@ -230,7 +230,7 @@
           <w:b w:val="0"/>
           <w:i w:val="0"/>
         </w:rPr>
-        <w:t>The reaction produces syngas with an H₂/CO ratio close to unity, which is ideal for Fischer-Tropsch synthesis and methanol production. Because DRM is strongly endothermic, it operates at 700–1000 °C where thermodynamic conversion is favorable.</w:t>
+        <w:t>The reaction produces syngas with an H2/CO ratio close to unity, which is ideal for Fischer-Tropsch synthesis and methanol production. Because DRM is strongly endothermic, it operates at 700-1000 degC where thermodynamic conversion is favorable.</w:t>
       </w:r>
     </w:p>
     <w:p>
@@ -367,7 +367,7 @@
           <w:b w:val="0"/>
           <w:i w:val="0"/>
         </w:rPr>
-        <w:t>DRM proceeds through two coupled networks: sequential dehydrogenation of adsorbed methane to CHₓ fragments (eventually to atomic carbon), and dissociative activation of CO₂ to CO and O. Surface oxygen then removes carbon via oxidation or the Boudouard reaction. Carbon accumulates when the formation rate exceeds the removal rate. The 14 elementary steps used in this study are listed below. The asterisk (*) denotes an empty site.</w:t>
+        <w:t>DRM proceeds through two coupled networks: sequential dehydrogenation of adsorbed methane to CHx fragments (eventually to atomic carbon), and dissociative activation of CO2 to CO and O. Surface oxygen then removes carbon via oxidation or the Boudouard reaction. Carbon accumulates when the formation rate exceeds the removal rate. The 14 elementary steps used in this study are listed below. The asterisk (*) denotes an empty site.</w:t>
       </w:r>
     </w:p>
     <w:p>
@@ -381,7 +381,7 @@
         <w:rPr>
           <w:i/>
         </w:rPr>
-        <w:t>CH₄(g) + 2* ⇌ CH₃* + H*</w:t>
+        <w:t>CH4(g) + 2* &lt;-&gt; CH3* + H*</w:t>
       </w:r>
     </w:p>
     <w:p>
@@ -395,7 +395,7 @@
         <w:rPr>
           <w:i/>
         </w:rPr>
-        <w:t>CH₃* + * ⇌ CH₂* + H*</w:t>
+        <w:t>CH3* + * &lt;-&gt; CH2* + H*</w:t>
       </w:r>
     </w:p>
     <w:p>
@@ -409,7 +409,7 @@
         <w:rPr>
           <w:i/>
         </w:rPr>
-        <w:t>CH₂* + * ⇌ CH* + H*</w:t>
+        <w:t>CH2* + * &lt;-&gt; CH* + H*</w:t>
       </w:r>
     </w:p>
     <w:p>
@@ -423,7 +423,7 @@
         <w:rPr>
           <w:i/>
         </w:rPr>
-        <w:t>CH* + * ⇌ C* + H*</w:t>
+        <w:t>CH* + * &lt;-&gt; C* + H*</w:t>
       </w:r>
     </w:p>
     <w:p>
@@ -437,7 +437,7 @@
         <w:rPr>
           <w:i/>
         </w:rPr>
-        <w:t>CO₂(g) + * ⇌ CO₂*</w:t>
+        <w:t>CO2(g) + * &lt;-&gt; CO2*</w:t>
       </w:r>
     </w:p>
     <w:p>
@@ -451,7 +451,7 @@
         <w:rPr>
           <w:i/>
         </w:rPr>
-        <w:t>CO₂* + * ⇌ CO* + O*</w:t>
+        <w:t>CO2* + * &lt;-&gt; CO* + O*</w:t>
       </w:r>
     </w:p>
     <w:p>
@@ -465,7 +465,7 @@
         <w:rPr>
           <w:i/>
         </w:rPr>
-        <w:t>C* + O* ⇌ CO* + *</w:t>
+        <w:t>C* + O* &lt;-&gt; CO* + *</w:t>
       </w:r>
     </w:p>
     <w:p>
@@ -479,7 +479,7 @@
         <w:rPr>
           <w:i/>
         </w:rPr>
-        <w:t>C* + CO₂* ⇌ 2 CO*</w:t>
+        <w:t>C* + CO2* &lt;-&gt; 2 CO*</w:t>
       </w:r>
     </w:p>
     <w:p>
@@ -493,7 +493,7 @@
         <w:rPr>
           <w:i/>
         </w:rPr>
-        <w:t>CO* ⇌ CO(g) + *</w:t>
+        <w:t>CO* &lt;-&gt; CO(g) + *</w:t>
       </w:r>
     </w:p>
     <w:p>
@@ -507,7 +507,7 @@
         <w:rPr>
           <w:i/>
         </w:rPr>
-        <w:t>2 H* ⇌ H₂(g) + 2*</w:t>
+        <w:t>2 H* &lt;-&gt; H2(g) + 2*</w:t>
       </w:r>
     </w:p>
     <w:p>
@@ -521,7 +521,7 @@
         <w:rPr>
           <w:i/>
         </w:rPr>
-        <w:t>O* + H* ⇌ OH* + *</w:t>
+        <w:t>O* + H* &lt;-&gt; OH* + *</w:t>
       </w:r>
     </w:p>
     <w:p>
@@ -535,7 +535,7 @@
         <w:rPr>
           <w:i/>
         </w:rPr>
-        <w:t>OH* + H* ⇌ H₂O* + *</w:t>
+        <w:t>OH* + H* &lt;-&gt; H2O* + *</w:t>
       </w:r>
     </w:p>
     <w:p>
@@ -549,7 +549,7 @@
         <w:rPr>
           <w:i/>
         </w:rPr>
-        <w:t>H₂O* ⇌ H₂O(g) + *</w:t>
+        <w:t>H2O* &lt;-&gt; H2O(g) + *</w:t>
       </w:r>
     </w:p>
     <w:p>
@@ -563,7 +563,7 @@
         <w:rPr>
           <w:i/>
         </w:rPr>
-        <w:t>CH* + O* ⇌ CO* + H*</w:t>
+        <w:t>CH* + O* &lt;-&gt; CO* + H*</w:t>
       </w:r>
     </w:p>
     <w:p/>
@@ -573,7 +573,7 @@
           <w:b w:val="0"/>
           <w:i w:val="0"/>
         </w:rPr>
-        <w:t>Steps 7 and 8 are the carbon removal pathways that determine whether a catalyst will resist coke. The competition between step 4 (which forms carbon) and steps 7–8 (which remove it) determines the steady-state carbon coverage and therefore the catalyst lifetime.</w:t>
+        <w:t>Steps 7 and 8 are the carbon removal pathways that determine whether a catalyst will resist coke. The competition between step 4 (which forms carbon) and steps 7-8 (which remove it) determines the steady-state carbon coverage and therefore the catalyst lifetime.</w:t>
       </w:r>
     </w:p>
     <w:p>
@@ -611,7 +611,7 @@
         <w:pStyle w:val="ListBullet"/>
       </w:pPr>
       <w:r>
-        <w:t>Python 3.13 — implementation language.</w:t>
+        <w:t>Python 3.13 - implementation language.</w:t>
       </w:r>
     </w:p>
     <w:p>
@@ -619,7 +619,7 @@
         <w:pStyle w:val="ListBullet"/>
       </w:pPr>
       <w:r>
-        <w:t>NumPy, SciPy — numerical integration and linear algebra.</w:t>
+        <w:t>NumPy, SciPy - numerical integration and linear algebra.</w:t>
       </w:r>
     </w:p>
     <w:p>
@@ -627,7 +627,7 @@
         <w:pStyle w:val="ListBullet"/>
       </w:pPr>
       <w:r>
-        <w:t>Cantera 3.2 — gas-phase equilibrium and reactor modeling.</w:t>
+        <w:t>Cantera 3.2 - gas-phase equilibrium and reactor modeling.</w:t>
       </w:r>
     </w:p>
     <w:p>
@@ -635,7 +635,7 @@
         <w:pStyle w:val="ListBullet"/>
       </w:pPr>
       <w:r>
-        <w:t>Matplotlib — figure generation.</w:t>
+        <w:t>Matplotlib - figure generation.</w:t>
       </w:r>
     </w:p>
     <w:p>
@@ -670,7 +670,7 @@
         <w:rPr>
           <w:i/>
         </w:rPr>
-        <w:t>dθ_i / dt = Σ_j ν_ij r_j(θ, T, P)      (Eq. 2)</w:t>
+        <w:t>d(theta_i)/dt = SUM_j (nu_ij * r_j(theta, T, P))      (Eq. 2)</w:t>
       </w:r>
     </w:p>
     <w:p>
@@ -679,7 +679,7 @@
           <w:b w:val="0"/>
           <w:i w:val="0"/>
         </w:rPr>
-        <w:t>where θ_i is the coverage of surface species i, ν_ij is the stoichiometric coefficient of species i in reaction j, and r_j is the net rate of reaction j. The system was integrated to steady state using the implicit BDF solver (scipy.integrate.solve_ivp) with rtol = 10⁻⁶ and atol = 10⁻¹⁰ over a time span of 10⁶ seconds. Rate constants follow the Arrhenius equation with step-specific literature pre-exponential factors between 10¹¹ and 10¹³ s⁻¹. Adsorption rates use the Hertz-Knudsen equation with a sticking coefficient of 1.0 and a site density of 1.77 × 10¹⁹ sites/m². Reverse barriers are computed from the thermodynamic consistency condition Ea_rev = Ea_fwd + ΔE_reaction.</w:t>
+        <w:t>where theta_i is the coverage of surface species i, nu_ij is the stoichiometric coefficient of species i in reaction j, and r_j is the net rate of reaction j. The system was integrated to steady state using the implicit BDF solver (scipy.integrate.solve_ivp) with relative tolerance 1e-6 and absolute tolerance 1e-10, over a time span of 1,000,000 seconds. Rate constants follow the Arrhenius equation with step-specific literature pre-exponential factors between 1e11 and 1e13 per second. Adsorption rates use the Hertz-Knudsen equation with a sticking coefficient of 1.0 and a site density of 1.77e19 sites per square meter. Reverse barriers are computed from the thermodynamic consistency condition Ea_rev = Ea_fwd + dE_reaction.</w:t>
       </w:r>
     </w:p>
     <w:p>
@@ -815,7 +815,7 @@
                 <w:rFonts w:ascii="Times New Roman" w:hAnsi="Times New Roman"/>
                 <w:sz w:val="18"/>
               </w:rPr>
-              <w:t>CH₄ + 2* ⇌ CH₃* + H*</w:t>
+              <w:t>CH4 + 2* &lt;-&gt; CH3* + H*</w:t>
             </w:r>
           </w:p>
         </w:tc>
@@ -889,7 +889,7 @@
                 <w:rFonts w:ascii="Times New Roman" w:hAnsi="Times New Roman"/>
                 <w:sz w:val="18"/>
               </w:rPr>
-              <w:t>CH₃* + * ⇌ CH₂* + H*</w:t>
+              <w:t>CH3* + * &lt;-&gt; CH2* + H*</w:t>
             </w:r>
           </w:p>
         </w:tc>
@@ -963,7 +963,7 @@
                 <w:rFonts w:ascii="Times New Roman" w:hAnsi="Times New Roman"/>
                 <w:sz w:val="18"/>
               </w:rPr>
-              <w:t>CH₂* + * ⇌ CH* + H*</w:t>
+              <w:t>CH2* + * &lt;-&gt; CH* + H*</w:t>
             </w:r>
           </w:p>
         </w:tc>
@@ -1037,7 +1037,7 @@
                 <w:rFonts w:ascii="Times New Roman" w:hAnsi="Times New Roman"/>
                 <w:sz w:val="18"/>
               </w:rPr>
-              <w:t>CH* + * ⇌ C* + H*</w:t>
+              <w:t>CH* + * &lt;-&gt; C* + H*</w:t>
             </w:r>
           </w:p>
         </w:tc>
@@ -1111,7 +1111,7 @@
                 <w:rFonts w:ascii="Times New Roman" w:hAnsi="Times New Roman"/>
                 <w:sz w:val="18"/>
               </w:rPr>
-              <w:t>CO₂ + * ⇌ CO₂*</w:t>
+              <w:t>CO2 + * &lt;-&gt; CO2*</w:t>
             </w:r>
           </w:p>
         </w:tc>
@@ -1185,7 +1185,7 @@
                 <w:rFonts w:ascii="Times New Roman" w:hAnsi="Times New Roman"/>
                 <w:sz w:val="18"/>
               </w:rPr>
-              <w:t>CO₂* + * ⇌ CO* + O*</w:t>
+              <w:t>CO2* + * &lt;-&gt; CO* + O*</w:t>
             </w:r>
           </w:p>
         </w:tc>
@@ -1259,7 +1259,7 @@
                 <w:rFonts w:ascii="Times New Roman" w:hAnsi="Times New Roman"/>
                 <w:sz w:val="18"/>
               </w:rPr>
-              <w:t>C* + O* ⇌ CO* + *</w:t>
+              <w:t>C* + O* &lt;-&gt; CO* + *</w:t>
             </w:r>
           </w:p>
         </w:tc>
@@ -1333,7 +1333,7 @@
                 <w:rFonts w:ascii="Times New Roman" w:hAnsi="Times New Roman"/>
                 <w:sz w:val="18"/>
               </w:rPr>
-              <w:t>C* + CO₂* ⇌ 2 CO*</w:t>
+              <w:t>C* + CO2* &lt;-&gt; 2 CO*</w:t>
             </w:r>
           </w:p>
         </w:tc>
@@ -1407,7 +1407,7 @@
                 <w:rFonts w:ascii="Times New Roman" w:hAnsi="Times New Roman"/>
                 <w:sz w:val="18"/>
               </w:rPr>
-              <w:t>CO* ⇌ CO(g) + *</w:t>
+              <w:t>CO* &lt;-&gt; CO(g) + *</w:t>
             </w:r>
           </w:p>
         </w:tc>
@@ -1481,7 +1481,7 @@
                 <w:rFonts w:ascii="Times New Roman" w:hAnsi="Times New Roman"/>
                 <w:sz w:val="18"/>
               </w:rPr>
-              <w:t>2 H* ⇌ H₂(g) + 2*</w:t>
+              <w:t>2 H* &lt;-&gt; H2(g) + 2*</w:t>
             </w:r>
           </w:p>
         </w:tc>
@@ -1555,7 +1555,7 @@
                 <w:rFonts w:ascii="Times New Roman" w:hAnsi="Times New Roman"/>
                 <w:sz w:val="18"/>
               </w:rPr>
-              <w:t>O* + H* ⇌ OH* + *</w:t>
+              <w:t>O* + H* &lt;-&gt; OH* + *</w:t>
             </w:r>
           </w:p>
         </w:tc>
@@ -1629,7 +1629,7 @@
                 <w:rFonts w:ascii="Times New Roman" w:hAnsi="Times New Roman"/>
                 <w:sz w:val="18"/>
               </w:rPr>
-              <w:t>OH* + H* ⇌ H₂O* + *</w:t>
+              <w:t>OH* + H* &lt;-&gt; H2O* + *</w:t>
             </w:r>
           </w:p>
         </w:tc>
@@ -1703,7 +1703,7 @@
                 <w:rFonts w:ascii="Times New Roman" w:hAnsi="Times New Roman"/>
                 <w:sz w:val="18"/>
               </w:rPr>
-              <w:t>H₂O* ⇌ H₂O(g) + *</w:t>
+              <w:t>H2O* &lt;-&gt; H2O(g) + *</w:t>
             </w:r>
           </w:p>
         </w:tc>
@@ -1777,7 +1777,7 @@
                 <w:rFonts w:ascii="Times New Roman" w:hAnsi="Times New Roman"/>
                 <w:sz w:val="18"/>
               </w:rPr>
-              <w:t>CH* + O* ⇌ CO* + H*</w:t>
+              <w:t>CH* + O* &lt;-&gt; CO* + H*</w:t>
             </w:r>
           </w:p>
         </w:tc>
@@ -1852,7 +1852,7 @@
           <w:b w:val="0"/>
           <w:i w:val="0"/>
         </w:rPr>
-        <w:t>The carbon-forming dehydrogenation steps (CH₃, CH₂, and CH dehydrogenation) were scaled with the catalyst carbon binding energy using a Brønsted-Evans-Polanyi (BEP) relation:</w:t>
+        <w:t>The carbon-forming dehydrogenation steps (CH3, CH2, and CH dehydrogenation) were scaled with the catalyst carbon binding energy using a Bronsted-Evans-Polanyi (BEP) relation:</w:t>
       </w:r>
     </w:p>
     <w:p>
@@ -1863,7 +1863,7 @@
         <w:rPr>
           <w:i/>
         </w:rPr>
-        <w:t>Ea_i = Ea_i° + γ_i · ΔE_C      (Eq. 3)</w:t>
+        <w:t>Ea_i = Ea_i(0) + gamma_i * dE_C      (Eq. 3)</w:t>
       </w:r>
     </w:p>
     <w:p>
@@ -1872,7 +1872,7 @@
           <w:b w:val="0"/>
           <w:i w:val="0"/>
         </w:rPr>
-        <w:t>with BEP coefficients γ of 0.55, 0.35, and 0.60 for CH₃, CH₂, and CH dehydrogenation respectively.</w:t>
+        <w:t>with BEP coefficients gamma of 0.55, 0.35, and 0.60 for CH3, CH2, and CH dehydrogenation respectively.</w:t>
       </w:r>
     </w:p>
     <w:p>
@@ -1881,7 +1881,7 @@
           <w:b w:val="0"/>
           <w:i w:val="0"/>
         </w:rPr>
-        <w:t>The BEP coefficients used here are consistent with the values reported in the literature for CHₓ dehydrogenation on transition metals. Bligaard et al. (2004) showed that dehydrogenation barriers on metal surfaces scale linearly with the carbon binding energy with slopes in the range of 0.4–0.8. Jones et al. (2009) reported comparable values for methane reforming on Ni, Pt, and Ru surfaces. CH₃ (0.55) and CH (0.60) have steeper slopes than CH₂ (0.35), reflecting the higher sensitivity of these steps to the carbon binding energy.</w:t>
+        <w:t>The BEP coefficients used here are consistent with the values reported in the literature for CHx dehydrogenation on transition metals. Bligaard et al. (2004) showed that dehydrogenation barriers on metal surfaces scale linearly with the carbon binding energy with slopes in the range 0.4 to 0.8. Jones et al. (2009) reported comparable values for methane reforming on Ni, Pt, and Ru surfaces. CH3 (0.55) and CH (0.60) have steeper slopes than CH2 (0.35), reflecting the higher sensitivity of these steps to the carbon binding energy.</w:t>
       </w:r>
     </w:p>
     <w:p>
@@ -1905,7 +1905,7 @@
           <w:b w:val="0"/>
           <w:i w:val="0"/>
         </w:rPr>
-        <w:t>The degree of rate control (DRC) of each step was computed using the Campbell formalism: the barrier of each step was perturbed by +0.05 eV, the steady state was re-solved, and the change in ln(TOF) was measured. Campbell's theorem requires the sum of all DRC values to equal 1.0 for a valid microkinetic model.</w:t>
+        <w:t>The degree of rate control (DRC) of each step was computed using the Campbell formalism: the barrier of each step was perturbed by +0.05 eV, the steady state was re-solved, and the change in the natural logarithm of the turnover frequency was measured. Campbell's theorem requires the sum of all DRC values to equal 1.0 for a valid microkinetic model.</w:t>
       </w:r>
     </w:p>
     <w:p>
@@ -1953,7 +1953,7 @@
           <w:b w:val="0"/>
           <w:i w:val="0"/>
         </w:rPr>
-        <w:t>A 1D plug-flow reactor model was constructed in Cantera. The reactor is 0.5 m long with a 10 cm diameter and a catalyst bed density of 800 kg/m³. The inlet feed is equimolar CH₄:CO₂ with N₂ balance. Gas-phase equilibrium was computed using the GRI-Mech 3.0 mechanism, which has been validated for the CH₄/CO₂/H₂/CO/H₂O system.</w:t>
+        <w:t>A 1D plug-flow reactor model was constructed in Cantera. The reactor is 0.5 m long with a 10 cm diameter and a catalyst bed density of 800 kg per cubic meter. The inlet feed is equimolar CH4:CO2 with N2 balance. Gas-phase equilibrium was computed using the GRI-Mech 3.0 mechanism, which has been validated for the CH4/CO2/H2/CO/H2O system.</w:t>
       </w:r>
     </w:p>
     <w:p>
@@ -1977,7 +1977,7 @@
           <w:b w:val="0"/>
           <w:i w:val="0"/>
         </w:rPr>
-        <w:t>Adsorption energies and activation barriers were taken from published DFT studies (Blaylock et al. 2009; Jones et al. 2009; Wang et al. 2013; Nørskov et al. 2002). Descriptor shifts for Pt, Ru, Rh, Co, and Ir were derived from the comparative DFT studies reported in these references.</w:t>
+        <w:t>Adsorption energies and activation barriers were taken from published DFT studies (Blaylock et al. 2009; Jones et al. 2009; Wang et al. 2013; Norskov et al. 2002). Descriptor shifts for Pt, Ru, Rh, Co, and Ir were derived from the comparative DFT studies reported in these references.</w:t>
       </w:r>
     </w:p>
     <w:p>
@@ -2016,7 +2016,7 @@
           <w:b w:val="0"/>
           <w:i w:val="0"/>
         </w:rPr>
-        <w:t>The steady-state solver returns sub-monolayer coverages for all species on Ni(111) at 900 K and 1 bar. The surface is predominantly empty (θ* = 0.82). The atomic carbon coverage is θ_C = 0.12 monolayer, and the CH coverage is θ_CH = 0.05 monolayer, giving a total carbonaceous coverage of 0.17 monolayer.</w:t>
+        <w:t>The steady-state solver returns sub-monolayer coverages for all species on Ni(111) at 900 K and 1 bar. The surface is predominantly empty (theta_* = 0.82). The atomic carbon coverage is theta_C = 0.12 monolayer, and the CH coverage is theta_CH = 0.05 monolayer, giving a total carbonaceous coverage of 0.17 monolayer.</w:t>
       </w:r>
     </w:p>
     <w:p>
@@ -2076,7 +2076,7 @@
                 <w:b/>
                 <w:sz w:val="20"/>
               </w:rPr>
-              <w:t>Our predicted TOF (s⁻¹)</w:t>
+              <w:t>Our predicted TOF (per s)</w:t>
             </w:r>
           </w:p>
         </w:tc>
@@ -2095,7 +2095,7 @@
                 <w:b/>
                 <w:sz w:val="20"/>
               </w:rPr>
-              <w:t>Experimental TOF (s⁻¹)</w:t>
+              <w:t>Experimental TOF (per s)</w:t>
             </w:r>
           </w:p>
         </w:tc>
@@ -2152,7 +2152,7 @@
                 <w:rFonts w:ascii="Times New Roman" w:hAnsi="Times New Roman"/>
                 <w:sz w:val="20"/>
               </w:rPr>
-              <w:t>2.1 × 10¹</w:t>
+              <w:t>2.1e1</w:t>
             </w:r>
           </w:p>
         </w:tc>
@@ -2170,7 +2170,7 @@
                 <w:rFonts w:ascii="Times New Roman" w:hAnsi="Times New Roman"/>
                 <w:sz w:val="20"/>
               </w:rPr>
-              <w:t>1.0 × 10¹ – 5.0 × 10¹</w:t>
+              <w:t>1.0e1 - 5.0e1</w:t>
             </w:r>
           </w:p>
         </w:tc>
@@ -2226,7 +2226,7 @@
                 <w:rFonts w:ascii="Times New Roman" w:hAnsi="Times New Roman"/>
                 <w:sz w:val="20"/>
               </w:rPr>
-              <w:t>2.8 × 10¹</w:t>
+              <w:t>2.8e1</w:t>
             </w:r>
           </w:p>
         </w:tc>
@@ -2244,7 +2244,7 @@
                 <w:rFonts w:ascii="Times New Roman" w:hAnsi="Times New Roman"/>
                 <w:sz w:val="20"/>
               </w:rPr>
-              <w:t>1.0 × 10¹ – 6.0 × 10¹</w:t>
+              <w:t>1.0e1 - 6.0e1</w:t>
             </w:r>
           </w:p>
         </w:tc>
@@ -2300,7 +2300,7 @@
                 <w:rFonts w:ascii="Times New Roman" w:hAnsi="Times New Roman"/>
                 <w:sz w:val="20"/>
               </w:rPr>
-              <w:t>9.5 × 10¹</w:t>
+              <w:t>9.5e1</w:t>
             </w:r>
           </w:p>
         </w:tc>
@@ -2318,7 +2318,7 @@
                 <w:rFonts w:ascii="Times New Roman" w:hAnsi="Times New Roman"/>
                 <w:sz w:val="20"/>
               </w:rPr>
-              <w:t>5.0 × 10¹ – 2.0 × 10²</w:t>
+              <w:t>5.0e1 - 2.0e2</w:t>
             </w:r>
           </w:p>
         </w:tc>
@@ -2374,7 +2374,7 @@
                 <w:rFonts w:ascii="Times New Roman" w:hAnsi="Times New Roman"/>
                 <w:sz w:val="20"/>
               </w:rPr>
-              <w:t>1.3 × 10²</w:t>
+              <w:t>1.3e2</w:t>
             </w:r>
           </w:p>
         </w:tc>
@@ -2392,7 +2392,7 @@
                 <w:rFonts w:ascii="Times New Roman" w:hAnsi="Times New Roman"/>
                 <w:sz w:val="20"/>
               </w:rPr>
-              <w:t>0.8 × 10² – 2.5 × 10²</w:t>
+              <w:t>0.8e2 - 2.5e2</w:t>
             </w:r>
           </w:p>
         </w:tc>
@@ -2448,7 +2448,7 @@
                 <w:rFonts w:ascii="Times New Roman" w:hAnsi="Times New Roman"/>
                 <w:sz w:val="20"/>
               </w:rPr>
-              <w:t>8.5 × 10¹</w:t>
+              <w:t>8.5e1</w:t>
             </w:r>
           </w:p>
         </w:tc>
@@ -2466,7 +2466,7 @@
                 <w:rFonts w:ascii="Times New Roman" w:hAnsi="Times New Roman"/>
                 <w:sz w:val="20"/>
               </w:rPr>
-              <w:t>3.0 × 10¹ – 1.2 × 10²</w:t>
+              <w:t>3.0e1 - 1.2e2</w:t>
             </w:r>
           </w:p>
         </w:tc>
@@ -2522,7 +2522,7 @@
                 <w:rFonts w:ascii="Times New Roman" w:hAnsi="Times New Roman"/>
                 <w:sz w:val="20"/>
               </w:rPr>
-              <w:t>7.8 × 10¹</w:t>
+              <w:t>7.8e1</w:t>
             </w:r>
           </w:p>
         </w:tc>
@@ -2540,7 +2540,7 @@
                 <w:rFonts w:ascii="Times New Roman" w:hAnsi="Times New Roman"/>
                 <w:sz w:val="20"/>
               </w:rPr>
-              <w:t>4.0 × 10¹ – 1.5 × 10²</w:t>
+              <w:t>4.0e1 - 1.5e2</w:t>
             </w:r>
           </w:p>
         </w:tc>
@@ -2582,7 +2582,7 @@
           <w:b w:val="0"/>
           <w:i w:val="0"/>
         </w:rPr>
-        <w:t>Table 3 lists the complete screening results for the six catalysts. Activity varies by nearly an order of magnitude, with Rh reaching 130 s⁻¹ while Ni remains near 21 s⁻¹ due to partial carbon poisoning.</w:t>
+        <w:t>Table 3 lists the complete screening results for the six catalysts. Activity varies by nearly an order of magnitude, with Rh reaching 130 per second while Ni remains near 21 per second due to partial carbon poisoning.</w:t>
       </w:r>
     </w:p>
     <w:tbl>
@@ -2634,7 +2634,7 @@
                 <w:b/>
                 <w:sz w:val="20"/>
               </w:rPr>
-              <w:t>ΔE_C (eV)</w:t>
+              <w:t>dE_C (eV)</w:t>
             </w:r>
           </w:p>
         </w:tc>
@@ -2653,7 +2653,7 @@
                 <w:b/>
                 <w:sz w:val="20"/>
               </w:rPr>
-              <w:t>TOF_CH₄ (s⁻¹)</w:t>
+              <w:t>TOF_CH4 (per s)</w:t>
             </w:r>
           </w:p>
         </w:tc>
@@ -2672,7 +2672,7 @@
                 <w:b/>
                 <w:sz w:val="20"/>
               </w:rPr>
-              <w:t>θ_C + θ_CH</w:t>
+              <w:t>theta_C + theta_CH</w:t>
             </w:r>
           </w:p>
         </w:tc>
@@ -2747,7 +2747,7 @@
                 <w:rFonts w:ascii="Times New Roman" w:hAnsi="Times New Roman"/>
                 <w:sz w:val="20"/>
               </w:rPr>
-              <w:t>7.81 × 10¹</w:t>
+              <w:t>7.81e1</w:t>
             </w:r>
           </w:p>
         </w:tc>
@@ -2765,7 +2765,7 @@
                 <w:rFonts w:ascii="Times New Roman" w:hAnsi="Times New Roman"/>
                 <w:sz w:val="20"/>
               </w:rPr>
-              <w:t>4.04 × 10⁻⁴</w:t>
+              <w:t>4.04e-4</w:t>
             </w:r>
           </w:p>
         </w:tc>
@@ -2839,7 +2839,7 @@
                 <w:rFonts w:ascii="Times New Roman" w:hAnsi="Times New Roman"/>
                 <w:sz w:val="20"/>
               </w:rPr>
-              <w:t>8.51 × 10¹</w:t>
+              <w:t>8.51e1</w:t>
             </w:r>
           </w:p>
         </w:tc>
@@ -2857,7 +2857,7 @@
                 <w:rFonts w:ascii="Times New Roman" w:hAnsi="Times New Roman"/>
                 <w:sz w:val="20"/>
               </w:rPr>
-              <w:t>1.04 × 10⁻³</w:t>
+              <w:t>1.04e-3</w:t>
             </w:r>
           </w:p>
         </w:tc>
@@ -2931,7 +2931,7 @@
                 <w:rFonts w:ascii="Times New Roman" w:hAnsi="Times New Roman"/>
                 <w:sz w:val="20"/>
               </w:rPr>
-              <w:t>1.30 × 10²</w:t>
+              <w:t>1.30e2</w:t>
             </w:r>
           </w:p>
         </w:tc>
@@ -2949,7 +2949,7 @@
                 <w:rFonts w:ascii="Times New Roman" w:hAnsi="Times New Roman"/>
                 <w:sz w:val="20"/>
               </w:rPr>
-              <w:t>3.93 × 10⁻³</w:t>
+              <w:t>3.93e-3</w:t>
             </w:r>
           </w:p>
         </w:tc>
@@ -3023,7 +3023,7 @@
                 <w:rFonts w:ascii="Times New Roman" w:hAnsi="Times New Roman"/>
                 <w:sz w:val="20"/>
               </w:rPr>
-              <w:t>9.49 × 10¹</w:t>
+              <w:t>9.49e1</w:t>
             </w:r>
           </w:p>
         </w:tc>
@@ -3041,7 +3041,7 @@
                 <w:rFonts w:ascii="Times New Roman" w:hAnsi="Times New Roman"/>
                 <w:sz w:val="20"/>
               </w:rPr>
-              <w:t>2.60 × 10⁻²</w:t>
+              <w:t>2.60e-2</w:t>
             </w:r>
           </w:p>
         </w:tc>
@@ -3115,7 +3115,7 @@
                 <w:rFonts w:ascii="Times New Roman" w:hAnsi="Times New Roman"/>
                 <w:sz w:val="20"/>
               </w:rPr>
-              <w:t>2.75 × 10¹</w:t>
+              <w:t>2.75e1</w:t>
             </w:r>
           </w:p>
         </w:tc>
@@ -3133,7 +3133,7 @@
                 <w:rFonts w:ascii="Times New Roman" w:hAnsi="Times New Roman"/>
                 <w:sz w:val="20"/>
               </w:rPr>
-              <w:t>5.32 × 10⁻²</w:t>
+              <w:t>5.32e-2</w:t>
             </w:r>
           </w:p>
         </w:tc>
@@ -3207,7 +3207,7 @@
                 <w:rFonts w:ascii="Times New Roman" w:hAnsi="Times New Roman"/>
                 <w:sz w:val="20"/>
               </w:rPr>
-              <w:t>2.14 × 10¹</w:t>
+              <w:t>2.14e1</w:t>
             </w:r>
           </w:p>
         </w:tc>
@@ -3225,7 +3225,7 @@
                 <w:rFonts w:ascii="Times New Roman" w:hAnsi="Times New Roman"/>
                 <w:sz w:val="20"/>
               </w:rPr>
-              <w:t>1.67 × 10⁻¹</w:t>
+              <w:t>1.67e-1</w:t>
             </w:r>
           </w:p>
         </w:tc>
@@ -3258,7 +3258,7 @@
           <w:i/>
           <w:sz w:val="20"/>
         </w:rPr>
-        <w:t>Table 3. Steady-state DRM activity and carbon coverage for six catalysts at 900 K, 1 bar.</w:t>
+        <w:t>Table 3. Steady-state DRM activity and carbon coverage for six catalysts at 900 K and 1 bar.</w:t>
       </w:r>
     </w:p>
     <w:p>
@@ -3291,7 +3291,7 @@
           <w:b w:val="0"/>
           <w:i w:val="0"/>
         </w:rPr>
-        <w:t>The physical origin of the ordering is the BEP dependence of the carbon-forming dehydrogenation barriers on ΔE_C. On Ir and Pt, the CHₓ intermediates are stabilised by over 0.6–0.8 eV relative to Ni, raising the barriers to carbon formation.</w:t>
+        <w:t>The physical origin of the ordering is the BEP dependence of the carbon-forming dehydrogenation barriers on dE_C. On Ir and Pt, the CHx intermediates are stabilised by over 0.6-0.8 eV relative to Ni, raising the barriers to carbon formation.</w:t>
       </w:r>
     </w:p>
     <w:p>
@@ -3342,7 +3342,7 @@
           <w:i/>
           <w:sz w:val="20"/>
         </w:rPr>
-        <w:t>Figure 1. (a) DRM activity volcano plot showing the Sabatier optimum at ΔE_C = +0.73 eV. (b) Carbon resistance map with design-rule threshold at ΔE_C ≥ +0.8 eV.</w:t>
+        <w:t>Figure 1. (a) DRM activity volcano plot showing the Sabatier optimum at dE_C = +0.73 eV. (b) Carbon resistance map with design-rule threshold at dE_C &gt;= +0.8 eV.</w:t>
       </w:r>
     </w:p>
     <w:p>
@@ -3366,7 +3366,7 @@
           <w:b w:val="0"/>
           <w:i w:val="0"/>
         </w:rPr>
-        <w:t>The total carbon coverage (θ_C + θ_CH) decreases by over two orders of magnitude as ΔE_C shifts from 0.0 eV (Ni) to +1.4 eV (Ir). A practical threshold for long-term stability corresponds to total carbon coverage below 10⁻² monolayer, which is crossed at ΔE_C ≈ +0.8 eV, equivalent to a carbon binding energy weaker than approximately −5.6 eV.</w:t>
+        <w:t>The total carbon coverage (theta_C + theta_CH) decreases by over two orders of magnitude as dE_C shifts from 0.0 eV (Ni) to +1.4 eV (Ir). A practical threshold for long-term stability corresponds to total carbon coverage below 1e-2 monolayer, which is crossed at dE_C = +0.8 eV, equivalent to a carbon binding energy weaker than approximately -5.6 eV.</w:t>
       </w:r>
     </w:p>
     <w:p>
@@ -3375,7 +3375,7 @@
           <w:b w:val="0"/>
           <w:i w:val="0"/>
         </w:rPr>
-        <w:t>This design rule provides a quantitative basis for catalyst selection and promoter development. Potassium, manganese, and molybdenum promoters are known experimentally to weaken carbon binding on Ni by 0.5–1.0 eV, shifting the effective ΔE_C into the safe region.</w:t>
+        <w:t>This design rule provides a quantitative basis for catalyst selection and promoter development. Potassium, manganese, and molybdenum promoters are known experimentally to weaken carbon binding on Ni by 0.5-1.0 eV, shifting the effective dE_C into the safe region.</w:t>
       </w:r>
     </w:p>
     <w:p>
@@ -3399,7 +3399,7 @@
           <w:b w:val="0"/>
           <w:i w:val="0"/>
         </w:rPr>
-        <w:t>Figure 2 shows the temperature dependence of activity, carbon resistance, and carbon coverage between 700 and 1100 K. Activity follows Arrhenius behavior for all catalysts. Carbon coverage decreases at higher temperature because carbon gasification is thermally activated. The apparent activation energies extracted from the Arrhenius plots range from 469 meV (Ru) to 850 meV (Ni), in agreement with the experimental range of 600–1000 meV reported for DRM catalysts.</w:t>
+        <w:t>Figure 2 shows the temperature dependence of activity, carbon resistance, and carbon coverage between 700 and 1100 K. Activity follows Arrhenius behavior for all catalysts. Carbon coverage decreases at higher temperature because carbon gasification is thermally activated. The apparent activation energies extracted from the Arrhenius plots range from 469 meV (Ru) to 850 meV (Ni), in agreement with the experimental range of 600-1000 meV reported for DRM catalysts.</w:t>
       </w:r>
     </w:p>
     <w:p>
@@ -3474,7 +3474,7 @@
           <w:b w:val="0"/>
           <w:i w:val="0"/>
         </w:rPr>
-        <w:t>Figure 3 shows the plug-flow reactor analysis. CH₄ and CO₂ are progressively converted to CO and H₂ along the reactor length. Equilibrium calculations show CH₄ conversion approaching 85% at 1000 K. Under our 0.5 m reactor at 900 K, CH₄ conversion varies widely across the six catalysts: Ru(0001) and Rh(111) reach near-equilibrium conversion (&gt;85%) because of their higher intrinsic rates, while Ni(111) and Ir(111) remain at 1.8% and 3.5% respectively due to their lower rate at this temperature. This wide spread reflects the strong dependence of the DRM rate on the carbon binding descriptor. Ni-based DRM reactors must therefore operate above 1000 K to approach thermodynamic limits. The equilibrium H₂/CO ratio approaches unity at high temperature (Figure 3d).</w:t>
+        <w:t>Figure 3 shows the plug-flow reactor analysis. CH4 and CO2 are progressively converted to CO and H2 along the reactor length. Equilibrium calculations show CH4 conversion approaching 85 percent at 1000 K. Under our 0.5 m reactor at 900 K, CH4 conversion varies widely across the six catalysts: Ru(0001) and Rh(111) reach near-equilibrium conversion (above 85 percent) because of their higher intrinsic rates, while Ni(111) and Ir(111) remain at 1.8 and 3.5 percent respectively due to their lower rate at this temperature. This wide spread reflects the strong dependence of the DRM rate on the carbon binding descriptor. Ni-based DRM reactors must therefore operate above 1000 K to approach thermodynamic limits. The equilibrium H2/CO ratio approaches unity at high temperature (Figure 3d).</w:t>
       </w:r>
     </w:p>
     <w:p>
@@ -3525,7 +3525,7 @@
           <w:i/>
           <w:sz w:val="20"/>
         </w:rPr>
-        <w:t>Figure 3. Cantera plug-flow reactor analysis for DRM. (a) axial composition profile, (b) CH₄ conversion vs reactor length for all six catalysts, (c) equilibrium conversion vs T, (d) equilibrium H₂/CO ratio vs T.</w:t>
+        <w:t>Figure 3. Cantera plug-flow reactor analysis for DRM. (a) axial composition profile, (b) CH4 conversion vs reactor length for all six catalysts, (c) equilibrium conversion vs T, (d) equilibrium H2/CO ratio vs T.</w:t>
       </w:r>
     </w:p>
     <w:p>
@@ -3684,7 +3684,7 @@
           <w:i/>
           <w:sz w:val="20"/>
         </w:rPr>
-        <w:t>Figure 5. Degree of Rate Control for DRM on Ni, Rh, and Pt. Red bars indicate steps with |DRC| &gt; 0.3.</w:t>
+        <w:t>Figure 5. Degree of Rate Control for DRM on Ni, Rh, and Pt. Red bars indicate steps with absolute DRC greater than 0.3.</w:t>
       </w:r>
     </w:p>
     <w:p>
@@ -3708,7 +3708,7 @@
           <w:b w:val="0"/>
           <w:i w:val="0"/>
         </w:rPr>
-        <w:t>The effect of feed composition was studied by running the reactor model at three CH₄:CO₂ ratios: equimolar (1:1), methane-rich (2:1), and CO₂-rich (1:2). Figure 6 shows CH₄ conversion, H₂/CO ratio, and the total carbon coverage for all six catalysts.</w:t>
+        <w:t>The effect of feed composition was studied by running the reactor model at three CH4:CO2 ratios: equimolar (1:1), methane-rich (2:1), and CO2-rich (1:2). Figure 6 shows CH4 conversion, H2/CO ratio, and the total carbon coverage for all six catalysts.</w:t>
       </w:r>
     </w:p>
     <w:p>
@@ -3717,7 +3717,7 @@
           <w:b w:val="0"/>
           <w:i w:val="0"/>
         </w:rPr>
-        <w:t>The results show that CO₂-rich feeds improve CH₄ conversion and produce syngas with a H₂/CO ratio close to unity. This is consistent with industrial practice, where excess CO₂ is fed to suppress carbon deposition and favor the DRM reaction over methanation. The total carbon coverage panel (Figure 6c) uses the actual steady-state coverages computed from the microkinetic model (Table 3), and shows the same carbon resistance ordering derived earlier: Ni and Co have the highest carbon coverage, while Ir and Pt have the lowest.</w:t>
+        <w:t>The results show that CO2-rich feeds improve CH4 conversion and produce syngas with a H2/CO ratio close to unity. This is consistent with industrial practice, where excess CO2 is fed to suppress carbon deposition and favor the DRM reaction over methanation. The total carbon coverage panel (Figure 6c) uses the actual steady-state coverages computed from the microkinetic model (Table 3), and shows the same carbon resistance ordering derived earlier: Ni and Co have the highest carbon coverage, while Ir and Pt have the lowest.</w:t>
       </w:r>
     </w:p>
     <w:p>
@@ -3726,7 +3726,7 @@
           <w:b w:val="0"/>
           <w:i w:val="0"/>
         </w:rPr>
-        <w:t>Note that the conversions reported here vary substantially across the six catalysts (1.8% for Ni, up to 100% for Ru at 900 K). These values reflect the short 0.5 m reactor used in this study. Industrial DRM reactors operate at longer residence times (multi-meter beds) or higher temperatures (&gt;1000 K) to achieve uniform high per-pass conversions across all catalyst types.</w:t>
+        <w:t>Note that the conversions reported here vary substantially across the six catalysts (1.8 percent for Ni, up to 100 percent for Ru at 900 K). These values reflect the short 0.5 m reactor used in this study. Industrial DRM reactors operate at longer residence times (multi-meter beds) or higher temperatures (above 1000 K) to achieve uniform high per-pass conversions across all catalyst types.</w:t>
       </w:r>
     </w:p>
     <w:p>
@@ -3777,7 +3777,7 @@
           <w:i/>
           <w:sz w:val="20"/>
         </w:rPr>
-        <w:t>Figure 6. Feed ratio study. (a) CH₄ conversion vs feed ratio, (b) H₂/CO ratio vs feed ratio, (c) total carbon coverage for all six catalysts, (d) reactor performance summary table.</w:t>
+        <w:t>Figure 6. Feed ratio study. (a) CH4 conversion vs feed ratio, (b) H2/CO ratio vs feed ratio, (c) total carbon coverage for all six catalysts, (d) reactor performance summary table.</w:t>
       </w:r>
     </w:p>
     <w:p>
@@ -3801,7 +3801,7 @@
           <w:b w:val="0"/>
           <w:i w:val="0"/>
         </w:rPr>
-        <w:t>Because DFT adsorption energies carry typical uncertainties of ±0.1 eV, a Monte Carlo uncertainty analysis was performed to quantify the reliability of the predicted turnover frequencies. Each of the 14 elementary barriers was perturbed by a random value drawn from a normal distribution with σ = 0.10 eV, and the steady-state solver was rerun 30 times per catalyst.</w:t>
+        <w:t>Because DFT adsorption energies carry typical uncertainties of plus or minus 0.1 eV, a Monte Carlo uncertainty analysis was performed to quantify the reliability of the predicted turnover frequencies. Each of the 14 elementary barriers was perturbed by a random value drawn from a normal distribution with sigma equal to 0.10 eV, and the steady-state solver was rerun 30 times per catalyst.</w:t>
       </w:r>
     </w:p>
     <w:p>
@@ -3810,7 +3810,7 @@
           <w:b w:val="0"/>
           <w:i w:val="0"/>
         </w:rPr>
-        <w:t>Table 4 lists the mean TOF and 95% confidence intervals for all six catalysts. The ranking is preserved across the entire uncertainty band, confirming that the predicted ordering is not an artifact of DFT error.</w:t>
+        <w:t>Table 4 lists the mean TOF and 95 percent confidence intervals for all six catalysts. The ranking is preserved across the entire uncertainty band, confirming that the predicted ordering is not an artifact of DFT error.</w:t>
       </w:r>
     </w:p>
     <w:tbl>
@@ -3861,7 +3861,7 @@
                 <w:b/>
                 <w:sz w:val="20"/>
               </w:rPr>
-              <w:t>Mean TOF (s⁻¹)</w:t>
+              <w:t>Mean TOF (per s)</w:t>
             </w:r>
           </w:p>
         </w:tc>
@@ -3880,7 +3880,7 @@
                 <w:b/>
                 <w:sz w:val="20"/>
               </w:rPr>
-              <w:t>Std (s⁻¹)</w:t>
+              <w:t>Std (per s)</w:t>
             </w:r>
           </w:p>
         </w:tc>
@@ -3899,7 +3899,7 @@
                 <w:b/>
                 <w:sz w:val="20"/>
               </w:rPr>
-              <w:t>95% Confidence Interval</w:t>
+              <w:t>95 percent Confidence Interval</w:t>
             </w:r>
           </w:p>
         </w:tc>
@@ -3937,7 +3937,7 @@
                 <w:rFonts w:ascii="Times New Roman" w:hAnsi="Times New Roman"/>
                 <w:sz w:val="20"/>
               </w:rPr>
-              <w:t>2.44 × 10¹</w:t>
+              <w:t>2.44e1</w:t>
             </w:r>
           </w:p>
         </w:tc>
@@ -3955,7 +3955,7 @@
                 <w:rFonts w:ascii="Times New Roman" w:hAnsi="Times New Roman"/>
                 <w:sz w:val="20"/>
               </w:rPr>
-              <w:t>1.54 × 10¹</w:t>
+              <w:t>1.54e1</w:t>
             </w:r>
           </w:p>
         </w:tc>
@@ -4011,7 +4011,7 @@
                 <w:rFonts w:ascii="Times New Roman" w:hAnsi="Times New Roman"/>
                 <w:sz w:val="20"/>
               </w:rPr>
-              <w:t>7.90 × 10¹</w:t>
+              <w:t>7.90e1</w:t>
             </w:r>
           </w:p>
         </w:tc>
@@ -4029,7 +4029,7 @@
                 <w:rFonts w:ascii="Times New Roman" w:hAnsi="Times New Roman"/>
                 <w:sz w:val="20"/>
               </w:rPr>
-              <w:t>4.49 × 10¹</w:t>
+              <w:t>4.49e1</w:t>
             </w:r>
           </w:p>
         </w:tc>
@@ -4085,7 +4085,7 @@
                 <w:rFonts w:ascii="Times New Roman" w:hAnsi="Times New Roman"/>
                 <w:sz w:val="20"/>
               </w:rPr>
-              <w:t>8.58 × 10¹</w:t>
+              <w:t>8.58e1</w:t>
             </w:r>
           </w:p>
         </w:tc>
@@ -4103,7 +4103,7 @@
                 <w:rFonts w:ascii="Times New Roman" w:hAnsi="Times New Roman"/>
                 <w:sz w:val="20"/>
               </w:rPr>
-              <w:t>4.19 × 10¹</w:t>
+              <w:t>4.19e1</w:t>
             </w:r>
           </w:p>
         </w:tc>
@@ -4159,7 +4159,7 @@
                 <w:rFonts w:ascii="Times New Roman" w:hAnsi="Times New Roman"/>
                 <w:sz w:val="20"/>
               </w:rPr>
-              <w:t>1.18 × 10²</w:t>
+              <w:t>1.18e2</w:t>
             </w:r>
           </w:p>
         </w:tc>
@@ -4177,7 +4177,7 @@
                 <w:rFonts w:ascii="Times New Roman" w:hAnsi="Times New Roman"/>
                 <w:sz w:val="20"/>
               </w:rPr>
-              <w:t>6.47 × 10¹</w:t>
+              <w:t>6.47e1</w:t>
             </w:r>
           </w:p>
         </w:tc>
@@ -4233,7 +4233,7 @@
                 <w:rFonts w:ascii="Times New Roman" w:hAnsi="Times New Roman"/>
                 <w:sz w:val="20"/>
               </w:rPr>
-              <w:t>3.00 × 10¹</w:t>
+              <w:t>3.00e1</w:t>
             </w:r>
           </w:p>
         </w:tc>
@@ -4251,7 +4251,7 @@
                 <w:rFonts w:ascii="Times New Roman" w:hAnsi="Times New Roman"/>
                 <w:sz w:val="20"/>
               </w:rPr>
-              <w:t>1.61 × 10¹</w:t>
+              <w:t>1.61e1</w:t>
             </w:r>
           </w:p>
         </w:tc>
@@ -4307,7 +4307,7 @@
                 <w:rFonts w:ascii="Times New Roman" w:hAnsi="Times New Roman"/>
                 <w:sz w:val="20"/>
               </w:rPr>
-              <w:t>7.00 × 10¹</w:t>
+              <w:t>7.00e1</w:t>
             </w:r>
           </w:p>
         </w:tc>
@@ -4325,7 +4325,7 @@
                 <w:rFonts w:ascii="Times New Roman" w:hAnsi="Times New Roman"/>
                 <w:sz w:val="20"/>
               </w:rPr>
-              <w:t>4.07 × 10¹</w:t>
+              <w:t>4.07e1</w:t>
             </w:r>
           </w:p>
         </w:tc>
@@ -4358,7 +4358,7 @@
           <w:i/>
           <w:sz w:val="20"/>
         </w:rPr>
-        <w:t>Table 4. Predicted TOF with 95% confidence intervals from Monte Carlo uncertainty analysis with σ_DFT = 0.10 eV.</w:t>
+        <w:t>Table 4. Predicted TOF with 95 percent confidence intervals from Monte Carlo uncertainty analysis with sigma_DFT = 0.10 eV.</w:t>
       </w:r>
     </w:p>
     <w:p>
@@ -4409,7 +4409,7 @@
           <w:i/>
           <w:sz w:val="20"/>
         </w:rPr>
-        <w:t>Figure 7. Uncertainty quantification. (a) TOF distributions for all six catalysts from Monte Carlo sampling. (b) Mean TOF with 90% confidence intervals.</w:t>
+        <w:t>Figure 7. Uncertainty quantification. (a) TOF distributions for all six catalysts from Monte Carlo sampling. (b) Mean TOF with 90 percent confidence intervals.</w:t>
       </w:r>
     </w:p>
     <w:p>
@@ -4442,7 +4442,7 @@
           <w:b w:val="0"/>
           <w:i w:val="0"/>
         </w:rPr>
-        <w:t>In this analysis, the CO selectivity is defined as the ratio of the forward rate of carbon removal (CH oxidation plus C oxidation) to the sum of that rate and the forward rate of carbon formation (CH dehydrogenation). This is a forward-rate metric: it captures the intrinsic branching ratio of the surface chemistry at steady state, not the net rate (which is zero at steady state by definition). The DSC of each step i is computed as d ln(S/(1−S)) / d ln(k_i).</w:t>
+        <w:t>In this analysis, the CO selectivity is defined as the ratio of the forward rate of carbon removal (CH oxidation plus C oxidation) to the sum of that rate and the forward rate of carbon formation (CH dehydrogenation). This is a forward-rate metric: it captures the intrinsic branching ratio of the surface chemistry at steady state, not the net rate (which is zero at steady state by definition). The DSC of each step i is computed as d[ln(S/(1-S))] / d[ln(k_i)].</w:t>
       </w:r>
     </w:p>
     <w:p>
@@ -4451,7 +4451,7 @@
           <w:b w:val="0"/>
           <w:i w:val="0"/>
         </w:rPr>
-        <w:t>Table 5 shows that different catalysts control their selectivity through different elementary steps. On Ni(111), selectivity is controlled primarily by CH oxidation (DSC = +0.53). On Pt(111), Rh(111), and Ir(111), the dominant controlling step is CH dehydrogenation (DSC values between −0.92 and −0.99). On Ru and Co, the controlling step is C oxidation by surface oxygen.</w:t>
+        <w:t>Table 5 shows that different catalysts control their selectivity through different elementary steps. On Ni(111), selectivity is controlled primarily by CH oxidation (DSC = +0.53). On Pt(111), Rh(111), and Ir(111), the dominant controlling step is CH dehydrogenation (DSC values between -0.92 and -0.99). On Ru and Co, the controlling step is C oxidation by surface oxygen.</w:t>
       </w:r>
     </w:p>
     <w:p>
@@ -4605,7 +4605,7 @@
                 <w:rFonts w:ascii="Times New Roman" w:hAnsi="Times New Roman"/>
                 <w:sz w:val="20"/>
               </w:rPr>
-              <w:t>CH_oxidation</w:t>
+              <w:t>CH oxidation</w:t>
             </w:r>
           </w:p>
         </w:tc>
@@ -4679,7 +4679,7 @@
                 <w:rFonts w:ascii="Times New Roman" w:hAnsi="Times New Roman"/>
                 <w:sz w:val="20"/>
               </w:rPr>
-              <w:t>CH_dehydrogenation</w:t>
+              <w:t>CH dehydrogenation</w:t>
             </w:r>
           </w:p>
         </w:tc>
@@ -4697,7 +4697,7 @@
                 <w:rFonts w:ascii="Times New Roman" w:hAnsi="Times New Roman"/>
                 <w:sz w:val="20"/>
               </w:rPr>
-              <w:t>−0.924</w:t>
+              <w:t>-0.924</w:t>
             </w:r>
           </w:p>
         </w:tc>
@@ -4753,7 +4753,7 @@
                 <w:rFonts w:ascii="Times New Roman" w:hAnsi="Times New Roman"/>
                 <w:sz w:val="20"/>
               </w:rPr>
-              <w:t>C_oxidation_by_O</w:t>
+              <w:t>C oxidation by O</w:t>
             </w:r>
           </w:p>
         </w:tc>
@@ -4771,7 +4771,7 @@
                 <w:rFonts w:ascii="Times New Roman" w:hAnsi="Times New Roman"/>
                 <w:sz w:val="20"/>
               </w:rPr>
-              <w:t>−0.148</w:t>
+              <w:t>-0.148</w:t>
             </w:r>
           </w:p>
         </w:tc>
@@ -4827,7 +4827,7 @@
                 <w:rFonts w:ascii="Times New Roman" w:hAnsi="Times New Roman"/>
                 <w:sz w:val="20"/>
               </w:rPr>
-              <w:t>CH_dehydrogenation</w:t>
+              <w:t>CH dehydrogenation</w:t>
             </w:r>
           </w:p>
         </w:tc>
@@ -4845,7 +4845,7 @@
                 <w:rFonts w:ascii="Times New Roman" w:hAnsi="Times New Roman"/>
                 <w:sz w:val="20"/>
               </w:rPr>
-              <w:t>−0.630</w:t>
+              <w:t>-0.630</w:t>
             </w:r>
           </w:p>
         </w:tc>
@@ -4901,7 +4901,7 @@
                 <w:rFonts w:ascii="Times New Roman" w:hAnsi="Times New Roman"/>
                 <w:sz w:val="20"/>
               </w:rPr>
-              <w:t>C_oxidation_by_O</w:t>
+              <w:t>C oxidation by O</w:t>
             </w:r>
           </w:p>
         </w:tc>
@@ -4919,7 +4919,7 @@
                 <w:rFonts w:ascii="Times New Roman" w:hAnsi="Times New Roman"/>
                 <w:sz w:val="20"/>
               </w:rPr>
-              <w:t>−0.352</w:t>
+              <w:t>-0.352</w:t>
             </w:r>
           </w:p>
         </w:tc>
@@ -4975,7 +4975,7 @@
                 <w:rFonts w:ascii="Times New Roman" w:hAnsi="Times New Roman"/>
                 <w:sz w:val="20"/>
               </w:rPr>
-              <w:t>CH_dehydrogenation</w:t>
+              <w:t>CH dehydrogenation</w:t>
             </w:r>
           </w:p>
         </w:tc>
@@ -4993,7 +4993,7 @@
                 <w:rFonts w:ascii="Times New Roman" w:hAnsi="Times New Roman"/>
                 <w:sz w:val="20"/>
               </w:rPr>
-              <w:t>−0.992</w:t>
+              <w:t>-0.992</w:t>
             </w:r>
           </w:p>
         </w:tc>
@@ -5083,7 +5083,7 @@
           <w:b w:val="0"/>
           <w:i w:val="0"/>
         </w:rPr>
-        <w:t>To test whether the predicted ranking depends on the assumed pre-exponential factors, each step's prefactor was perturbed by a random factor drawn log-uniformly from 0.1× to 10× its literature value. Twenty realizations were generated per catalyst, and the carbon coverage was computed for each.</w:t>
+        <w:t>To test whether the predicted ranking depends on the assumed pre-exponential factors, each step's prefactor was perturbed by a random factor drawn log-uniformly from 0.1x to 10x its literature value. Twenty realizations were generated per catalyst, and the carbon coverage was computed for each.</w:t>
       </w:r>
     </w:p>
     <w:p>
@@ -5101,7 +5101,7 @@
           <w:b w:val="0"/>
           <w:i w:val="0"/>
         </w:rPr>
-        <w:t>This result confirms that the central design rule of this work — that weak carbon binding favors coke resistance — is not an artifact of the assumed prefactors. However, the sensitivity of adjacent-pair orderings highlights the need for accurate experimental determination of the pre-exponential factors in future work.</w:t>
+        <w:t>This result confirms that the central design rule of this work - that weak carbon binding favors coke resistance - is not an artifact of the assumed prefactors. However, the sensitivity of adjacent-pair orderings highlights the need for accurate experimental determination of the pre-exponential factors in future work.</w:t>
       </w:r>
     </w:p>
     <w:tbl>
@@ -5152,7 +5152,7 @@
                 <w:b/>
                 <w:sz w:val="20"/>
               </w:rPr>
-              <w:t>Mean θ_C + θ_CH</w:t>
+              <w:t>Mean theta_C + theta_CH</w:t>
             </w:r>
           </w:p>
         </w:tc>
@@ -5228,7 +5228,7 @@
                 <w:rFonts w:ascii="Times New Roman" w:hAnsi="Times New Roman"/>
                 <w:sz w:val="20"/>
               </w:rPr>
-              <w:t>3.02 × 10⁻³</w:t>
+              <w:t>3.02e-3</w:t>
             </w:r>
           </w:p>
         </w:tc>
@@ -5246,7 +5246,7 @@
                 <w:rFonts w:ascii="Times New Roman" w:hAnsi="Times New Roman"/>
                 <w:sz w:val="20"/>
               </w:rPr>
-              <w:t>4.48 × 10⁻³</w:t>
+              <w:t>4.48e-3</w:t>
             </w:r>
           </w:p>
         </w:tc>
@@ -5302,7 +5302,7 @@
                 <w:rFonts w:ascii="Times New Roman" w:hAnsi="Times New Roman"/>
                 <w:sz w:val="20"/>
               </w:rPr>
-              <w:t>9.85 × 10⁻³</w:t>
+              <w:t>9.85e-3</w:t>
             </w:r>
           </w:p>
         </w:tc>
@@ -5320,7 +5320,7 @@
                 <w:rFonts w:ascii="Times New Roman" w:hAnsi="Times New Roman"/>
                 <w:sz w:val="20"/>
               </w:rPr>
-              <w:t>1.92 × 10⁻²</w:t>
+              <w:t>1.92e-2</w:t>
             </w:r>
           </w:p>
         </w:tc>
@@ -5376,7 +5376,7 @@
                 <w:rFonts w:ascii="Times New Roman" w:hAnsi="Times New Roman"/>
                 <w:sz w:val="20"/>
               </w:rPr>
-              <w:t>1.53 × 10⁻²</w:t>
+              <w:t>1.53e-2</w:t>
             </w:r>
           </w:p>
         </w:tc>
@@ -5394,7 +5394,7 @@
                 <w:rFonts w:ascii="Times New Roman" w:hAnsi="Times New Roman"/>
                 <w:sz w:val="20"/>
               </w:rPr>
-              <w:t>2.02 × 10⁻²</w:t>
+              <w:t>2.02e-2</w:t>
             </w:r>
           </w:p>
         </w:tc>
@@ -5450,7 +5450,7 @@
                 <w:rFonts w:ascii="Times New Roman" w:hAnsi="Times New Roman"/>
                 <w:sz w:val="20"/>
               </w:rPr>
-              <w:t>6.49 × 10⁻²</w:t>
+              <w:t>6.49e-2</w:t>
             </w:r>
           </w:p>
         </w:tc>
@@ -5468,7 +5468,7 @@
                 <w:rFonts w:ascii="Times New Roman" w:hAnsi="Times New Roman"/>
                 <w:sz w:val="20"/>
               </w:rPr>
-              <w:t>6.38 × 10⁻²</w:t>
+              <w:t>6.38e-2</w:t>
             </w:r>
           </w:p>
         </w:tc>
@@ -5524,7 +5524,7 @@
                 <w:rFonts w:ascii="Times New Roman" w:hAnsi="Times New Roman"/>
                 <w:sz w:val="20"/>
               </w:rPr>
-              <w:t>1.35 × 10⁻¹</w:t>
+              <w:t>1.35e-1</w:t>
             </w:r>
           </w:p>
         </w:tc>
@@ -5542,7 +5542,7 @@
                 <w:rFonts w:ascii="Times New Roman" w:hAnsi="Times New Roman"/>
                 <w:sz w:val="20"/>
               </w:rPr>
-              <w:t>1.04 × 10⁻¹</w:t>
+              <w:t>1.04e-1</w:t>
             </w:r>
           </w:p>
         </w:tc>
@@ -5598,7 +5598,7 @@
                 <w:rFonts w:ascii="Times New Roman" w:hAnsi="Times New Roman"/>
                 <w:sz w:val="20"/>
               </w:rPr>
-              <w:t>2.04 × 10⁻¹</w:t>
+              <w:t>2.04e-1</w:t>
             </w:r>
           </w:p>
         </w:tc>
@@ -5616,7 +5616,7 @@
                 <w:rFonts w:ascii="Times New Roman" w:hAnsi="Times New Roman"/>
                 <w:sz w:val="20"/>
               </w:rPr>
-              <w:t>1.75 × 10⁻¹</w:t>
+              <w:t>1.75e-1</w:t>
             </w:r>
           </w:p>
         </w:tc>
@@ -5732,7 +5732,7 @@
         <w:pStyle w:val="ListBullet"/>
       </w:pPr>
       <w:r>
-        <w:t>Carbon binding energy weaker than −5.6 eV (equivalently ΔE_C ≥ +0.8 eV relative to Ni) is necessary for long-term carbon resistance.</w:t>
+        <w:t>Carbon binding energy weaker than -5.6 eV (equivalently dE_C &gt;= +0.8 eV relative to Ni) is necessary for long-term carbon resistance.</w:t>
       </w:r>
     </w:p>
     <w:p>
@@ -5740,7 +5740,7 @@
         <w:pStyle w:val="ListBullet"/>
       </w:pPr>
       <w:r>
-        <w:t>The optimum carbon binding energy for maximum activity is ΔE_C = +0.73 eV (E_C ≈ −5.7 eV), balancing methane activation against carbon removal.</w:t>
+        <w:t>The optimum carbon binding energy for maximum activity is dE_C = +0.73 eV (E_C = -5.7 eV), balancing methane activation against carbon removal.</w:t>
       </w:r>
     </w:p>
     <w:p>
@@ -5756,7 +5756,7 @@
         <w:pStyle w:val="ListBullet"/>
       </w:pPr>
       <w:r>
-        <w:t>For Ni-based catalysts, promoters should weaken carbon binding by at least 0.8 eV to bring the effective ΔE_C into the safe region.</w:t>
+        <w:t>For Ni-based catalysts, promoters should weaken carbon binding by at least 0.8 eV to bring the effective dE_C into the safe region.</w:t>
       </w:r>
     </w:p>
     <w:p>
@@ -5772,7 +5772,7 @@
         <w:pStyle w:val="ListBullet"/>
       </w:pPr>
       <w:r>
-        <w:t>CO₂-rich feed ratios (CH₄:CO₂ ≤ 1:1) reduce carbon risk and improve CH₄ conversion, at the cost of additional CO₂ handling.</w:t>
+        <w:t>CO2-rich feed ratios (CH4:CO2 &lt;= 1:1) reduce carbon risk and improve CH4 conversion, at the cost of additional CO2 handling.</w:t>
       </w:r>
     </w:p>
     <w:p>
@@ -5780,7 +5780,7 @@
         <w:pStyle w:val="ListBullet"/>
       </w:pPr>
       <w:r>
-        <w:t>The predicted ranking is robust across a factor of 3 range in the BEP coefficients, across a 350 K temperature window, and at the ensemble level across ±1 order of magnitude prefactor perturbations.</w:t>
+        <w:t>The predicted ranking is robust across a factor of 3 range in the BEP coefficients, across a 350 K temperature window, and at the ensemble level across plus or minus 1 order of magnitude prefactor perturbations.</w:t>
       </w:r>
     </w:p>
     <w:p>
@@ -5852,7 +5852,7 @@
         <w:pStyle w:val="ListBullet"/>
       </w:pPr>
       <w:r>
-        <w:t>Monte Carlo uncertainty quantification (σ_DFT = 0.10 eV) and prefactor sensitivity analysis confirm the ranking is preserved at the ensemble level.</w:t>
+        <w:t>Monte Carlo uncertainty quantification (sigma_DFT = 0.10 eV) and prefactor sensitivity analysis confirm the ranking is preserved at the ensemble level.</w:t>
       </w:r>
     </w:p>
     <w:p>
@@ -5876,7 +5876,7 @@
         <w:pStyle w:val="ListBullet"/>
       </w:pPr>
       <w:r>
-        <w:t>A quantitative design rule is derived: catalysts with carbon binding weaker than −5.6 eV resist coke formation.</w:t>
+        <w:t>A quantitative design rule is derived: catalysts with carbon binding weaker than -5.6 eV resist coke formation.</w:t>
       </w:r>
     </w:p>
     <w:p>
@@ -5884,7 +5884,7 @@
         <w:pStyle w:val="ListBullet"/>
       </w:pPr>
       <w:r>
-        <w:t>A Sabatier volcano plot identifies the optimum binding energy at ΔE_C = +0.73 eV.</w:t>
+        <w:t>A Sabatier volcano plot identifies the optimum binding energy at dE_C = +0.73 eV.</w:t>
       </w:r>
     </w:p>
     <w:p>
@@ -5893,7 +5893,7 @@
           <w:b w:val="0"/>
           <w:i w:val="0"/>
         </w:rPr>
-        <w:t>Future work should incorporate adsorbate-adsorbate interactions, coverage-dependent BEP parameters, and direct CH₄ dissociation pathways, and validate the predicted design rule against experimental carbon deposition measurements.</w:t>
+        <w:t>Future work should incorporate adsorbate-adsorbate interactions, coverage-dependent BEP parameters, and direct CH4 dissociation pathways, and validate the predicted design rule against experimental carbon deposition measurements.</w:t>
       </w:r>
     </w:p>
     <w:p>
@@ -5941,7 +5941,7 @@
         <w:pStyle w:val="ListBullet"/>
       </w:pPr>
       <w:r>
-        <w:t>Sticking coefficients: a value of 1.0 was used for all adsorbates. Real CO₂ sticking coefficients are typically 10⁻²–10⁻³, which would reduce absolute rates but not the relative ranking.</w:t>
+        <w:t>Sticking coefficients: a value of 1.0 was used for all adsorbates. Real CO2 sticking coefficients are typically 1e-2 to 1e-3, which would reduce absolute rates but not the relative ranking.</w:t>
       </w:r>
     </w:p>
     <w:p>
@@ -5965,7 +5965,7 @@
         <w:pStyle w:val="ListBullet"/>
       </w:pPr>
       <w:r>
-        <w:t>GRI-Mech 3.0 equilibrium: while validated for the CH₄/CO₂/H₂ system, it is a combustion mechanism and could introduce small errors in equilibrium compositions near industrial conditions.</w:t>
+        <w:t>GRI-Mech 3.0 equilibrium: while validated for the CH4/CO2/H2 system, it is a combustion mechanism and could introduce small errors in equilibrium compositions near industrial conditions.</w:t>
       </w:r>
     </w:p>
     <w:p>
@@ -5993,7 +5993,7 @@
         <w:ind w:left="432" w:hanging="432"/>
       </w:pPr>
       <w:r>
-        <w:t>[1] Blaylock, D. W., Ogura, T., Green, W. H., &amp; Beran, G. J. O. (2009). Computational investigation of thermochemistry and kinetics of steam methane reforming on Ni(111). J. Phys. Chem. C, 113(12), 4898–4908.</w:t>
+        <w:t>[1] Blaylock, D. W., Ogura, T., Green, W. H., &amp; Beran, G. J. O. (2009). Computational investigation of thermochemistry and kinetics of steam methane reforming on Ni(111). J. Phys. Chem. C, 113(12), 4898-4908.</w:t>
       </w:r>
     </w:p>
     <w:p>
@@ -6001,7 +6001,7 @@
         <w:ind w:left="432" w:hanging="432"/>
       </w:pPr>
       <w:r>
-        <w:t>[2] Jones, G., Jakobsen, J. G., Shim, S. S., Kleis, J., Andersson, M. P., Rossmeisl, J., Abild-Pedersen, F., Bligaard, T., Helveg, S., Hinnemann, B., Rostrup-Nielsen, J. R., Chorkendorff, I., Sehested, J., &amp; Nørskov, J. K. (2009). First principles calculations and experimental insight into methane reforming over transition metal catalysts. J. Catal., 259(1), 147–160.</w:t>
+        <w:t>[2] Jones, G., Jakobsen, J. G., Shim, S. S., Kleis, J., Andersson, M. P., Rossmeisl, J., Abild-Pedersen, F., Bligaard, T., Helveg, S., Hinnemann, B., Rostrup-Nielsen, J. R., Chorkendorff, I., Sehested, J., &amp; Norskov, J. K. (2009). First principles calculations and experimental insight into methane reforming over transition metal catalysts. J. Catal., 259(1), 147-160.</w:t>
       </w:r>
     </w:p>
     <w:p>
@@ -6009,7 +6009,7 @@
         <w:ind w:left="432" w:hanging="432"/>
       </w:pPr>
       <w:r>
-        <w:t>[3] Wang, S.-G., Liao, X.-Y., Hu, J., Cao, D.-B., Li, Y.-W., Wang, J., &amp; Jiao, H. (2013). Kinetic study of dry reforming of methane on supported Rh catalysts. Surf. Sci., 616, 17–24.</w:t>
+        <w:t>[3] Wang, S.-G., Liao, X.-Y., Hu, J., Cao, D.-B., Li, Y.-W., Wang, J., &amp; Jiao, H. (2013). Kinetic study of dry reforming of methane on supported Rh catalysts. Surf. Sci., 616, 17-24.</w:t>
       </w:r>
     </w:p>
     <w:p>
@@ -6017,7 +6017,7 @@
         <w:ind w:left="432" w:hanging="432"/>
       </w:pPr>
       <w:r>
-        <w:t>[4] Nørskov, J. K., Bligaard, T., Logadottir, A., Bahn, S., Hansen, L. B., Bollinger, M., Bengaard, H., Hammer, B., Sljivancanin, Z., Mavrikakis, M., Xu, Y., Dahl, S., &amp; Jacobsen, C. J. H. (2002). Universality in heterogeneous catalysis. J. Catal., 209(2), 275–278.</w:t>
+        <w:t>[4] Norskov, J. K., Bligaard, T., Logadottir, A., Bahn, S., Hansen, L. B., Bollinger, M., Bengaard, H., Hammer, B., Sljivancanin, Z., Mavrikakis, M., Xu, Y., Dahl, S., &amp; Jacobsen, C. J. H. (2002). Universality in heterogeneous catalysis. J. Catal., 209(2), 275-278.</w:t>
       </w:r>
     </w:p>
     <w:p>
@@ -6025,7 +6025,7 @@
         <w:ind w:left="432" w:hanging="432"/>
       </w:pPr>
       <w:r>
-        <w:t>[5] Bligaard, T., Nørskov, J. K., Dahl, S., Matthiesen, J., Christensen, C. H., &amp; Sehested, J. (2004). The Brønsted-Evans-Polanyi relation and the volcano curve in heterogeneous catalysis. J. Catal., 224(1), 206–217.</w:t>
+        <w:t>[5] Bligaard, T., Norskov, J. K., Dahl, S., Matthiesen, J., Christensen, C. H., &amp; Sehested, J. (2004). The Bronsted-Evans-Polanyi relation and the volcano curve in heterogeneous catalysis. J. Catal., 224(1), 206-217.</w:t>
       </w:r>
     </w:p>
     <w:p>
@@ -6033,7 +6033,7 @@
         <w:ind w:left="432" w:hanging="432"/>
       </w:pPr>
       <w:r>
-        <w:t>[6] Campbell, C. T. (2017). The degree of rate control: A powerful tool for catalysis research. ACS Catal., 7(4), 2770–2779.</w:t>
+        <w:t>[6] Campbell, C. T. (2017). The degree of rate control: A powerful tool for catalysis research. ACS Catal., 7(4), 2770-2779.</w:t>
       </w:r>
     </w:p>
     <w:p>
@@ -6041,7 +6041,7 @@
         <w:ind w:left="432" w:hanging="432"/>
       </w:pPr>
       <w:r>
-        <w:t>[7] Vasiliades, M. A., Makri, M. M., Djinović, P., Erjavec, B., Pintar, A., &amp; Efstathiou, A. M. (2016). Dry reforming of methane over Ni-based catalysts. Appl. Catal. B, 197, 168–183.</w:t>
+        <w:t>[7] Vasiliades, M. A., Makri, M. M., Djinovic, P., Erjavec, B., Pintar, A., &amp; Efstathiou, A. M. (2016). Dry reforming of methane over Ni-based catalysts. Appl. Catal. B, 197, 168-183.</w:t>
       </w:r>
     </w:p>
     <w:p>
@@ -6049,7 +6049,7 @@
         <w:ind w:left="432" w:hanging="432"/>
       </w:pPr>
       <w:r>
-        <w:t>[8] Fan, M.-S., Abdullah, A. Z., &amp; Bhatia, S. (2009). Catalytic technology for carbon dioxide reforming of methane. ChemCatChem, 1(2), 192–208.</w:t>
+        <w:t>[8] Fan, M.-S., Abdullah, A. Z., &amp; Bhatia, S. (2009). Catalytic technology for carbon dioxide reforming of methane. ChemCatChem, 1(2), 192-208.</w:t>
       </w:r>
     </w:p>
     <w:sectPr>

</xml_diff>

<commit_message>
Fix 6 issues: remove CatalystGPT, volcano explanation, sign convention, Cantera clarity, page numbers, table page breaks, expand refs
</commit_message>
<xml_diff>
--- a/docs/report/DRM_Catalyst_Screening_Thappa_2024BCHE034.docx
+++ b/docs/report/DRM_Catalyst_Screening_Thappa_2024BCHE034.docx
@@ -636,6 +636,15 @@
       </w:pPr>
       <w:r>
         <w:t>Matplotlib - figure generation.</w:t>
+      </w:r>
+    </w:p>
+    <w:p>
+      <w:r>
+        <w:rPr>
+          <w:b w:val="0"/>
+          <w:i w:val="0"/>
+        </w:rPr>
+        <w:t>Python/SciPy was chosen for full control over the 14-step mechanism and BEP scaling, allowing step-by-step rate-constant customization and in-situ sensitivity analysis. Cantera was used only for gas-phase equilibrium and for the plug-flow reactor integration.</w:t>
       </w:r>
     </w:p>
     <w:p>
@@ -1953,7 +1962,7 @@
           <w:b w:val="0"/>
           <w:i w:val="0"/>
         </w:rPr>
-        <w:t>A 1D plug-flow reactor model was constructed in Cantera. The reactor is 0.5 m long with a 10 cm diameter and a catalyst bed density of 800 kg per cubic meter. The inlet feed is equimolar CH4:CO2 with N2 balance. Gas-phase equilibrium was computed using the GRI-Mech 3.0 mechanism, which has been validated for the CH4/CO2/H2/CO/H2O system.</w:t>
+        <w:t>A 1D plug-flow reactor model was constructed in Cantera. The reactor is 0.5 m long with a 10 cm diameter and a catalyst bed density of 800 kg per cubic meter. The inlet feed is equimolar CH4:CO2 with N2 balance. Gas-phase equilibrium was computed using the GRI-Mech 3.0 mechanism, which has been validated for the CH4/CO2/H2/CO/H2O system. The reactor rate is evaluated from a simplified descriptor-based DRM rate expression derived from the microkinetic model (see reactor_rate.py in the repository), not from the full 14-step integration at every axial step. This simplification allows efficient axial integration while preserving the descriptor dependence of the intrinsic rate.</w:t>
       </w:r>
     </w:p>
     <w:p>
@@ -2025,7 +2034,12 @@
           <w:b w:val="0"/>
           <w:i w:val="0"/>
         </w:rPr>
-        <w:t>Table 2 compares the predicted turnover frequencies with experimentally reported ranges for all six catalysts. The predicted values fall within the experimental ranges in every case, providing quantitative validation of the model.</w:t>
+        <w:t>Table 2 compares the predicted turnover frequencies with experimentally reported ranges for all six catalysts. The predicted values fall within the experimental ranges in every case, providing a consistency check against literature.</w:t>
+      </w:r>
+    </w:p>
+    <w:p>
+      <w:r>
+        <w:br w:type="page"/>
       </w:r>
     </w:p>
     <w:tbl>
@@ -3295,6 +3309,15 @@
       </w:r>
     </w:p>
     <w:p>
+      <w:r>
+        <w:rPr>
+          <w:b w:val="0"/>
+          <w:i w:val="0"/>
+        </w:rPr>
+        <w:t>Figure 1a shows the continuous Sabatier volcano for the DRM rate as a function of dE_C and dE_O. The continuous peak is at dE_C = +0.73 eV and dE_O = 0 eV. Note that the discrete metals do not sit exactly on the volcano peak because each catalyst has its own dE_O value that shifts it along the second descriptor axis. In particular, Rh(111) lies at dE_C = +1.00 eV with a small dE_O shift, which places it at the highest intrinsic activity among the six metals even though the continuous volcano maximum is at +0.73 eV. This is expected behavior in a two-descriptor Sabatier analysis.</w:t>
+      </w:r>
+    </w:p>
+    <w:p>
       <w:pPr>
         <w:jc w:val="center"/>
       </w:pPr>
@@ -3366,7 +3389,7 @@
           <w:b w:val="0"/>
           <w:i w:val="0"/>
         </w:rPr>
-        <w:t>The total carbon coverage (theta_C + theta_CH) decreases by over two orders of magnitude as dE_C shifts from 0.0 eV (Ni) to +1.4 eV (Ir). A practical threshold for long-term stability corresponds to total carbon coverage below 1e-2 monolayer, which is crossed at dE_C = +0.8 eV, equivalent to a carbon binding energy weaker than approximately -5.6 eV.</w:t>
+        <w:t>The total carbon coverage (theta_C + theta_CH) decreases by over two orders of magnitude as dE_C shifts from 0.0 eV (Ni) to +1.4 eV (Ir). A practical threshold for long-term stability corresponds to total carbon coverage below 1e-2 monolayer, which is crossed at dE_C = +0.8 eV. This is equivalent to a carbon binding energy that is less negative than -5.6 eV (i.e., E_C &gt; -5.6 eV, or weaker binding than -5.6 eV).</w:t>
       </w:r>
     </w:p>
     <w:p>
@@ -3633,7 +3656,7 @@
           <w:b w:val="0"/>
           <w:i w:val="0"/>
         </w:rPr>
-        <w:t>The sum of all DRC values was computed for each catalyst. Campbell's theorem requires this sum to equal 1.0. The computed values range from 0.96 to 1.06, confirming the internal consistency of the mechanism and of the numerical solution.</w:t>
+        <w:t>The sum of all DRC values was computed for each catalyst. Campbell's theorem requires this sum to equal 1.0. The computed values range from 0.96 to 1.06. This small deviation from unity reflects the finite precision of the numerical steady-state solve and the +0.05 eV perturbation step, not a physical inconsistency.</w:t>
       </w:r>
     </w:p>
     <w:p>
@@ -3811,6 +3834,11 @@
           <w:i w:val="0"/>
         </w:rPr>
         <w:t>Table 4 lists the mean TOF and 95 percent confidence intervals for all six catalysts. The ranking is preserved across the entire uncertainty band, confirming that the predicted ordering is not an artifact of DFT error.</w:t>
+      </w:r>
+    </w:p>
+    <w:p>
+      <w:r>
+        <w:br w:type="page"/>
       </w:r>
     </w:p>
     <w:tbl>
@@ -4460,7 +4488,7 @@
           <w:b w:val="0"/>
           <w:i w:val="0"/>
         </w:rPr>
-        <w:t>This distinction has a direct design implication. On Ni and Co, promoters that accelerate surface oxidation should improve CO selectivity. On Pt, Rh, and Ir, the carbon formation pathway is already strongly suppressed, and further selectivity improvements require modification of the CH binding energy rather than the oxygen supply.</w:t>
+        <w:t>This distinction has a direct design implication. On Ni and Co, promoters that accelerate surface oxidation should improve CO selectivity. On Pt, Rh, and Ir, the carbon formation pathway is already strongly suppressed, and further selectivity improvements require modification of the CH binding energy rather than the oxygen supply. These are model-based hypotheses that would require experimental validation before being treated as universal design rules.</w:t>
       </w:r>
     </w:p>
     <w:tbl>
@@ -5732,7 +5760,7 @@
         <w:pStyle w:val="ListBullet"/>
       </w:pPr>
       <w:r>
-        <w:t>Carbon binding energy weaker than -5.6 eV (equivalently dE_C &gt;= +0.8 eV relative to Ni) is necessary for long-term carbon resistance.</w:t>
+        <w:t>Carbon binding energy less negative than -5.6 eV (equivalently dE_C &gt;= +0.8 eV relative to Ni) is necessary for long-term carbon resistance.</w:t>
       </w:r>
     </w:p>
     <w:p>
@@ -5876,7 +5904,7 @@
         <w:pStyle w:val="ListBullet"/>
       </w:pPr>
       <w:r>
-        <w:t>A quantitative design rule is derived: catalysts with carbon binding weaker than -5.6 eV resist coke formation.</w:t>
+        <w:t>A quantitative design rule is derived: catalysts with carbon binding less negative than -5.6 eV resist coke formation.</w:t>
       </w:r>
     </w:p>
     <w:p>
@@ -5957,7 +5985,15 @@
         <w:pStyle w:val="ListBullet"/>
       </w:pPr>
       <w:r>
-        <w:t>No experimental validation of the derived design rule; the comparison in Table 2 is limited to published TOF ranges.</w:t>
+        <w:t>The comparisons in Table 2 are consistency checks against published TOF ranges, not independent experimental validation of the complete mechanism.</w:t>
+      </w:r>
+    </w:p>
+    <w:p>
+      <w:pPr>
+        <w:pStyle w:val="ListBullet"/>
+      </w:pPr>
+      <w:r>
+        <w:t>The 20-30 sample sizes in the Monte Carlo and prefactor analyses are sufficient for ensemble statistics but may under-sample the tails of the uncertainty distribution.</w:t>
       </w:r>
     </w:p>
     <w:p>
@@ -6052,7 +6088,24 @@
         <w:t>[8] Fan, M.-S., Abdullah, A. Z., &amp; Bhatia, S. (2009). Catalytic technology for carbon dioxide reforming of methane. ChemCatChem, 1(2), 192-208.</w:t>
       </w:r>
     </w:p>
+    <w:p>
+      <w:pPr>
+        <w:ind w:left="432" w:hanging="432"/>
+      </w:pPr>
+      <w:r>
+        <w:t>[9] Aramouni, N. A. K., Touma, J. G., Tarboush, B. A., Zeaiter, J., &amp; Ahmad, M. N. (2018). Catalyst design for dry reforming of methane: Analysis review. Renewable and Sustainable Energy Reviews, 82, 2570-2585.</w:t>
+      </w:r>
+    </w:p>
+    <w:p>
+      <w:pPr>
+        <w:ind w:left="432" w:hanging="432"/>
+      </w:pPr>
+      <w:r>
+        <w:t>[10] Usman, M., Daud, W. M. A. W., &amp; Abbas, H. F. (2015). Dry reforming of methane: Influence of process parameters - A review. Renewable and Sustainable Energy Reviews, 45, 710-744.</w:t>
+      </w:r>
+    </w:p>
     <w:sectPr>
+      <w:footerReference w:type="default" r:id="rId19"/>
       <w:pgSz w:w="12240" w:h="15840"/>
       <w:pgMar w:top="1440" w:right="1800" w:bottom="1440" w:left="1800" w:header="720" w:footer="720" w:gutter="0"/>
       <w:cols w:space="720"/>
@@ -6060,6 +6113,33 @@
     </w:sectPr>
   </w:body>
 </w:document>
+</file>
+
+<file path=word/footer1.xml><?xml version="1.0" encoding="utf-8"?>
+<w:ftr xmlns:m="http://schemas.openxmlformats.org/officeDocument/2006/math" xmlns:mc="http://schemas.openxmlformats.org/markup-compatibility/2006" xmlns:mo="http://schemas.microsoft.com/office/mac/office/2008/main" xmlns:mv="urn:schemas-microsoft-com:mac:vml" xmlns:o="urn:schemas-microsoft-com:office:office" xmlns:r="http://schemas.openxmlformats.org/officeDocument/2006/relationships" xmlns:v="urn:schemas-microsoft-com:vml" xmlns:w10="urn:schemas-microsoft-com:office:word" xmlns:w14="http://schemas.microsoft.com/office/word/2010/wordml" xmlns:w="http://schemas.openxmlformats.org/wordprocessingml/2006/main" xmlns:wne="http://schemas.microsoft.com/office/word/2006/wordml" xmlns:wp14="http://schemas.microsoft.com/office/word/2010/wordprocessingDrawing" xmlns:wp="http://schemas.openxmlformats.org/drawingml/2006/wordprocessingDrawing" xmlns:wpc="http://schemas.microsoft.com/office/word/2010/wordprocessingCanvas" xmlns:wpg="http://schemas.microsoft.com/office/word/2010/wordprocessingGroup" xmlns:wpi="http://schemas.microsoft.com/office/word/2010/wordprocessingInk" xmlns:wps="http://schemas.microsoft.com/office/word/2010/wordprocessingShape" mc:Ignorable="w14 wp14">
+  <w:p>
+    <w:pPr>
+      <w:pStyle w:val="Footer"/>
+      <w:jc w:val="center"/>
+    </w:pPr>
+    <w:r>
+      <w:rPr>
+        <w:rFonts w:ascii="Times New Roman" w:hAnsi="Times New Roman"/>
+        <w:sz w:val="18"/>
+      </w:rPr>
+      <w:t xml:space="preserve">Page </w:t>
+    </w:r>
+    <w:r>
+      <w:rPr>
+        <w:rFonts w:ascii="Times New Roman" w:hAnsi="Times New Roman"/>
+        <w:sz w:val="18"/>
+      </w:rPr>
+      <w:fldChar w:fldCharType="begin"/>
+      <w:instrText xml:space="preserve"> PAGE </w:instrText>
+      <w:fldChar w:fldCharType="end"/>
+    </w:r>
+  </w:p>
+</w:ftr>
 </file>
 
 <file path=word/numbering.xml><?xml version="1.0" encoding="utf-8"?>

</xml_diff>